<commit_message>
doc: update documents.. [0.2.0]
</commit_message>
<xml_diff>
--- a/docs/CA1-Strategic Thinking_20%.docx
+++ b/docs/CA1-Strategic Thinking_20%.docx
@@ -1,6 +1,6 @@
 
 <file path=word/document.xml><?xml version="1.0" encoding="utf-8"?>
-<w:document xmlns:wpc="http://schemas.microsoft.com/office/word/2010/wordprocessingCanvas" xmlns:cx="http://schemas.microsoft.com/office/drawing/2014/chartex" xmlns:cx1="http://schemas.microsoft.com/office/drawing/2015/9/8/chartex" xmlns:cx2="http://schemas.microsoft.com/office/drawing/2015/10/21/chartex" xmlns:cx3="http://schemas.microsoft.com/office/drawing/2016/5/9/chartex" xmlns:cx4="http://schemas.microsoft.com/office/drawing/2016/5/10/chartex" xmlns:cx5="http://schemas.microsoft.com/office/drawing/2016/5/11/chartex" xmlns:cx6="http://schemas.microsoft.com/office/drawing/2016/5/12/chartex" xmlns:cx7="http://schemas.microsoft.com/office/drawing/2016/5/13/chartex" xmlns:cx8="http://schemas.microsoft.com/office/drawing/2016/5/14/chartex" xmlns:mc="http://schemas.openxmlformats.org/markup-compatibility/2006" xmlns:aink="http://schemas.microsoft.com/office/drawing/2016/ink" xmlns:am3d="http://schemas.microsoft.com/office/drawing/2017/model3d" xmlns:o="urn:schemas-microsoft-com:office:office" xmlns:oel="http://schemas.microsoft.com/office/2019/extlst" xmlns:r="http://schemas.openxmlformats.org/officeDocument/2006/relationships" xmlns:m="http://schemas.openxmlformats.org/officeDocument/2006/math" xmlns:v="urn:schemas-microsoft-com:vml" xmlns:wp14="http://schemas.microsoft.com/office/word/2010/wordprocessingDrawing" xmlns:wp="http://schemas.openxmlformats.org/drawingml/2006/wordprocessingDrawing" xmlns:w10="urn:schemas-microsoft-com:office:word" xmlns:w="http://schemas.openxmlformats.org/wordprocessingml/2006/main" xmlns:w14="http://schemas.microsoft.com/office/word/2010/wordml" xmlns:w15="http://schemas.microsoft.com/office/word/2012/wordml" xmlns:w16cex="http://schemas.microsoft.com/office/word/2018/wordml/cex" xmlns:w16cid="http://schemas.microsoft.com/office/word/2016/wordml/cid" xmlns:w16="http://schemas.microsoft.com/office/word/2018/wordml" xmlns:w16du="http://schemas.microsoft.com/office/word/2023/wordml/word16du" xmlns:w16sdtdh="http://schemas.microsoft.com/office/word/2020/wordml/sdtdatahash" xmlns:w16sdtfl="http://schemas.microsoft.com/office/word/2024/wordml/sdtformatlock" xmlns:w16se="http://schemas.microsoft.com/office/word/2015/wordml/symex" xmlns:wpg="http://schemas.microsoft.com/office/word/2010/wordprocessingGroup" xmlns:wpi="http://schemas.microsoft.com/office/word/2010/wordprocessingInk" xmlns:wne="http://schemas.microsoft.com/office/word/2006/wordml" xmlns:wps="http://schemas.microsoft.com/office/word/2010/wordprocessingShape" mc:Ignorable="w14 w15 w16se w16cid w16 w16cex w16sdtdh w16sdtfl w16du wp14">
+<w:document xmlns:w="http://schemas.openxmlformats.org/wordprocessingml/2006/main" xmlns:r="http://schemas.openxmlformats.org/officeDocument/2006/relationships" xmlns:wp="http://schemas.openxmlformats.org/drawingml/2006/wordprocessingDrawing" xmlns:a="http://schemas.openxmlformats.org/drawingml/2006/main" xmlns:c="http://schemas.openxmlformats.org/drawingml/2006/chart" xmlns:pic="http://schemas.openxmlformats.org/drawingml/2006/picture" xmlns:mc="http://schemas.openxmlformats.org/markup-compatibility/2006" xmlns:w14="http://schemas.microsoft.com/office/word/2010/wordml" xmlns:wpi="http://schemas.microsoft.com/office/word/2010/wordprocessingInk" xmlns:w15="http://schemas.microsoft.com/office/word/2012/wordml" xmlns:wp14="http://schemas.microsoft.com/office/word/2010/wordprocessingDrawing" xmlns:wps="http://schemas.microsoft.com/office/word/2010/wordprocessingShape" xmlns:wpg="http://schemas.microsoft.com/office/word/2010/wordprocessingGroup" xmlns:wpc="http://schemas.microsoft.com/office/word/2010/wordprocessingCanvas" xmlns:dgm="http://schemas.openxmlformats.org/drawingml/2006/diagram" xmlns:dsp="http://schemas.microsoft.com/office/drawing/2008/diagram" xmlns:m="http://schemas.openxmlformats.org/officeDocument/2006/math" xmlns:v="urn:schemas-microsoft-com:vml" xmlns:o="urn:schemas-microsoft-com:office:office" xmlns:w10="urn:schemas-microsoft-com:office:word" xmlns:cx="http://schemas.microsoft.com/office/drawing/2014/chartex" xmlns:cx1="http://schemas.microsoft.com/office/drawing/2015/9/8/chartex" xmlns:cx2="http://schemas.microsoft.com/office/drawing/2015/10/21/chartex" xmlns:cx3="http://schemas.microsoft.com/office/drawing/2016/5/9/chartex" xmlns:cx4="http://schemas.microsoft.com/office/drawing/2016/5/10/chartex" xmlns:cx5="http://schemas.microsoft.com/office/drawing/2016/5/11/chartex" xmlns:cx6="http://schemas.microsoft.com/office/drawing/2016/5/12/chartex" xmlns:cx7="http://schemas.microsoft.com/office/drawing/2016/5/13/chartex" xmlns:cx8="http://schemas.microsoft.com/office/drawing/2016/5/14/chartex" mc:Ignorable="w14 w15 wp14">
   <w:body>
     <w:p>
       <w:pPr>
@@ -17,26 +17,27 @@
           <w:szCs w:val="24"/>
         </w:rPr>
         <w:drawing>
-          <wp:inline distT="0" distB="0" distL="0" distR="0" wp14:anchorId="7D3F792C" wp14:editId="071875E3">
+          <wp:inline distT="0" distB="0" distL="0" distR="0">
             <wp:extent cx="4645660" cy="1347470"/>
             <wp:effectExtent l="0" t="0" r="0" b="0"/>
-            <wp:docPr id="30" name="image1.png" descr="A picture containing icon&#10;&#10;Description automatically generated"/>
+            <wp:docPr id="1" name="Picture 1" descr="A picture containing icon&#10;&#10;Description automatically generated"/>
             <wp:cNvGraphicFramePr/>
-            <a:graphic xmlns:a="http://schemas.openxmlformats.org/drawingml/2006/main">
+            <a:graphic>
               <a:graphicData uri="http://schemas.openxmlformats.org/drawingml/2006/picture">
-                <pic:pic xmlns:pic="http://schemas.openxmlformats.org/drawingml/2006/picture">
+                <pic:pic>
                   <pic:nvPicPr>
                     <pic:cNvPr id="0" name="image1.png" descr="A picture containing icon&#10;&#10;Description automatically generated"/>
-                    <pic:cNvPicPr preferRelativeResize="0"/>
+                    <pic:cNvPicPr>
+                      <a:picLocks noChangeAspect="1" noChangeArrowheads="1"/>
+                    </pic:cNvPicPr>
                   </pic:nvPicPr>
                   <pic:blipFill>
-                    <a:blip r:embed="rId11"/>
-                    <a:srcRect/>
+                    <a:blip r:embed="rId1"/>
                     <a:stretch>
                       <a:fillRect/>
                     </a:stretch>
                   </pic:blipFill>
-                  <pic:spPr>
+                  <pic:spPr bwMode="auto">
                     <a:xfrm>
                       <a:off x="0" y="0"/>
                       <a:ext cx="4645660" cy="1347470"/>
@@ -44,7 +45,6 @@
                     <a:prstGeom prst="rect">
                       <a:avLst/>
                     </a:prstGeom>
-                    <a:ln/>
                   </pic:spPr>
                 </pic:pic>
               </a:graphicData>
@@ -132,7 +132,7 @@
               <w:rPr>
                 <w:b/>
               </w:rPr>
-              <w:t>Programme Title:</w:t>
+              <w:t xml:space="preserve">Programme Title:</w:t>
             </w:r>
           </w:p>
         </w:tc>
@@ -149,7 +149,7 @@
               </w:rPr>
             </w:pPr>
             <w:r>
-              <w:t>Higher Diploma in Data Analytics for Business</w:t>
+              <w:t xml:space="preserve">Higher Diploma in Data Analytics for Business</w:t>
             </w:r>
           </w:p>
         </w:tc>
@@ -169,7 +169,7 @@
               <w:rPr>
                 <w:b/>
               </w:rPr>
-              <w:t>Delivery Mode:</w:t>
+              <w:t xml:space="preserve">Delivery Mode:</w:t>
             </w:r>
           </w:p>
         </w:tc>
@@ -186,7 +186,7 @@
               </w:rPr>
             </w:pPr>
             <w:r>
-              <w:t>Offline/Online</w:t>
+              <w:t xml:space="preserve">Offline/Online</w:t>
             </w:r>
           </w:p>
         </w:tc>
@@ -206,7 +206,7 @@
               <w:rPr>
                 <w:b/>
               </w:rPr>
-              <w:t>Cohort Details:</w:t>
+              <w:t xml:space="preserve">Cohort Details:</w:t>
             </w:r>
           </w:p>
         </w:tc>
@@ -223,25 +223,7 @@
               </w:rPr>
             </w:pPr>
             <w:r>
-              <w:t xml:space="preserve">Higher Diploma Data Analytics </w:t>
-            </w:r>
-            <w:r>
-              <w:t>Sep</w:t>
-            </w:r>
-            <w:r>
-              <w:t>202</w:t>
-            </w:r>
-            <w:r>
-              <w:t>6</w:t>
-            </w:r>
-            <w:r>
-              <w:t xml:space="preserve"> </w:t>
-            </w:r>
-            <w:r>
-              <w:t>FT/</w:t>
-            </w:r>
-            <w:r>
-              <w:t xml:space="preserve">PT Semester 1 </w:t>
+              <w:t xml:space="preserve">Higher Diploma Data Analytics Sep2026 FT/PT Semester 1 </w:t>
             </w:r>
           </w:p>
           <w:p>
@@ -264,10 +246,10 @@
               <w:rPr>
                 <w:b/>
               </w:rPr>
-              <w:t>Module Title(s)</w:t>
-            </w:r>
-            <w:r>
-              <w:t>:</w:t>
+              <w:t xml:space="preserve">Module Title(s)</w:t>
+            </w:r>
+            <w:r>
+              <w:t xml:space="preserve">:</w:t>
             </w:r>
           </w:p>
         </w:tc>
@@ -284,7 +266,7 @@
               </w:rPr>
             </w:pPr>
             <w:r>
-              <w:t>Strategic Thinking</w:t>
+              <w:t xml:space="preserve">Strategic Thinking</w:t>
             </w:r>
             <w:r>
               <w:rPr>
@@ -319,7 +301,7 @@
               <w:rPr>
                 <w:b/>
               </w:rPr>
-              <w:t>Assignment Type:</w:t>
+              <w:t xml:space="preserve">Assignment Type:</w:t>
             </w:r>
           </w:p>
         </w:tc>
@@ -335,7 +317,7 @@
               </w:rPr>
             </w:pPr>
             <w:r>
-              <w:t>Individual</w:t>
+              <w:t xml:space="preserve">Individual</w:t>
             </w:r>
           </w:p>
         </w:tc>
@@ -354,7 +336,7 @@
               <w:rPr>
                 <w:b/>
               </w:rPr>
-              <w:t>Weighting(s):</w:t>
+              <w:t xml:space="preserve">Weighting(s):</w:t>
             </w:r>
           </w:p>
         </w:tc>
@@ -377,7 +359,7 @@
               <w:t xml:space="preserve"> </w:t>
             </w:r>
             <w:r>
-              <w:t>20 %</w:t>
+              <w:t xml:space="preserve">20 %</w:t>
             </w:r>
           </w:p>
         </w:tc>
@@ -397,7 +379,7 @@
               <w:rPr>
                 <w:b/>
               </w:rPr>
-              <w:t>Assignment Title:</w:t>
+              <w:t xml:space="preserve">Assignment Title:</w:t>
             </w:r>
           </w:p>
         </w:tc>
@@ -414,7 +396,7 @@
               </w:rPr>
             </w:pPr>
             <w:r>
-              <w:t>CA 1 – Capstone Project Proposal</w:t>
+              <w:t xml:space="preserve">CA 1 – Capstone Project Proposal</w:t>
             </w:r>
           </w:p>
         </w:tc>
@@ -434,10 +416,10 @@
               <w:rPr>
                 <w:b/>
               </w:rPr>
-              <w:t>Lecturer(s)</w:t>
-            </w:r>
-            <w:r>
-              <w:t>:</w:t>
+              <w:t xml:space="preserve">Lecturer(s)</w:t>
+            </w:r>
+            <w:r>
+              <w:t xml:space="preserve">:</w:t>
             </w:r>
           </w:p>
         </w:tc>
@@ -458,7 +440,7 @@
               <w:rPr>
                 <w:lang w:val="fr-FR"/>
               </w:rPr>
-              <w:t>Taufique Ahmed</w:t>
+              <w:t xml:space="preserve">Taufique Ahmed</w:t>
             </w:r>
           </w:p>
         </w:tc>
@@ -478,7 +460,7 @@
               <w:rPr>
                 <w:b/>
               </w:rPr>
-              <w:t>Issue Date:</w:t>
+              <w:t xml:space="preserve">Issue Date:</w:t>
             </w:r>
           </w:p>
         </w:tc>
@@ -499,7 +481,7 @@
                 <w:iCs/>
                 <w:color w:val="FF0000"/>
               </w:rPr>
-              <w:t>21-09-2026</w:t>
+              <w:t xml:space="preserve">21-09-2026</w:t>
             </w:r>
           </w:p>
         </w:tc>
@@ -519,7 +501,7 @@
               <w:rPr>
                 <w:b/>
               </w:rPr>
-              <w:t>Submission Deadline Date:</w:t>
+              <w:t xml:space="preserve">Submission Deadline Date:</w:t>
             </w:r>
           </w:p>
         </w:tc>
@@ -540,7 +522,7 @@
                 <w:i/>
                 <w:color w:val="FF0000"/>
               </w:rPr>
-              <w:t>25-10-2026</w:t>
+              <w:t xml:space="preserve">25-10-2026</w:t>
             </w:r>
           </w:p>
         </w:tc>
@@ -561,7 +543,7 @@
               <w:rPr>
                 <w:b/>
               </w:rPr>
-              <w:t>Late Submission Penalty:</w:t>
+              <w:t xml:space="preserve">Late Submission Penalty:</w:t>
             </w:r>
           </w:p>
         </w:tc>
@@ -581,7 +563,7 @@
               <w:rPr>
                 <w:b/>
               </w:rPr>
-              <w:t>5</w:t>
+              <w:t xml:space="preserve">5</w:t>
             </w:r>
             <w:r>
               <w:t xml:space="preserve"> calendar days after the deadline. All late submissions are subject to a penalty of </w:t>
@@ -590,7 +572,7 @@
               <w:rPr>
                 <w:b/>
               </w:rPr>
-              <w:t>10%</w:t>
+              <w:t xml:space="preserve">10%</w:t>
             </w:r>
             <w:r>
               <w:t xml:space="preserve"> </w:t>
@@ -599,10 +581,10 @@
               <w:rPr>
                 <w:u w:val="single"/>
               </w:rPr>
-              <w:t>of the mark awarded</w:t>
-            </w:r>
-            <w:r>
-              <w:t>.</w:t>
+              <w:t xml:space="preserve">of the mark awarded</w:t>
+            </w:r>
+            <w:r>
+              <w:t xml:space="preserve">.</w:t>
             </w:r>
           </w:p>
           <w:p>
@@ -620,7 +602,7 @@
                 <w:b/>
                 <w:u w:val="single"/>
               </w:rPr>
-              <w:t>will not</w:t>
+              <w:t xml:space="preserve">will not</w:t>
             </w:r>
             <w:r>
               <w:t xml:space="preserve"> be accepted and a mark of 0% will be awarded. </w:t>
@@ -644,7 +626,7 @@
               <w:rPr>
                 <w:b/>
               </w:rPr>
-              <w:t>Method of Submission:</w:t>
+              <w:t xml:space="preserve">Method of Submission:</w:t>
             </w:r>
           </w:p>
         </w:tc>
@@ -664,7 +646,7 @@
               <w:rPr>
                 <w:b/>
               </w:rPr>
-              <w:t>This assignment is submitted via Moodle.</w:t>
+              <w:t xml:space="preserve">This assignment is submitted via Moodle.</w:t>
             </w:r>
           </w:p>
         </w:tc>
@@ -685,7 +667,7 @@
               <w:rPr>
                 <w:b/>
               </w:rPr>
-              <w:t>Instructions for Submission:</w:t>
+              <w:t xml:space="preserve">Instructions for Submission:</w:t>
             </w:r>
           </w:p>
         </w:tc>
@@ -706,7 +688,7 @@
               <w:rPr>
                 <w:iCs/>
               </w:rPr>
-              <w:t>Your work must be uploaded to Moodle.</w:t>
+              <w:t xml:space="preserve">Your work must be uploaded to Moodle.</w:t>
             </w:r>
           </w:p>
           <w:p>
@@ -720,12 +702,7 @@
               <w:rPr>
                 <w:iCs/>
               </w:rPr>
-              <w:t>•</w:t>
-            </w:r>
-            <w:r>
-              <w:rPr>
-                <w:iCs/>
-              </w:rPr>
+              <w:t xml:space="preserve">•</w:t>
               <w:tab/>
               <w:t xml:space="preserve">Capstone Project Proposal in Word format ONLY. The word count is 1,000. </w:t>
             </w:r>
@@ -741,35 +718,25 @@
               <w:rPr>
                 <w:iCs/>
               </w:rPr>
-              <w:t>•</w:t>
-            </w:r>
-            <w:r>
+              <w:t xml:space="preserve">•</w:t>
+              <w:tab/>
+              <w:t xml:space="preserve">Ethics form signed by all students and submitted as PDF.</w:t>
+            </w:r>
+          </w:p>
+          <w:p>
+            <w:pPr>
+              <w:spacing w:before="69" w:line="300" w:lineRule="auto"/>
               <w:rPr>
                 <w:iCs/>
               </w:rPr>
+            </w:pPr>
+            <w:r>
+              <w:rPr>
+                <w:iCs/>
+              </w:rPr>
+              <w:t xml:space="preserve">•</w:t>
               <w:tab/>
-              <w:t>Ethics form signed by all students and submitted as PDF.</w:t>
-            </w:r>
-          </w:p>
-          <w:p>
-            <w:pPr>
-              <w:spacing w:before="69" w:line="300" w:lineRule="auto"/>
-              <w:rPr>
-                <w:iCs/>
-              </w:rPr>
-            </w:pPr>
-            <w:r>
-              <w:rPr>
-                <w:iCs/>
-              </w:rPr>
-              <w:t>•</w:t>
-            </w:r>
-            <w:r>
-              <w:rPr>
-                <w:iCs/>
-              </w:rPr>
-              <w:tab/>
-              <w:t>ZIP or RAR files will not be accepted. Files must be submitted separately.</w:t>
+              <w:t xml:space="preserve">ZIP or RAR files will not be accepted. Files must be submitted separately.</w:t>
             </w:r>
           </w:p>
           <w:p>
@@ -789,8 +756,19 @@
                 <w:i/>
                 <w:color w:val="C00000"/>
               </w:rPr>
-              <w:t xml:space="preserve">Create your own GitHub repository and provide the access to tahmed1986 GitHub account. Add the link to the </w:t>
-            </w:r>
+              <w:t xml:space="preserve">Create your own GitHub repository and provide the access to tahmed1986 GitHub account. Add the link to the first page of the report.</w:t>
+            </w:r>
+          </w:p>
+          <w:p>
+            <w:pPr>
+              <w:spacing w:before="69" w:line="300" w:lineRule="auto"/>
+              <w:rPr>
+                <w:b/>
+                <w:bCs/>
+                <w:iCs/>
+                <w:color w:val="C00000"/>
+              </w:rPr>
+            </w:pPr>
             <w:r>
               <w:rPr>
                 <w:b/>
@@ -798,36 +776,7 @@
                 <w:i/>
                 <w:color w:val="C00000"/>
               </w:rPr>
-              <w:t>first page of the report</w:t>
-            </w:r>
-            <w:r>
-              <w:rPr>
-                <w:b/>
-                <w:bCs/>
-                <w:i/>
-                <w:color w:val="C00000"/>
-              </w:rPr>
-              <w:t>.</w:t>
-            </w:r>
-          </w:p>
-          <w:p>
-            <w:pPr>
-              <w:spacing w:before="69" w:line="300" w:lineRule="auto"/>
-              <w:rPr>
-                <w:b/>
-                <w:bCs/>
-                <w:iCs/>
-                <w:color w:val="C00000"/>
-              </w:rPr>
-            </w:pPr>
-            <w:r>
-              <w:rPr>
-                <w:b/>
-                <w:bCs/>
-                <w:i/>
-                <w:color w:val="C00000"/>
-              </w:rPr>
-              <w:t>Word document, which covers the use of AI.</w:t>
+              <w:t xml:space="preserve">Word document, which covers the use of AI.</w:t>
             </w:r>
           </w:p>
           <w:p>
@@ -856,7 +805,7 @@
               <w:rPr>
                 <w:b/>
               </w:rPr>
-              <w:t>Feedback Method:</w:t>
+              <w:t xml:space="preserve">Feedback Method:</w:t>
             </w:r>
           </w:p>
         </w:tc>
@@ -877,7 +826,7 @@
               <w:rPr>
                 <w:b/>
               </w:rPr>
-              <w:t>Results posted in Moodle gradebook</w:t>
+              <w:t xml:space="preserve">Results posted in Moodle gradebook</w:t>
             </w:r>
             <w:r>
               <w:rPr>
@@ -898,7 +847,7 @@
               <w:rPr>
                 <w:b/>
               </w:rPr>
-              <w:t>Feedback Date:</w:t>
+              <w:t xml:space="preserve">Feedback Date:</w:t>
             </w:r>
           </w:p>
         </w:tc>
@@ -948,215 +897,214 @@
         <w:pStyle w:val="Heading1"/>
       </w:pPr>
       <w:r>
-        <w:lastRenderedPageBreak/>
-        <w:t>Assessment Outline</w:t>
+        <w:t xml:space="preserve">Assessment Outline</w:t>
       </w:r>
     </w:p>
     <w:p>
       <w:pPr>
         <w:pStyle w:val="Heading1"/>
         <w:rPr>
-          <w:rFonts w:asciiTheme="minorHAnsi" w:hAnsiTheme="minorHAnsi" w:cstheme="minorHAnsi"/>
-        </w:rPr>
-      </w:pPr>
-      <w:bookmarkStart w:id="0" w:name="_heading=h.gggb7lo7pcwv" w:colFirst="0" w:colLast="0"/>
+          <w:rFonts w:ascii="Calibri" w:hAnsi="Calibri"/>
+        </w:rPr>
+      </w:pPr>
+      <w:bookmarkStart w:id="0" w:name="_heading=h.gggb7lo7pcwv"/>
       <w:bookmarkEnd w:id="0"/>
       <w:r>
         <w:rPr>
-          <w:rFonts w:asciiTheme="minorHAnsi" w:hAnsiTheme="minorHAnsi" w:cstheme="minorHAnsi"/>
-        </w:rPr>
-        <w:t>Assessment Task: Capstone Project Proposal</w:t>
+          <w:rFonts w:ascii="Calibri" w:hAnsi="Calibri"/>
+        </w:rPr>
+        <w:t xml:space="preserve">Assessment Task: Capstone Project Proposal</w:t>
       </w:r>
     </w:p>
     <w:p>
       <w:pPr>
         <w:pStyle w:val="NormalWeb"/>
         <w:rPr>
-          <w:rFonts w:asciiTheme="minorHAnsi" w:hAnsiTheme="minorHAnsi" w:cstheme="minorHAnsi"/>
-        </w:rPr>
-      </w:pPr>
-      <w:r>
-        <w:rPr>
-          <w:rFonts w:asciiTheme="minorHAnsi" w:hAnsiTheme="minorHAnsi" w:cstheme="minorHAnsi"/>
+          <w:rFonts w:ascii="Calibri" w:hAnsi="Calibri"/>
+        </w:rPr>
+      </w:pPr>
+      <w:r>
+        <w:rPr>
+          <w:rFonts w:ascii="Calibri" w:hAnsi="Calibri"/>
         </w:rPr>
         <w:t xml:space="preserve">Choose a </w:t>
       </w:r>
       <w:r>
         <w:rPr>
           <w:rStyle w:val="Strong"/>
-          <w:rFonts w:asciiTheme="minorHAnsi" w:hAnsiTheme="minorHAnsi" w:cstheme="minorHAnsi"/>
-        </w:rPr>
-        <w:t>real-world business problem that can be addressed using data analytics and predictive modelling</w:t>
-      </w:r>
-      <w:r>
-        <w:rPr>
-          <w:rFonts w:asciiTheme="minorHAnsi" w:hAnsiTheme="minorHAnsi" w:cstheme="minorHAnsi"/>
-        </w:rPr>
-        <w:t>. The proposed project should use appropriate data to analyse the problem, identify meaningful patterns or insights, and develop a predictive solution. The project will be developed across two semesters.</w:t>
+          <w:rFonts w:ascii="Calibri" w:hAnsi="Calibri"/>
+        </w:rPr>
+        <w:t xml:space="preserve">real-world business problem that can be addressed using data analytics and predictive modelling</w:t>
+      </w:r>
+      <w:r>
+        <w:rPr>
+          <w:rFonts w:ascii="Calibri" w:hAnsi="Calibri"/>
+        </w:rPr>
+        <w:t xml:space="preserve">. The proposed project should use appropriate data to analyse the problem, identify meaningful patterns or insights, and develop a predictive solution. The project will be developed across two semesters.</w:t>
       </w:r>
     </w:p>
     <w:p>
       <w:pPr>
         <w:pStyle w:val="Heading3"/>
         <w:rPr>
-          <w:rFonts w:asciiTheme="minorHAnsi" w:hAnsiTheme="minorHAnsi" w:cstheme="minorHAnsi"/>
-        </w:rPr>
-      </w:pPr>
-      <w:r>
-        <w:rPr>
-          <w:rFonts w:asciiTheme="minorHAnsi" w:hAnsiTheme="minorHAnsi" w:cstheme="minorHAnsi"/>
-        </w:rPr>
-        <w:t>1. Project Title</w:t>
+          <w:rFonts w:ascii="Calibri" w:hAnsi="Calibri"/>
+        </w:rPr>
+      </w:pPr>
+      <w:r>
+        <w:rPr>
+          <w:rFonts w:ascii="Calibri" w:hAnsi="Calibri"/>
+        </w:rPr>
+        <w:t xml:space="preserve">1. Project Title</w:t>
       </w:r>
     </w:p>
     <w:p>
       <w:pPr>
         <w:pStyle w:val="NormalWeb"/>
         <w:rPr>
-          <w:rFonts w:asciiTheme="minorHAnsi" w:hAnsiTheme="minorHAnsi" w:cstheme="minorHAnsi"/>
-        </w:rPr>
-      </w:pPr>
-      <w:r>
-        <w:rPr>
-          <w:rFonts w:asciiTheme="minorHAnsi" w:hAnsiTheme="minorHAnsi" w:cstheme="minorHAnsi"/>
-        </w:rPr>
-        <w:t>Provide a clear and appropriate title that reflects the proposed business problem and project.</w:t>
+          <w:rFonts w:ascii="Calibri" w:hAnsi="Calibri"/>
+        </w:rPr>
+      </w:pPr>
+      <w:r>
+        <w:rPr>
+          <w:rFonts w:ascii="Calibri" w:hAnsi="Calibri"/>
+        </w:rPr>
+        <w:t xml:space="preserve">Provide a clear and appropriate title that reflects the proposed business problem and project.</w:t>
       </w:r>
     </w:p>
     <w:p>
       <w:pPr>
         <w:pStyle w:val="Heading3"/>
         <w:rPr>
-          <w:rFonts w:asciiTheme="minorHAnsi" w:hAnsiTheme="minorHAnsi" w:cstheme="minorHAnsi"/>
-        </w:rPr>
-      </w:pPr>
-      <w:r>
-        <w:rPr>
-          <w:rFonts w:asciiTheme="minorHAnsi" w:hAnsiTheme="minorHAnsi" w:cstheme="minorHAnsi"/>
-        </w:rPr>
-        <w:t>2. Introduction</w:t>
+          <w:rFonts w:ascii="Calibri" w:hAnsi="Calibri"/>
+        </w:rPr>
+      </w:pPr>
+      <w:r>
+        <w:rPr>
+          <w:rFonts w:ascii="Calibri" w:hAnsi="Calibri"/>
+        </w:rPr>
+        <w:t xml:space="preserve">2. Introduction</w:t>
       </w:r>
     </w:p>
     <w:p>
       <w:pPr>
         <w:pStyle w:val="NormalWeb"/>
         <w:rPr>
-          <w:rFonts w:asciiTheme="minorHAnsi" w:hAnsiTheme="minorHAnsi" w:cstheme="minorHAnsi"/>
-        </w:rPr>
-      </w:pPr>
-      <w:r>
-        <w:rPr>
-          <w:rFonts w:asciiTheme="minorHAnsi" w:hAnsiTheme="minorHAnsi" w:cstheme="minorHAnsi"/>
-        </w:rPr>
-        <w:t>Provide a brief overview of the proposed project. Explain the business context, relevance and significance of the project and why the selected problem is worth investigating.</w:t>
+          <w:rFonts w:ascii="Calibri" w:hAnsi="Calibri"/>
+        </w:rPr>
+      </w:pPr>
+      <w:r>
+        <w:rPr>
+          <w:rFonts w:ascii="Calibri" w:hAnsi="Calibri"/>
+        </w:rPr>
+        <w:t xml:space="preserve">Provide a brief overview of the proposed project. Explain the business context, relevance and significance of the project and why the selected problem is worth investigating.</w:t>
       </w:r>
     </w:p>
     <w:p>
       <w:pPr>
         <w:pStyle w:val="Heading3"/>
         <w:rPr>
-          <w:rFonts w:asciiTheme="minorHAnsi" w:hAnsiTheme="minorHAnsi" w:cstheme="minorHAnsi"/>
-        </w:rPr>
-      </w:pPr>
-      <w:r>
-        <w:rPr>
-          <w:rFonts w:asciiTheme="minorHAnsi" w:hAnsiTheme="minorHAnsi" w:cstheme="minorHAnsi"/>
-        </w:rPr>
-        <w:t>3. Problem Definition</w:t>
+          <w:rFonts w:ascii="Calibri" w:hAnsi="Calibri"/>
+        </w:rPr>
+      </w:pPr>
+      <w:r>
+        <w:rPr>
+          <w:rFonts w:ascii="Calibri" w:hAnsi="Calibri"/>
+        </w:rPr>
+        <w:t xml:space="preserve">3. Problem Definition</w:t>
       </w:r>
     </w:p>
     <w:p>
       <w:pPr>
         <w:pStyle w:val="NormalWeb"/>
         <w:rPr>
-          <w:rFonts w:asciiTheme="minorHAnsi" w:hAnsiTheme="minorHAnsi" w:cstheme="minorHAnsi"/>
-        </w:rPr>
-      </w:pPr>
-      <w:r>
-        <w:rPr>
-          <w:rFonts w:asciiTheme="minorHAnsi" w:hAnsiTheme="minorHAnsi" w:cstheme="minorHAnsi"/>
-        </w:rPr>
-        <w:t>Clearly define the business problem or challenge you intend to address. Explain its impact and how data analytics and predictive modelling can contribute towards addressing the problem.</w:t>
+          <w:rFonts w:ascii="Calibri" w:hAnsi="Calibri"/>
+        </w:rPr>
+      </w:pPr>
+      <w:r>
+        <w:rPr>
+          <w:rFonts w:ascii="Calibri" w:hAnsi="Calibri"/>
+        </w:rPr>
+        <w:t xml:space="preserve">Clearly define the business problem or challenge you intend to address. Explain its impact and how data analytics and predictive modelling can contribute towards addressing the problem.</w:t>
       </w:r>
     </w:p>
     <w:p>
       <w:pPr>
         <w:pStyle w:val="Heading3"/>
         <w:rPr>
-          <w:rFonts w:asciiTheme="minorHAnsi" w:hAnsiTheme="minorHAnsi" w:cstheme="minorHAnsi"/>
-        </w:rPr>
-      </w:pPr>
-      <w:r>
-        <w:rPr>
-          <w:rFonts w:asciiTheme="minorHAnsi" w:hAnsiTheme="minorHAnsi" w:cstheme="minorHAnsi"/>
-        </w:rPr>
-        <w:t>4. Aim and Objectives</w:t>
+          <w:rFonts w:ascii="Calibri" w:hAnsi="Calibri"/>
+        </w:rPr>
+      </w:pPr>
+      <w:r>
+        <w:rPr>
+          <w:rFonts w:ascii="Calibri" w:hAnsi="Calibri"/>
+        </w:rPr>
+        <w:t xml:space="preserve">4. Aim and Objectives</w:t>
       </w:r>
     </w:p>
     <w:p>
       <w:pPr>
         <w:pStyle w:val="NormalWeb"/>
         <w:rPr>
-          <w:rFonts w:asciiTheme="minorHAnsi" w:hAnsiTheme="minorHAnsi" w:cstheme="minorHAnsi"/>
-        </w:rPr>
-      </w:pPr>
-      <w:r>
-        <w:rPr>
-          <w:rFonts w:asciiTheme="minorHAnsi" w:hAnsiTheme="minorHAnsi" w:cstheme="minorHAnsi"/>
+          <w:rFonts w:ascii="Calibri" w:hAnsi="Calibri"/>
+        </w:rPr>
+      </w:pPr>
+      <w:r>
+        <w:rPr>
+          <w:rFonts w:ascii="Calibri" w:hAnsi="Calibri"/>
         </w:rPr>
         <w:t xml:space="preserve">State the overall aim of the project and provide </w:t>
       </w:r>
       <w:r>
         <w:rPr>
           <w:rStyle w:val="Strong"/>
-          <w:rFonts w:asciiTheme="minorHAnsi" w:hAnsiTheme="minorHAnsi" w:cstheme="minorHAnsi"/>
-        </w:rPr>
-        <w:t>3–5 clear and achievable objectives</w:t>
-      </w:r>
-      <w:r>
-        <w:rPr>
-          <w:rFonts w:asciiTheme="minorHAnsi" w:hAnsiTheme="minorHAnsi" w:cstheme="minorHAnsi"/>
-        </w:rPr>
-        <w:t>. Include an appropriate business objective or hypothesis that will be explored through the project.</w:t>
+          <w:rFonts w:ascii="Calibri" w:hAnsi="Calibri"/>
+        </w:rPr>
+        <w:t xml:space="preserve">3–5 clear and achievable objectives</w:t>
+      </w:r>
+      <w:r>
+        <w:rPr>
+          <w:rFonts w:ascii="Calibri" w:hAnsi="Calibri"/>
+        </w:rPr>
+        <w:t xml:space="preserve">. Include an appropriate business objective or hypothesis that will be explored through the project.</w:t>
       </w:r>
     </w:p>
     <w:p>
       <w:pPr>
         <w:pStyle w:val="Heading3"/>
         <w:rPr>
-          <w:rFonts w:asciiTheme="minorHAnsi" w:hAnsiTheme="minorHAnsi" w:cstheme="minorHAnsi"/>
-        </w:rPr>
-      </w:pPr>
-      <w:r>
-        <w:rPr>
-          <w:rFonts w:asciiTheme="minorHAnsi" w:hAnsiTheme="minorHAnsi" w:cstheme="minorHAnsi"/>
-        </w:rPr>
-        <w:t>5. Scope</w:t>
+          <w:rFonts w:ascii="Calibri" w:hAnsi="Calibri"/>
+        </w:rPr>
+      </w:pPr>
+      <w:r>
+        <w:rPr>
+          <w:rFonts w:ascii="Calibri" w:hAnsi="Calibri"/>
+        </w:rPr>
+        <w:t xml:space="preserve">5. Scope</w:t>
       </w:r>
     </w:p>
     <w:p>
       <w:pPr>
         <w:pStyle w:val="NormalWeb"/>
         <w:rPr>
-          <w:rFonts w:asciiTheme="minorHAnsi" w:hAnsiTheme="minorHAnsi" w:cstheme="minorHAnsi"/>
-        </w:rPr>
-      </w:pPr>
-      <w:r>
-        <w:rPr>
-          <w:rFonts w:asciiTheme="minorHAnsi" w:hAnsiTheme="minorHAnsi" w:cstheme="minorHAnsi"/>
+          <w:rFonts w:ascii="Calibri" w:hAnsi="Calibri"/>
+        </w:rPr>
+      </w:pPr>
+      <w:r>
+        <w:rPr>
+          <w:rFonts w:ascii="Calibri" w:hAnsi="Calibri"/>
         </w:rPr>
         <w:t xml:space="preserve">Clearly define what will be </w:t>
       </w:r>
       <w:r>
         <w:rPr>
           <w:rStyle w:val="Strong"/>
-          <w:rFonts w:asciiTheme="minorHAnsi" w:hAnsiTheme="minorHAnsi" w:cstheme="minorHAnsi"/>
-        </w:rPr>
-        <w:t>included and excluded</w:t>
-      </w:r>
-      <w:r>
-        <w:rPr>
-          <w:rFonts w:asciiTheme="minorHAnsi" w:hAnsiTheme="minorHAnsi" w:cstheme="minorHAnsi"/>
+          <w:rFonts w:ascii="Calibri" w:hAnsi="Calibri"/>
+        </w:rPr>
+        <w:t xml:space="preserve">included and excluded</w:t>
+      </w:r>
+      <w:r>
+        <w:rPr>
+          <w:rFonts w:ascii="Calibri" w:hAnsi="Calibri"/>
         </w:rPr>
         <w:t xml:space="preserve"> from the project. The proposed work should have sufficient scope for investigation and development across two semesters.</w:t>
       </w:r>
@@ -1165,53 +1113,53 @@
       <w:pPr>
         <w:pStyle w:val="Heading3"/>
         <w:rPr>
-          <w:rFonts w:asciiTheme="minorHAnsi" w:hAnsiTheme="minorHAnsi" w:cstheme="minorHAnsi"/>
-        </w:rPr>
-      </w:pPr>
-      <w:r>
-        <w:rPr>
-          <w:rFonts w:asciiTheme="minorHAnsi" w:hAnsiTheme="minorHAnsi" w:cstheme="minorHAnsi"/>
-        </w:rPr>
-        <w:t>6. Methodology</w:t>
+          <w:rFonts w:ascii="Calibri" w:hAnsi="Calibri"/>
+        </w:rPr>
+      </w:pPr>
+      <w:r>
+        <w:rPr>
+          <w:rFonts w:ascii="Calibri" w:hAnsi="Calibri"/>
+        </w:rPr>
+        <w:t xml:space="preserve">6. Methodology</w:t>
       </w:r>
     </w:p>
     <w:p>
       <w:pPr>
         <w:pStyle w:val="NormalWeb"/>
         <w:rPr>
-          <w:rFonts w:asciiTheme="minorHAnsi" w:hAnsiTheme="minorHAnsi" w:cstheme="minorHAnsi"/>
-        </w:rPr>
-      </w:pPr>
-      <w:r>
-        <w:rPr>
-          <w:rFonts w:asciiTheme="minorHAnsi" w:hAnsiTheme="minorHAnsi" w:cstheme="minorHAnsi"/>
-        </w:rPr>
-        <w:t>Describe how you plan to carry out the project. Explain the proposed data analytics methods, predictive modelling techniques, technologies and tools, and briefly justify your choices.</w:t>
+          <w:rFonts w:ascii="Calibri" w:hAnsi="Calibri"/>
+        </w:rPr>
+      </w:pPr>
+      <w:r>
+        <w:rPr>
+          <w:rFonts w:ascii="Calibri" w:hAnsi="Calibri"/>
+        </w:rPr>
+        <w:t xml:space="preserve">Describe how you plan to carry out the project. Explain the proposed data analytics methods, predictive modelling techniques, technologies and tools, and briefly justify your choices.</w:t>
       </w:r>
     </w:p>
     <w:p>
       <w:pPr>
         <w:pStyle w:val="NormalWeb"/>
         <w:rPr>
-          <w:rFonts w:asciiTheme="minorHAnsi" w:hAnsiTheme="minorHAnsi" w:cstheme="minorHAnsi"/>
-        </w:rPr>
-      </w:pPr>
-      <w:r>
-        <w:rPr>
-          <w:rFonts w:asciiTheme="minorHAnsi" w:hAnsiTheme="minorHAnsi" w:cstheme="minorHAnsi"/>
+          <w:rFonts w:ascii="Calibri" w:hAnsi="Calibri"/>
+        </w:rPr>
+      </w:pPr>
+      <w:r>
+        <w:rPr>
+          <w:rFonts w:ascii="Calibri" w:hAnsi="Calibri"/>
         </w:rPr>
         <w:t xml:space="preserve">Include a </w:t>
       </w:r>
       <w:r>
         <w:rPr>
           <w:rStyle w:val="Strong"/>
-          <w:rFonts w:asciiTheme="minorHAnsi" w:hAnsiTheme="minorHAnsi" w:cstheme="minorHAnsi"/>
-        </w:rPr>
-        <w:t>high-level architectural diagram</w:t>
-      </w:r>
-      <w:r>
-        <w:rPr>
-          <w:rFonts w:asciiTheme="minorHAnsi" w:hAnsiTheme="minorHAnsi" w:cstheme="minorHAnsi"/>
+          <w:rFonts w:ascii="Calibri" w:hAnsi="Calibri"/>
+        </w:rPr>
+        <w:t xml:space="preserve">high-level architectural diagram</w:t>
+      </w:r>
+      <w:r>
+        <w:rPr>
+          <w:rFonts w:ascii="Calibri" w:hAnsi="Calibri"/>
         </w:rPr>
         <w:t xml:space="preserve"> showing the proposed workflow or system architecture and how the main components are connected. Briefly explain the main components and overall workflow.</w:t>
       </w:r>
@@ -1220,96 +1168,95 @@
       <w:pPr>
         <w:pStyle w:val="Heading3"/>
         <w:rPr>
-          <w:rFonts w:asciiTheme="minorHAnsi" w:hAnsiTheme="minorHAnsi" w:cstheme="minorHAnsi"/>
-        </w:rPr>
-      </w:pPr>
-      <w:r>
-        <w:rPr>
-          <w:rFonts w:asciiTheme="minorHAnsi" w:hAnsiTheme="minorHAnsi" w:cstheme="minorHAnsi"/>
-        </w:rPr>
-        <w:lastRenderedPageBreak/>
-        <w:t>7. Data Sources</w:t>
+          <w:rFonts w:ascii="Calibri" w:hAnsi="Calibri"/>
+        </w:rPr>
+      </w:pPr>
+      <w:r>
+        <w:rPr>
+          <w:rFonts w:ascii="Calibri" w:hAnsi="Calibri"/>
+        </w:rPr>
+        <w:t xml:space="preserve">7. Data Sources</w:t>
       </w:r>
     </w:p>
     <w:p>
       <w:pPr>
         <w:pStyle w:val="NormalWeb"/>
         <w:rPr>
-          <w:rFonts w:asciiTheme="minorHAnsi" w:hAnsiTheme="minorHAnsi" w:cstheme="minorHAnsi"/>
-        </w:rPr>
-      </w:pPr>
-      <w:r>
-        <w:rPr>
-          <w:rFonts w:asciiTheme="minorHAnsi" w:hAnsiTheme="minorHAnsi" w:cstheme="minorHAnsi"/>
-        </w:rPr>
-        <w:t>Identify the dataset(s) or data sources you intend to use. Describe the type and approximate amount of data required, its relevance to the business problem, and evidence of appropriate permission or rights to access and use the data.</w:t>
+          <w:rFonts w:ascii="Calibri" w:hAnsi="Calibri"/>
+        </w:rPr>
+      </w:pPr>
+      <w:r>
+        <w:rPr>
+          <w:rFonts w:ascii="Calibri" w:hAnsi="Calibri"/>
+        </w:rPr>
+        <w:t xml:space="preserve">Identify the dataset(s) or data sources you intend to use. Describe the type and approximate amount of data required, its relevance to the business problem, and evidence of appropriate permission or rights to access and use the data.</w:t>
       </w:r>
     </w:p>
     <w:p>
       <w:pPr>
         <w:pStyle w:val="Heading3"/>
         <w:rPr>
-          <w:rFonts w:asciiTheme="minorHAnsi" w:hAnsiTheme="minorHAnsi" w:cstheme="minorHAnsi"/>
-        </w:rPr>
-      </w:pPr>
-      <w:r>
-        <w:rPr>
-          <w:rFonts w:asciiTheme="minorHAnsi" w:hAnsiTheme="minorHAnsi" w:cstheme="minorHAnsi"/>
-        </w:rPr>
-        <w:t>8. Expected Deliverables</w:t>
+          <w:rFonts w:ascii="Calibri" w:hAnsi="Calibri"/>
+        </w:rPr>
+      </w:pPr>
+      <w:r>
+        <w:rPr>
+          <w:rFonts w:ascii="Calibri" w:hAnsi="Calibri"/>
+        </w:rPr>
+        <w:t xml:space="preserve">8. Expected Deliverables</w:t>
       </w:r>
     </w:p>
     <w:p>
       <w:pPr>
         <w:pStyle w:val="NormalWeb"/>
         <w:rPr>
-          <w:rFonts w:asciiTheme="minorHAnsi" w:hAnsiTheme="minorHAnsi" w:cstheme="minorHAnsi"/>
-        </w:rPr>
-      </w:pPr>
-      <w:r>
-        <w:rPr>
-          <w:rFonts w:asciiTheme="minorHAnsi" w:hAnsiTheme="minorHAnsi" w:cstheme="minorHAnsi"/>
-        </w:rPr>
-        <w:t>Clearly state what you expect to produce by the end of Semester 2, including the expected analytical and predictive modelling outputs and any relevant dashboard, application, system or other project deliverables.</w:t>
+          <w:rFonts w:ascii="Calibri" w:hAnsi="Calibri"/>
+        </w:rPr>
+      </w:pPr>
+      <w:r>
+        <w:rPr>
+          <w:rFonts w:ascii="Calibri" w:hAnsi="Calibri"/>
+        </w:rPr>
+        <w:t xml:space="preserve">Clearly state what you expect to produce by the end of Semester 2, including the expected analytical and predictive modelling outputs and any relevant dashboard, application, system or other project deliverables.</w:t>
       </w:r>
     </w:p>
     <w:p>
       <w:pPr>
         <w:pStyle w:val="Heading3"/>
         <w:rPr>
-          <w:rFonts w:asciiTheme="minorHAnsi" w:hAnsiTheme="minorHAnsi" w:cstheme="minorHAnsi"/>
-        </w:rPr>
-      </w:pPr>
-      <w:r>
-        <w:rPr>
-          <w:rFonts w:asciiTheme="minorHAnsi" w:hAnsiTheme="minorHAnsi" w:cstheme="minorHAnsi"/>
-        </w:rPr>
-        <w:t>9. Project Timeline</w:t>
+          <w:rFonts w:ascii="Calibri" w:hAnsi="Calibri"/>
+        </w:rPr>
+      </w:pPr>
+      <w:r>
+        <w:rPr>
+          <w:rFonts w:ascii="Calibri" w:hAnsi="Calibri"/>
+        </w:rPr>
+        <w:t xml:space="preserve">9. Project Timeline</w:t>
       </w:r>
     </w:p>
     <w:p>
       <w:pPr>
         <w:pStyle w:val="NormalWeb"/>
         <w:rPr>
-          <w:rFonts w:asciiTheme="minorHAnsi" w:hAnsiTheme="minorHAnsi" w:cstheme="minorHAnsi"/>
-        </w:rPr>
-      </w:pPr>
-      <w:r>
-        <w:rPr>
-          <w:rFonts w:asciiTheme="minorHAnsi" w:hAnsiTheme="minorHAnsi" w:cstheme="minorHAnsi"/>
+          <w:rFonts w:ascii="Calibri" w:hAnsi="Calibri"/>
+        </w:rPr>
+      </w:pPr>
+      <w:r>
+        <w:rPr>
+          <w:rFonts w:ascii="Calibri" w:hAnsi="Calibri"/>
         </w:rPr>
         <w:t xml:space="preserve">Provide a </w:t>
       </w:r>
       <w:r>
         <w:rPr>
           <w:rStyle w:val="Strong"/>
-          <w:rFonts w:asciiTheme="minorHAnsi" w:hAnsiTheme="minorHAnsi" w:cstheme="minorHAnsi"/>
-        </w:rPr>
-        <w:t>high-level project timeline diagram (e.g., a Gantt chart)</w:t>
-      </w:r>
-      <w:r>
-        <w:rPr>
-          <w:rFonts w:asciiTheme="minorHAnsi" w:hAnsiTheme="minorHAnsi" w:cstheme="minorHAnsi"/>
+          <w:rFonts w:ascii="Calibri" w:hAnsi="Calibri"/>
+        </w:rPr>
+        <w:t xml:space="preserve">high-level project timeline diagram (e.g., a Gantt chart)</w:t>
+      </w:r>
+      <w:r>
+        <w:rPr>
+          <w:rFonts w:ascii="Calibri" w:hAnsi="Calibri"/>
         </w:rPr>
         <w:t xml:space="preserve"> covering both semesters. Clearly show the main project phases, key activities, milestones and expected completion periods.</w:t>
       </w:r>
@@ -1318,28 +1265,28 @@
       <w:pPr>
         <w:pStyle w:val="Heading3"/>
         <w:rPr>
-          <w:rFonts w:asciiTheme="minorHAnsi" w:hAnsiTheme="minorHAnsi" w:cstheme="minorHAnsi"/>
-        </w:rPr>
-      </w:pPr>
-      <w:r>
-        <w:rPr>
-          <w:rFonts w:asciiTheme="minorHAnsi" w:hAnsiTheme="minorHAnsi" w:cstheme="minorHAnsi"/>
-        </w:rPr>
-        <w:t>10. Ethical and Legal Considerations</w:t>
+          <w:rFonts w:ascii="Calibri" w:hAnsi="Calibri"/>
+        </w:rPr>
+      </w:pPr>
+      <w:r>
+        <w:rPr>
+          <w:rFonts w:ascii="Calibri" w:hAnsi="Calibri"/>
+        </w:rPr>
+        <w:t xml:space="preserve">10. Ethical and Legal Considerations</w:t>
       </w:r>
     </w:p>
     <w:p>
       <w:pPr>
         <w:pStyle w:val="NormalWeb"/>
         <w:rPr>
-          <w:rFonts w:asciiTheme="minorHAnsi" w:hAnsiTheme="minorHAnsi" w:cstheme="minorHAnsi"/>
-        </w:rPr>
-      </w:pPr>
-      <w:r>
-        <w:rPr>
-          <w:rFonts w:asciiTheme="minorHAnsi" w:hAnsiTheme="minorHAnsi" w:cstheme="minorHAnsi"/>
-        </w:rPr>
-        <w:t>Identify relevant ethical, privacy, data protection, security and data-use considerations associated with the project. Explain how these will be appropriately addressed, including permissions for accessing and using the selected data.</w:t>
+          <w:rFonts w:ascii="Calibri" w:hAnsi="Calibri"/>
+        </w:rPr>
+      </w:pPr>
+      <w:r>
+        <w:rPr>
+          <w:rFonts w:ascii="Calibri" w:hAnsi="Calibri"/>
+        </w:rPr>
+        <w:t xml:space="preserve">Identify relevant ethical, privacy, data protection, security and data-use considerations associated with the project. Explain how these will be appropriately addressed, including permissions for accessing and using the selected data.</w:t>
       </w:r>
     </w:p>
     <w:p>
@@ -1360,7 +1307,7 @@
           <w:b/>
           <w:bCs/>
         </w:rPr>
-        <w:t>Sample Ideas for Capstone Projects:</w:t>
+        <w:t xml:space="preserve">Sample Ideas for Capstone Projects:</w:t>
       </w:r>
     </w:p>
     <w:p>
@@ -1368,7 +1315,7 @@
         <w:spacing w:after="0"/>
       </w:pPr>
       <w:r>
-        <w:t>Predictive Analytics for Customer Churn in E-commerce.</w:t>
+        <w:t xml:space="preserve">Predictive Analytics for Customer Churn in E-commerce.</w:t>
       </w:r>
     </w:p>
     <w:p>
@@ -1376,7 +1323,7 @@
         <w:spacing w:after="0"/>
       </w:pPr>
       <w:r>
-        <w:t>Increasing company sales</w:t>
+        <w:t xml:space="preserve">Increasing company sales</w:t>
       </w:r>
     </w:p>
     <w:p>
@@ -1384,7 +1331,7 @@
         <w:spacing w:after="0"/>
       </w:pPr>
       <w:r>
-        <w:t>Financial Fraud Detection (Anomaly detection)</w:t>
+        <w:t xml:space="preserve">Financial Fraud Detection (Anomaly detection)</w:t>
       </w:r>
     </w:p>
     <w:p>
@@ -1392,7 +1339,7 @@
         <w:spacing w:after="0"/>
       </w:pPr>
       <w:r>
-        <w:t>Personalised pricing.</w:t>
+        <w:t xml:space="preserve">Personalised pricing.</w:t>
       </w:r>
     </w:p>
     <w:p>
@@ -1400,7 +1347,7 @@
         <w:spacing w:after="0"/>
       </w:pPr>
       <w:r>
-        <w:t>Event analysis</w:t>
+        <w:t xml:space="preserve">Event analysis</w:t>
       </w:r>
     </w:p>
     <w:p>
@@ -1408,7 +1355,7 @@
         <w:spacing w:after="0"/>
       </w:pPr>
       <w:r>
-        <w:t>Sports predictions (games, players, plays)</w:t>
+        <w:t xml:space="preserve">Sports predictions (games, players, plays)</w:t>
       </w:r>
     </w:p>
     <w:p>
@@ -1421,7 +1368,7 @@
         <w:spacing w:after="0"/>
       </w:pPr>
       <w:r>
-        <w:t>Remember that these project ideas are just starting points. Ensure that your project proposal outlines a comprehensive and in-depth analysis that will occur over two semesters.</w:t>
+        <w:t xml:space="preserve">Remember that these project ideas are just starting points. Ensure that your project proposal outlines a comprehensive and in-depth analysis that will occur over two semesters.</w:t>
       </w:r>
     </w:p>
     <w:p>
@@ -1443,8 +1390,7 @@
           <w:rFonts w:cs="Arial Hebrew Scholar"/>
           <w:sz w:val="24"/>
         </w:rPr>
-        <w:lastRenderedPageBreak/>
-        <w:t>Further details of the assessment:</w:t>
+        <w:t xml:space="preserve">Further details of the assessment:</w:t>
       </w:r>
     </w:p>
     <w:p>
@@ -1488,7 +1434,7 @@
           <w:sz w:val="24"/>
           <w:u w:val="single"/>
         </w:rPr>
-        <w:t>WARNING – If you do not support your work, you will not receive a high mark!</w:t>
+        <w:t xml:space="preserve">WARNING – If you do not support your work, you will not receive a high mark!</w:t>
       </w:r>
     </w:p>
     <w:p>
@@ -1510,16 +1456,16 @@
           <w:rFonts w:cs="Arial Hebrew Scholar"/>
           <w:sz w:val="24"/>
         </w:rPr>
-        <w:t>WORD COUNT: 1,000 words. You may lose up to 10% of marks if your report is too short or long!</w:t>
-      </w:r>
-    </w:p>
-    <w:bookmarkEnd w:id="1"/>
+        <w:t xml:space="preserve">WORD COUNT: 1,000 words. You may lose up to 10% of marks if your report is too short or long!</w:t>
+      </w:r>
+    </w:p>
     <w:p>
       <w:pPr>
         <w:pStyle w:val="Heading2"/>
       </w:pPr>
-      <w:r>
-        <w:t>Assessment Requirements</w:t>
+      <w:bookmarkEnd w:id="1"/>
+      <w:r>
+        <w:t xml:space="preserve">Assessment Requirements</w:t>
       </w:r>
     </w:p>
     <w:p>
@@ -1527,7 +1473,7 @@
         <w:spacing w:after="0"/>
       </w:pPr>
       <w:r>
-        <w:t>All assessment submissions must meet the following minimum requirements:</w:t>
+        <w:t xml:space="preserve">All assessment submissions must meet the following minimum requirements:</w:t>
       </w:r>
     </w:p>
     <w:p>
@@ -1537,16 +1483,16 @@
           <w:numId w:val="5"/>
         </w:numPr>
         <w:pBdr>
-          <w:top w:val="nil"/>
-          <w:left w:val="nil"/>
-          <w:bottom w:val="nil"/>
-          <w:right w:val="nil"/>
-          <w:between w:val="nil"/>
+          <w:top w:val="nil" w:sz="4" w:space="0" w:color="auto"/>
+          <w:left w:val="nil" w:sz="4" w:space="0" w:color="auto"/>
+          <w:bottom w:val="nil" w:sz="4" w:space="0" w:color="auto"/>
+          <w:right w:val="nil" w:sz="4" w:space="0" w:color="auto"/>
+          <w:between w:val="nil" w:sz="4" w:space="0" w:color="auto"/>
         </w:pBdr>
         <w:spacing w:after="0"/>
       </w:pPr>
       <w:r>
-        <w:t>Be submitted in the format outlined in the assignment summary table.</w:t>
+        <w:t xml:space="preserve">Be submitted in the format outlined in the assignment summary table.</w:t>
       </w:r>
     </w:p>
     <w:p>
@@ -1566,7 +1512,7 @@
           <w:rFonts w:cs="Arial Hebrew Scholar"/>
           <w:bCs/>
         </w:rPr>
-        <w:t>Ethics form signed by all students and submitted as PDF.</w:t>
+        <w:t xml:space="preserve">Ethics form signed by all students and submitted as PDF.</w:t>
       </w:r>
     </w:p>
     <w:p>
@@ -1579,7 +1525,7 @@
         <w:spacing w:after="0"/>
       </w:pPr>
       <w:r>
-        <w:t>ZIP or RAR files will not be accepted. Files must be submitted separately.</w:t>
+        <w:t xml:space="preserve">ZIP or RAR files will not be accepted. Files must be submitted separately.</w:t>
       </w:r>
     </w:p>
     <w:p>
@@ -1589,28 +1535,16 @@
           <w:numId w:val="1"/>
         </w:numPr>
         <w:pBdr>
-          <w:top w:val="nil"/>
-          <w:left w:val="nil"/>
-          <w:bottom w:val="nil"/>
-          <w:right w:val="nil"/>
-          <w:between w:val="nil"/>
+          <w:top w:val="nil" w:sz="4" w:space="0" w:color="auto"/>
+          <w:left w:val="nil" w:sz="4" w:space="0" w:color="auto"/>
+          <w:bottom w:val="nil" w:sz="4" w:space="0" w:color="auto"/>
+          <w:right w:val="nil" w:sz="4" w:space="0" w:color="auto"/>
+          <w:between w:val="nil" w:sz="4" w:space="0" w:color="auto"/>
         </w:pBdr>
         <w:spacing w:after="0"/>
       </w:pPr>
       <w:r>
-        <w:t>Capstone Project proposal report</w:t>
-      </w:r>
-      <w:r>
-        <w:t xml:space="preserve"> in </w:t>
-      </w:r>
-      <w:r>
-        <w:t xml:space="preserve">Word ONLY </w:t>
-      </w:r>
-      <w:r>
-        <w:t>format</w:t>
-      </w:r>
-      <w:r>
-        <w:t xml:space="preserve"> of about 1,000 words </w:t>
+        <w:t xml:space="preserve">Capstone Project proposal report in Word ONLY format of about 1,000 words </w:t>
       </w:r>
     </w:p>
     <w:p>
@@ -1620,16 +1554,16 @@
           <w:numId w:val="1"/>
         </w:numPr>
         <w:pBdr>
-          <w:top w:val="nil"/>
-          <w:left w:val="nil"/>
-          <w:bottom w:val="nil"/>
-          <w:right w:val="nil"/>
-          <w:between w:val="nil"/>
+          <w:top w:val="nil" w:sz="4" w:space="0" w:color="auto"/>
+          <w:left w:val="nil" w:sz="4" w:space="0" w:color="auto"/>
+          <w:bottom w:val="nil" w:sz="4" w:space="0" w:color="auto"/>
+          <w:right w:val="nil" w:sz="4" w:space="0" w:color="auto"/>
+          <w:between w:val="nil" w:sz="4" w:space="0" w:color="auto"/>
         </w:pBdr>
         <w:spacing w:after="0"/>
       </w:pPr>
       <w:r>
-        <w:t>Be submitted by the deadline date specified or be subject to late submission penalties.</w:t>
+        <w:t xml:space="preserve">Be submitted by the deadline date specified or be subject to late submission penalties.</w:t>
       </w:r>
     </w:p>
     <w:p>
@@ -1639,22 +1573,16 @@
           <w:numId w:val="1"/>
         </w:numPr>
         <w:pBdr>
-          <w:top w:val="nil"/>
-          <w:left w:val="nil"/>
-          <w:bottom w:val="nil"/>
-          <w:right w:val="nil"/>
-          <w:between w:val="nil"/>
+          <w:top w:val="nil" w:sz="4" w:space="0" w:color="auto"/>
+          <w:left w:val="nil" w:sz="4" w:space="0" w:color="auto"/>
+          <w:bottom w:val="nil" w:sz="4" w:space="0" w:color="auto"/>
+          <w:right w:val="nil" w:sz="4" w:space="0" w:color="auto"/>
+          <w:between w:val="nil" w:sz="4" w:space="0" w:color="auto"/>
         </w:pBdr>
         <w:spacing w:after="0"/>
       </w:pPr>
       <w:r>
-        <w:t>Be submitted via Moodle uplo</w:t>
-      </w:r>
-      <w:r>
-        <w:t>ad</w:t>
-      </w:r>
-      <w:r>
-        <w:t>.</w:t>
+        <w:t xml:space="preserve">Be submitted via Moodle upload.</w:t>
       </w:r>
     </w:p>
     <w:p>
@@ -1664,23 +1592,23 @@
           <w:numId w:val="1"/>
         </w:numPr>
         <w:pBdr>
-          <w:top w:val="nil"/>
-          <w:left w:val="nil"/>
-          <w:bottom w:val="nil"/>
-          <w:right w:val="nil"/>
-          <w:between w:val="nil"/>
+          <w:top w:val="nil" w:sz="4" w:space="0" w:color="auto"/>
+          <w:left w:val="nil" w:sz="4" w:space="0" w:color="auto"/>
+          <w:bottom w:val="nil" w:sz="4" w:space="0" w:color="auto"/>
+          <w:right w:val="nil" w:sz="4" w:space="0" w:color="auto"/>
+          <w:between w:val="nil" w:sz="4" w:space="0" w:color="auto"/>
         </w:pBdr>
         <w:spacing w:after="0"/>
       </w:pPr>
       <w:r>
         <w:t xml:space="preserve">Use </w:t>
       </w:r>
-      <w:hyperlink r:id="rId12">
+      <w:hyperlink r:id="rId2" w:history="1">
         <w:r>
           <w:rPr>
             <w:u w:val="single"/>
           </w:rPr>
-          <w:t>Harvard Referencing</w:t>
+          <w:t xml:space="preserve">Harvard Referencing</w:t>
         </w:r>
       </w:hyperlink>
       <w:r>
@@ -1694,11 +1622,11 @@
           <w:numId w:val="1"/>
         </w:numPr>
         <w:pBdr>
-          <w:top w:val="nil"/>
-          <w:left w:val="nil"/>
-          <w:bottom w:val="nil"/>
-          <w:right w:val="nil"/>
-          <w:between w:val="nil"/>
+          <w:top w:val="nil" w:sz="4" w:space="0" w:color="auto"/>
+          <w:left w:val="nil" w:sz="4" w:space="0" w:color="auto"/>
+          <w:bottom w:val="nil" w:sz="4" w:space="0" w:color="auto"/>
+          <w:right w:val="nil" w:sz="4" w:space="0" w:color="auto"/>
+          <w:between w:val="nil" w:sz="4" w:space="0" w:color="auto"/>
         </w:pBdr>
         <w:spacing w:after="0"/>
       </w:pPr>
@@ -1713,11 +1641,11 @@
           <w:numId w:val="1"/>
         </w:numPr>
         <w:pBdr>
-          <w:top w:val="nil"/>
-          <w:left w:val="nil"/>
-          <w:bottom w:val="nil"/>
-          <w:right w:val="nil"/>
-          <w:between w:val="nil"/>
+          <w:top w:val="nil" w:sz="4" w:space="0" w:color="auto"/>
+          <w:left w:val="nil" w:sz="4" w:space="0" w:color="auto"/>
+          <w:bottom w:val="nil" w:sz="4" w:space="0" w:color="auto"/>
+          <w:right w:val="nil" w:sz="4" w:space="0" w:color="auto"/>
+          <w:between w:val="nil" w:sz="4" w:space="0" w:color="auto"/>
         </w:pBdr>
         <w:spacing w:after="0"/>
       </w:pPr>
@@ -1730,7 +1658,7 @@
         <w:pStyle w:val="Heading2"/>
       </w:pPr>
       <w:r>
-        <w:t>Learning Outcomes:</w:t>
+        <w:t xml:space="preserve">Learning Outcomes:</w:t>
       </w:r>
     </w:p>
     <w:p>
@@ -1738,7 +1666,7 @@
         <w:spacing w:after="0"/>
       </w:pPr>
       <w:r>
-        <w:t>This assessment addresses the following module learning outcomes for this module:</w:t>
+        <w:t xml:space="preserve">This assessment addresses the following module learning outcomes for this module:</w:t>
       </w:r>
     </w:p>
     <w:p>
@@ -1746,7 +1674,7 @@
         <w:spacing w:after="0"/>
       </w:pPr>
       <w:r>
-        <w:t>1. Critically evaluate the relationship between information technology infrastructure and organisational competitive advantage.</w:t>
+        <w:t xml:space="preserve">1. Critically evaluate the relationship between information technology infrastructure and organisational competitive advantage.</w:t>
       </w:r>
     </w:p>
     <w:p>
@@ -1762,7 +1690,7 @@
         <w:spacing w:after="0"/>
       </w:pPr>
       <w:r>
-        <w:t>solutions for business and business-related IT problems.</w:t>
+        <w:t xml:space="preserve">solutions for business and business-related IT problems.</w:t>
       </w:r>
     </w:p>
     <w:p>
@@ -1770,7 +1698,7 @@
         <w:spacing w:after="0"/>
       </w:pPr>
       <w:r>
-        <w:t>3. Utilise tools of strategic business analysis to evaluate the current macro and micro business environment with a view to formulating future action plans.</w:t>
+        <w:t xml:space="preserve">3. Utilise tools of strategic business analysis to evaluate the current macro and micro business environment with a view to formulating future action plans.</w:t>
       </w:r>
     </w:p>
     <w:p>
@@ -1778,7 +1706,7 @@
         <w:spacing w:after="0"/>
       </w:pPr>
       <w:r>
-        <w:t>4. Research emerging technologies and critically evaluate their impact on business and business information systems in general.</w:t>
+        <w:t xml:space="preserve">4. Research emerging technologies and critically evaluate their impact on business and business information systems in general.</w:t>
       </w:r>
     </w:p>
     <w:p>
@@ -1786,7 +1714,7 @@
         <w:spacing w:after="0"/>
       </w:pPr>
       <w:r>
-        <w:t>5. Understand the relationship between data gathering/utilisation and business intelligence and its impact on industry policy.</w:t>
+        <w:t xml:space="preserve">5. Understand the relationship between data gathering/utilisation and business intelligence and its impact on industry policy.</w:t>
       </w:r>
     </w:p>
     <w:p>
@@ -1799,7 +1727,7 @@
         <w:pStyle w:val="Heading2"/>
       </w:pPr>
       <w:r>
-        <w:t>Use of Artificial Intelligence</w:t>
+        <w:t xml:space="preserve">Use of Artificial Intelligence</w:t>
       </w:r>
     </w:p>
     <w:p>
@@ -1807,7 +1735,7 @@
         <w:jc w:val="both"/>
       </w:pPr>
       <w:r>
-        <w:t>This assessment applies the AI Fluency Framework — four interconnected competencies for effective, efficient, ethical and safe AI use. Your engagement with AI will be reviewed across all four dimensions:</w:t>
+        <w:t xml:space="preserve">This assessment applies the AI Fluency Framework — four interconnected competencies for effective, efficient, ethical and safe AI use. Your engagement with AI will be reviewed across all four dimensions:</w:t>
       </w:r>
     </w:p>
     <w:tbl>
@@ -1848,7 +1776,7 @@
                 <w:b/>
                 <w:bCs/>
               </w:rPr>
-              <w:t>Delegation</w:t>
+              <w:t xml:space="preserve">Delegation</w:t>
             </w:r>
           </w:p>
           <w:p>
@@ -1856,7 +1784,7 @@
               <w:spacing w:after="0" w:line="240" w:lineRule="auto"/>
             </w:pPr>
             <w:r>
-              <w:t>Setting goals and deciding whether, when and how to engage with AI.</w:t>
+              <w:t xml:space="preserve">Setting goals and deciding whether, when and how to engage with AI.</w:t>
             </w:r>
           </w:p>
         </w:tc>
@@ -1879,7 +1807,7 @@
                 <w:b/>
                 <w:bCs/>
               </w:rPr>
-              <w:t>Description</w:t>
+              <w:t xml:space="preserve">Description</w:t>
             </w:r>
           </w:p>
           <w:p>
@@ -1887,7 +1815,7 @@
               <w:spacing w:after="0" w:line="240" w:lineRule="auto"/>
             </w:pPr>
             <w:r>
-              <w:t>Effectively describing goals to prompt useful AI behaviours and outputs.</w:t>
+              <w:t xml:space="preserve">Effectively describing goals to prompt useful AI behaviours and outputs.</w:t>
             </w:r>
           </w:p>
         </w:tc>
@@ -1912,7 +1840,7 @@
                 <w:b/>
                 <w:bCs/>
               </w:rPr>
-              <w:t>Discernment</w:t>
+              <w:t xml:space="preserve">Discernment</w:t>
             </w:r>
           </w:p>
           <w:p>
@@ -1920,7 +1848,7 @@
               <w:spacing w:after="0" w:line="240" w:lineRule="auto"/>
             </w:pPr>
             <w:r>
-              <w:t>Accurately assessing the usefulness of AI outputs and behaviours.</w:t>
+              <w:t xml:space="preserve">Accurately assessing the usefulness of AI outputs and behaviours.</w:t>
             </w:r>
           </w:p>
         </w:tc>
@@ -1943,7 +1871,7 @@
                 <w:b/>
                 <w:bCs/>
               </w:rPr>
-              <w:t>Diligence</w:t>
+              <w:t xml:space="preserve">Diligence</w:t>
             </w:r>
           </w:p>
           <w:p>
@@ -1951,7 +1879,7 @@
               <w:spacing w:after="0" w:line="240" w:lineRule="auto"/>
             </w:pPr>
             <w:r>
-              <w:t>Taking responsibility for what we do with AI and how we do it.</w:t>
+              <w:t xml:space="preserve">Taking responsibility for what we do with AI and how we do it.</w:t>
             </w:r>
           </w:p>
         </w:tc>
@@ -1961,18 +1889,27 @@
       <w:pPr>
         <w:spacing w:after="0" w:line="240" w:lineRule="auto"/>
         <w:rPr>
-          <w:rFonts w:ascii="Arial" w:eastAsia="Arial" w:hAnsi="Arial" w:cs="Arial"/>
+          <w:rFonts w:ascii="Arial" w:hAnsi="Arial" w:eastAsia="Arial" w:cs="Arial"/>
           <w:sz w:val="26"/>
           <w:szCs w:val="26"/>
         </w:rPr>
         <w:sectPr>
-          <w:footerReference w:type="default" r:id="rId13"/>
+          <w:footerReference w:type="default" r:id="rId3"/>
+          <w:type w:val="nextPage"/>
           <w:pgSz w:w="11906" w:h="16838"/>
           <w:pgMar w:top="1134" w:right="1134" w:bottom="1134" w:left="1134" w:header="709" w:footer="709" w:gutter="0"/>
-          <w:pgNumType w:start="1"/>
-          <w:cols w:space="720"/>
+          <w:pgNumType w:fmt="decimal" w:start="1"/>
+          <w:cols w:space="720" w:num="1"/>
         </w:sectPr>
       </w:pPr>
+      <w:r>
+        <w:rPr>
+          <w:rFonts w:ascii="Arial" w:hAnsi="Arial" w:eastAsia="Arial" w:cs="Arial"/>
+          <w:sz w:val="26"/>
+          <w:szCs w:val="26"/>
+        </w:rPr>
+        <w:softHyphen/>
+      </w:r>
     </w:p>
     <w:p>
       <w:pPr>
@@ -1985,8 +1922,7 @@
         <w:rPr>
           <w:color w:val="212529"/>
         </w:rPr>
-        <w:lastRenderedPageBreak/>
-        <w:t>AI tools may be used in this assessment. Your use of AI will be assessed across the four ‘D’ competencies of the AI Fluency Framework.</w:t>
+        <w:t xml:space="preserve">AI tools may be used in this assessment. Your use of AI will be assessed across the four ‘D’ competencies of the AI Fluency Framework.</w:t>
       </w:r>
     </w:p>
     <w:p>
@@ -2000,7 +1936,7 @@
         <w:rPr>
           <w:color w:val="212529"/>
         </w:rPr>
-        <w:t>Please see below. Note that for Software Development Fundamentals you are required to include an Appendix to show how you used AI. A sample has been provided.</w:t>
+        <w:t xml:space="preserve">Please see below. Note that for Software Development Fundamentals you are required to include an Appendix to show how you used AI. A sample has been provided.</w:t>
       </w:r>
     </w:p>
     <w:p>
@@ -2016,14 +1952,14 @@
           <w:szCs w:val="32"/>
         </w:rPr>
       </w:pPr>
-      <w:bookmarkStart w:id="2" w:name="_heading=h.rbtal5s6u0r9" w:colFirst="0" w:colLast="0"/>
+      <w:bookmarkStart w:id="2" w:name="_heading=h.rbtal5s6u0r9"/>
       <w:bookmarkEnd w:id="2"/>
       <w:r>
         <w:rPr>
           <w:sz w:val="28"/>
           <w:szCs w:val="28"/>
         </w:rPr>
-        <w:t>AI Declaration using the AI Fluency Framework</w:t>
+        <w:t xml:space="preserve">AI Declaration using the AI Fluency Framework</w:t>
       </w:r>
     </w:p>
     <w:p>
@@ -2045,7 +1981,7 @@
           <w:sz w:val="20"/>
           <w:szCs w:val="20"/>
         </w:rPr>
-        <w:t>For use in assessment briefs and student submissions. Lecturers complete the Lecturer Expectations column per assessment; students complete the Student Response column.</w:t>
+        <w:t xml:space="preserve">For use in assessment briefs and student submissions. Lecturers complete the Lecturer Expectations column per assessment; students complete the Student Response column.</w:t>
       </w:r>
     </w:p>
     <w:p>
@@ -2094,7 +2030,7 @@
                 <w:b/>
                 <w:bCs/>
               </w:rPr>
-              <w:t>AI competence</w:t>
+              <w:t xml:space="preserve">AI competence</w:t>
             </w:r>
           </w:p>
         </w:tc>
@@ -2119,7 +2055,7 @@
                 <w:b/>
                 <w:bCs/>
               </w:rPr>
-              <w:t>Reflective prompts (to students)</w:t>
+              <w:t xml:space="preserve">Reflective prompts (to students)</w:t>
             </w:r>
           </w:p>
         </w:tc>
@@ -2144,7 +2080,7 @@
                 <w:b/>
                 <w:bCs/>
               </w:rPr>
-              <w:t>Lecturer expectations</w:t>
+              <w:t xml:space="preserve">Lecturer expectations</w:t>
             </w:r>
           </w:p>
         </w:tc>
@@ -2169,7 +2105,7 @@
                 <w:b/>
                 <w:bCs/>
               </w:rPr>
-              <w:t>Student response</w:t>
+              <w:t xml:space="preserve">Student response</w:t>
             </w:r>
           </w:p>
         </w:tc>
@@ -2185,7 +2121,7 @@
                 <w:b/>
                 <w:bCs/>
               </w:rPr>
-              <w:t>Delegation</w:t>
+              <w:t xml:space="preserve">Delegation</w:t>
             </w:r>
           </w:p>
           <w:p>
@@ -2203,7 +2139,7 @@
                 <w:i/>
                 <w:iCs/>
               </w:rPr>
-              <w:t>Deciding whether &amp; when to use AI</w:t>
+              <w:t xml:space="preserve">Deciding whether &amp; when to use AI</w:t>
             </w:r>
           </w:p>
         </w:tc>
@@ -2222,7 +2158,7 @@
               </w:rPr>
             </w:pPr>
             <w:r>
-              <w:t>Identify the specific tasks in this assessment where you chose to use AI, and explain your reasoning. Where did AI add value? Where did you decide not to use it, and why?</w:t>
+              <w:t xml:space="preserve">Identify the specific tasks in this assessment where you chose to use AI, and explain your reasoning. Where did AI add value? Where did you decide not to use it, and why?</w:t>
             </w:r>
           </w:p>
         </w:tc>
@@ -2252,21 +2188,7 @@
                 <w:sz w:val="20"/>
                 <w:szCs w:val="20"/>
               </w:rPr>
-              <w:t xml:space="preserve">You may use AI to support your learning and development of the </w:t>
-            </w:r>
-            <w:r>
-              <w:rPr>
-                <w:sz w:val="20"/>
-                <w:szCs w:val="20"/>
-              </w:rPr>
-              <w:t>application</w:t>
-            </w:r>
-            <w:r>
-              <w:rPr>
-                <w:sz w:val="20"/>
-                <w:szCs w:val="20"/>
-              </w:rPr>
-              <w:t>. Clearly identify where you used AI and where you completed the work independently.</w:t>
+              <w:t xml:space="preserve">You may use AI to support your learning and development of the application. Clearly identify where you used AI and where you completed the work independently.</w:t>
             </w:r>
           </w:p>
           <w:p>
@@ -2321,27 +2243,11 @@
             </w:pPr>
             <w:r>
               <w:rPr>
-                <w:color w:val="000000" w:themeColor="text1"/>
+                <w:color w:val="000000"/>
                 <w:sz w:val="20"/>
                 <w:szCs w:val="20"/>
               </w:rPr>
-              <w:t xml:space="preserve">Briefly state which parts of your </w:t>
-            </w:r>
-            <w:r>
-              <w:rPr>
-                <w:color w:val="000000" w:themeColor="text1"/>
-                <w:sz w:val="20"/>
-                <w:szCs w:val="20"/>
-              </w:rPr>
-              <w:t>application</w:t>
-            </w:r>
-            <w:r>
-              <w:rPr>
-                <w:color w:val="000000" w:themeColor="text1"/>
-                <w:sz w:val="20"/>
-                <w:szCs w:val="20"/>
-              </w:rPr>
-              <w:t xml:space="preserve"> assessment you used AI for and why.</w:t>
+              <w:t xml:space="preserve">Briefly state which parts of your application assessment you used AI for and why.</w:t>
             </w:r>
           </w:p>
         </w:tc>
@@ -2357,7 +2263,7 @@
                 <w:b/>
                 <w:bCs/>
               </w:rPr>
-              <w:t>Description</w:t>
+              <w:t xml:space="preserve">Description</w:t>
             </w:r>
           </w:p>
           <w:p>
@@ -2375,7 +2281,7 @@
                 <w:i/>
                 <w:iCs/>
               </w:rPr>
-              <w:t>How you prompted the AI</w:t>
+              <w:t xml:space="preserve">How you prompted the AI</w:t>
             </w:r>
           </w:p>
         </w:tc>
@@ -2394,7 +2300,7 @@
               </w:rPr>
             </w:pPr>
             <w:r>
-              <w:t>Include the exact prompts you used in your appendix (recorded on the AI Tools declaration). Reflect on how you communicated your goals to the AI — did you need to iterate or refine your prompts to get useful output?</w:t>
+              <w:t xml:space="preserve">Include the exact prompts you used in your appendix (recorded on the AI Tools declaration). Reflect on how you communicated your goals to the AI — did you need to iterate or refine your prompts to get useful output?</w:t>
             </w:r>
           </w:p>
         </w:tc>
@@ -2414,22 +2320,24 @@
                 <w:sz w:val="20"/>
                 <w:szCs w:val="20"/>
               </w:rPr>
-              <w:t xml:space="preserve">You must provide the exact prompts and relevant AI outputs used during the development of your </w:t>
-            </w:r>
-            <w:r>
+              <w:t xml:space="preserve">You must provide the exact prompts and relevant AI outputs used during the development of your application.</w:t>
+            </w:r>
+          </w:p>
+          <w:p>
+            <w:pPr>
               <w:rPr>
                 <w:sz w:val="20"/>
                 <w:szCs w:val="20"/>
               </w:rPr>
-              <w:t>application</w:t>
-            </w:r>
-            <w:r>
+            </w:pPr>
+          </w:p>
+          <w:p>
+            <w:pPr>
               <w:rPr>
                 <w:sz w:val="20"/>
                 <w:szCs w:val="20"/>
               </w:rPr>
-              <w:t>.</w:t>
-            </w:r>
+            </w:pPr>
           </w:p>
           <w:p>
             <w:pPr>
@@ -2447,6 +2355,11 @@
               </w:rPr>
             </w:pPr>
           </w:p>
+        </w:tc>
+        <w:tc>
+          <w:tcPr>
+            <w:tcW w:w="3640" w:type="dxa"/>
+          </w:tcPr>
           <w:p>
             <w:pPr>
               <w:rPr>
@@ -2454,20 +2367,14 @@
                 <w:szCs w:val="20"/>
               </w:rPr>
             </w:pPr>
-          </w:p>
-          <w:p>
-            <w:pPr>
+            <w:r>
               <w:rPr>
                 <w:sz w:val="20"/>
                 <w:szCs w:val="20"/>
               </w:rPr>
-            </w:pPr>
-          </w:p>
-        </w:tc>
-        <w:tc>
-          <w:tcPr>
-            <w:tcW w:w="3640" w:type="dxa"/>
-          </w:tcPr>
+              <w:t xml:space="preserve">Include the exact AI prompts and outputs in your submitted AI-use Word document.</w:t>
+            </w:r>
+          </w:p>
           <w:p>
             <w:pPr>
               <w:rPr>
@@ -2475,13 +2382,14 @@
                 <w:szCs w:val="20"/>
               </w:rPr>
             </w:pPr>
-            <w:r>
+          </w:p>
+          <w:p>
+            <w:pPr>
               <w:rPr>
                 <w:sz w:val="20"/>
                 <w:szCs w:val="20"/>
               </w:rPr>
-              <w:t>Include the exact AI prompts and outputs in your submitted AI-use Word document.</w:t>
-            </w:r>
+            </w:pPr>
           </w:p>
           <w:p>
             <w:pPr>
@@ -2491,22 +2399,6 @@
               </w:rPr>
             </w:pPr>
           </w:p>
-          <w:p>
-            <w:pPr>
-              <w:rPr>
-                <w:sz w:val="20"/>
-                <w:szCs w:val="20"/>
-              </w:rPr>
-            </w:pPr>
-          </w:p>
-          <w:p>
-            <w:pPr>
-              <w:rPr>
-                <w:sz w:val="20"/>
-                <w:szCs w:val="20"/>
-              </w:rPr>
-            </w:pPr>
-          </w:p>
         </w:tc>
       </w:tr>
       <w:tr>
@@ -2520,7 +2412,7 @@
                 <w:b/>
                 <w:bCs/>
               </w:rPr>
-              <w:t>Discernment</w:t>
+              <w:t xml:space="preserve">Discernment</w:t>
             </w:r>
           </w:p>
           <w:p>
@@ -2538,7 +2430,7 @@
                 <w:i/>
                 <w:iCs/>
               </w:rPr>
-              <w:t>Evaluating what the AI produced</w:t>
+              <w:t xml:space="preserve">Evaluating what the AI produced</w:t>
             </w:r>
           </w:p>
         </w:tc>
@@ -2557,7 +2449,7 @@
               </w:rPr>
             </w:pPr>
             <w:r>
-              <w:t>In your reflection, critically evaluate the AI output: what did you accept, modify, or reject — and why? Assess accuracy, relevance, and quality. You are responsible for verifying all AI-generated content before submitting.</w:t>
+              <w:t xml:space="preserve">In your reflection, critically evaluate the AI output: what did you accept, modify, or reject — and why? Assess accuracy, relevance, and quality. You are responsible for verifying all AI-generated content before submitting.</w:t>
             </w:r>
           </w:p>
         </w:tc>
@@ -2585,21 +2477,7 @@
                 <w:sz w:val="20"/>
                 <w:szCs w:val="20"/>
               </w:rPr>
-              <w:t xml:space="preserve">You are responsible for checking, testing and understanding any AI-generated code or suggestions before using them in your </w:t>
-            </w:r>
-            <w:r>
-              <w:rPr>
-                <w:sz w:val="20"/>
-                <w:szCs w:val="20"/>
-              </w:rPr>
-              <w:t>work</w:t>
-            </w:r>
-            <w:r>
-              <w:rPr>
-                <w:sz w:val="20"/>
-                <w:szCs w:val="20"/>
-              </w:rPr>
-              <w:t>.</w:t>
+              <w:t xml:space="preserve">You are responsible for checking, testing and understanding any AI-generated code or suggestions before using them in your work.</w:t>
             </w:r>
           </w:p>
           <w:p>
@@ -2638,18 +2516,18 @@
           <w:p>
             <w:pPr>
               <w:rPr>
-                <w:color w:val="000000" w:themeColor="text1"/>
+                <w:color w:val="000000"/>
                 <w:sz w:val="20"/>
                 <w:szCs w:val="20"/>
               </w:rPr>
             </w:pPr>
             <w:r>
               <w:rPr>
-                <w:color w:val="000000" w:themeColor="text1"/>
+                <w:color w:val="000000"/>
                 <w:sz w:val="20"/>
                 <w:szCs w:val="20"/>
               </w:rPr>
-              <w:t>Briefly explain how you verified the AI output and what you accepted, modified or rejected.</w:t>
+              <w:t xml:space="preserve">Briefly explain how you verified the AI output and what you accepted, modified or rejected.</w:t>
             </w:r>
           </w:p>
           <w:p>
@@ -2700,7 +2578,7 @@
       </w:tr>
       <w:tr>
         <w:trPr>
-          <w:trHeight w:val="3034"/>
+          <w:trHeight w:val="3034" w:hRule="atLeast"/>
         </w:trPr>
         <w:tc>
           <w:tcPr>
@@ -2712,7 +2590,7 @@
                 <w:b/>
                 <w:bCs/>
               </w:rPr>
-              <w:t>Diligence</w:t>
+              <w:t xml:space="preserve">Diligence</w:t>
             </w:r>
           </w:p>
           <w:p>
@@ -2727,7 +2605,7 @@
                 <w:i/>
                 <w:iCs/>
               </w:rPr>
-              <w:t>Responsibility for your AI use</w:t>
+              <w:t xml:space="preserve">Responsibility for your AI use</w:t>
             </w:r>
           </w:p>
         </w:tc>
@@ -2746,7 +2624,7 @@
               </w:rPr>
             </w:pPr>
             <w:r>
-              <w:t>Declare all AI tools used and cite them here. Briefly outline how you considered data protection, copyright, and ethical responsibilities when choosing what to input into any AI system. Unauthorised use is subject to CCT disciplinary procedures.</w:t>
+              <w:t xml:space="preserve">Declare all AI tools used and cite them here. Briefly outline how you considered data protection, copyright, and ethical responsibilities when choosing what to input into any AI system. Unauthorised use is subject to CCT disciplinary procedures.</w:t>
             </w:r>
           </w:p>
         </w:tc>
@@ -2766,7 +2644,7 @@
                 <w:sz w:val="20"/>
                 <w:szCs w:val="20"/>
               </w:rPr>
-              <w:t>Declare all AI tools used. Do not enter personal, confidential or sensitive information into AI tools. Any external sources used should be appropriately referenced.</w:t>
+              <w:t xml:space="preserve">Declare all AI tools used. Do not enter personal, confidential or sensitive information into AI tools. Any external sources used should be appropriately referenced.</w:t>
             </w:r>
           </w:p>
           <w:p>
@@ -2804,18 +2682,18 @@
           <w:p>
             <w:pPr>
               <w:rPr>
-                <w:color w:val="000000" w:themeColor="text1"/>
+                <w:color w:val="000000"/>
                 <w:sz w:val="20"/>
                 <w:szCs w:val="20"/>
               </w:rPr>
             </w:pPr>
             <w:r>
               <w:rPr>
-                <w:color w:val="000000" w:themeColor="text1"/>
+                <w:color w:val="000000"/>
                 <w:sz w:val="20"/>
                 <w:szCs w:val="20"/>
               </w:rPr>
-              <w:t>List the AI tools used and briefly explain how you used them responsibly.</w:t>
+              <w:t xml:space="preserve">List the AI tools used and briefly explain how you used them responsibly.</w:t>
             </w:r>
           </w:p>
         </w:tc>
@@ -2845,7 +2723,7 @@
         </w:rPr>
         <w:t xml:space="preserve">Adapted from the </w:t>
       </w:r>
-      <w:hyperlink r:id="rId14">
+      <w:hyperlink r:id="rId4" w:history="1">
         <w:r>
           <w:rPr>
             <w:i/>
@@ -2855,7 +2733,7 @@
             <w:szCs w:val="20"/>
             <w:u w:val="single"/>
           </w:rPr>
-          <w:t>AI Fluency Framework</w:t>
+          <w:t xml:space="preserve">AI Fluency Framework</w:t>
         </w:r>
       </w:hyperlink>
       <w:r>
@@ -3034,11 +2912,11 @@
     <w:p>
       <w:pPr>
         <w:pBdr>
-          <w:top w:val="nil"/>
-          <w:left w:val="nil"/>
-          <w:bottom w:val="nil"/>
-          <w:right w:val="nil"/>
-          <w:between w:val="nil"/>
+          <w:top w:val="nil" w:sz="4" w:space="0" w:color="auto"/>
+          <w:left w:val="nil" w:sz="4" w:space="0" w:color="auto"/>
+          <w:bottom w:val="nil" w:sz="4" w:space="0" w:color="auto"/>
+          <w:right w:val="nil" w:sz="4" w:space="0" w:color="auto"/>
+          <w:between w:val="nil" w:sz="4" w:space="0" w:color="auto"/>
         </w:pBdr>
         <w:spacing w:after="0"/>
         <w:ind w:left="720"/>
@@ -3063,10 +2941,11 @@
       <w:pPr>
         <w:spacing w:after="0"/>
         <w:sectPr>
+          <w:type w:val="nextPage"/>
           <w:pgSz w:w="11906" w:h="16838"/>
           <w:pgMar w:top="1134" w:right="1134" w:bottom="1134" w:left="1134" w:header="709" w:footer="709" w:gutter="0"/>
-          <w:pgNumType w:start="1"/>
-          <w:cols w:space="720"/>
+          <w:pgNumType w:fmt="decimal" w:start="1"/>
+          <w:cols w:space="720" w:num="1"/>
         </w:sectPr>
       </w:pPr>
     </w:p>
@@ -3075,8 +2954,7 @@
         <w:pStyle w:val="Heading2"/>
       </w:pPr>
       <w:r>
-        <w:lastRenderedPageBreak/>
-        <w:t>Grading Criteria</w:t>
+        <w:t xml:space="preserve">Grading Criteria</w:t>
       </w:r>
     </w:p>
     <w:p>
@@ -3084,7 +2962,7 @@
         <w:spacing w:after="0"/>
       </w:pPr>
       <w:r>
-        <w:t>This grading rubric sets out the marking criteria for your assignment.</w:t>
+        <w:t xml:space="preserve">This grading rubric sets out the marking criteria for your assignment.</w:t>
       </w:r>
     </w:p>
     <w:p>
@@ -3100,13 +2978,12 @@
         <w:pStyle w:val="Heading2"/>
       </w:pPr>
       <w:r>
-        <w:t>Grading Criteria</w:t>
+        <w:t xml:space="preserve">Grading Criteria</w:t>
       </w:r>
     </w:p>
     <w:tbl>
       <w:tblPr>
         <w:tblW w:w="0" w:type="auto"/>
-        <w:tblCellSpacing w:w="15" w:type="dxa"/>
         <w:tblBorders>
           <w:top w:val="single" w:sz="4" w:space="0" w:color="auto"/>
           <w:left w:val="single" w:sz="4" w:space="0" w:color="auto"/>
@@ -3132,7 +3009,6 @@
       <w:tr>
         <w:trPr>
           <w:tblHeader/>
-          <w:tblCellSpacing w:w="15" w:type="dxa"/>
         </w:trPr>
         <w:tc>
           <w:tcPr>
@@ -3152,7 +3028,7 @@
               <w:rPr>
                 <w:rStyle w:val="Strong"/>
               </w:rPr>
-              <w:t>Criteria</w:t>
+              <w:t xml:space="preserve">Criteria</w:t>
             </w:r>
           </w:p>
         </w:tc>
@@ -3174,7 +3050,7 @@
               <w:rPr>
                 <w:rStyle w:val="Strong"/>
               </w:rPr>
-              <w:t>Project Proposal</w:t>
+              <w:t xml:space="preserve">Project Proposal</w:t>
             </w:r>
           </w:p>
         </w:tc>
@@ -3196,7 +3072,7 @@
               <w:rPr>
                 <w:rStyle w:val="Strong"/>
               </w:rPr>
-              <w:t>Scope and Methodology</w:t>
+              <w:t xml:space="preserve">Scope and Methodology</w:t>
             </w:r>
           </w:p>
         </w:tc>
@@ -3218,15 +3094,12 @@
               <w:rPr>
                 <w:rStyle w:val="Strong"/>
               </w:rPr>
-              <w:t>Data and Ethical Considerations</w:t>
+              <w:t xml:space="preserve">Data and Ethical Considerations</w:t>
             </w:r>
           </w:p>
         </w:tc>
       </w:tr>
       <w:tr>
-        <w:trPr>
-          <w:tblCellSpacing w:w="15" w:type="dxa"/>
-        </w:trPr>
         <w:tc>
           <w:tcPr>
             <w:tcW w:w="0" w:type="auto"/>
@@ -3238,7 +3111,7 @@
               <w:rPr>
                 <w:rStyle w:val="Strong"/>
               </w:rPr>
-              <w:t>Weighting</w:t>
+              <w:t xml:space="preserve">Weighting</w:t>
             </w:r>
           </w:p>
         </w:tc>
@@ -3253,7 +3126,7 @@
               <w:rPr>
                 <w:rStyle w:val="Strong"/>
               </w:rPr>
-              <w:t>40%</w:t>
+              <w:t xml:space="preserve">40%</w:t>
             </w:r>
           </w:p>
         </w:tc>
@@ -3268,7 +3141,7 @@
               <w:rPr>
                 <w:rStyle w:val="Strong"/>
               </w:rPr>
-              <w:t>40%</w:t>
+              <w:t xml:space="preserve">40%</w:t>
             </w:r>
           </w:p>
         </w:tc>
@@ -3283,15 +3156,12 @@
               <w:rPr>
                 <w:rStyle w:val="Strong"/>
               </w:rPr>
-              <w:t>20%</w:t>
+              <w:t xml:space="preserve">20%</w:t>
             </w:r>
           </w:p>
         </w:tc>
       </w:tr>
       <w:tr>
-        <w:trPr>
-          <w:tblCellSpacing w:w="15" w:type="dxa"/>
-        </w:trPr>
         <w:tc>
           <w:tcPr>
             <w:tcW w:w="0" w:type="auto"/>
@@ -3303,7 +3173,7 @@
               <w:rPr>
                 <w:rStyle w:val="Strong"/>
               </w:rPr>
-              <w:t>Excellent (70%+)</w:t>
+              <w:t xml:space="preserve">Excellent (70%+)</w:t>
             </w:r>
           </w:p>
         </w:tc>
@@ -3315,7 +3185,7 @@
           </w:tcPr>
           <w:p>
             <w:r>
-              <w:t>Clear and well-structured proposal addressing an appropriate real-world business problem using data analytics and predictive modelling. Aim and 3–5 objectives are clear, achievable and well aligned with the problem. Problem definition, significance and expected deliverables are clearly explained.</w:t>
+              <w:t xml:space="preserve">Clear and well-structured proposal addressing an appropriate real-world business problem using data analytics and predictive modelling. Aim and 3–5 objectives are clear, achievable and well aligned with the problem. Problem definition, significance and expected deliverables are clearly explained.</w:t>
             </w:r>
           </w:p>
         </w:tc>
@@ -3327,7 +3197,7 @@
           </w:tcPr>
           <w:p>
             <w:r>
-              <w:t>Scope is clearly defined with appropriate inclusions and exclusions. Proposed data analytics and predictive modelling methods, tools and technologies are appropriate and well justified. Architectural diagram clearly represents the proposed workflow. Timeline diagram is realistic and clearly covers both semesters, key activities and milestones.</w:t>
+              <w:t xml:space="preserve">Scope is clearly defined with appropriate inclusions and exclusions. Proposed data analytics and predictive modelling methods, tools and technologies are appropriate and well justified. Architectural diagram clearly represents the proposed workflow. Timeline diagram is realistic and clearly covers both semesters, key activities and milestones.</w:t>
             </w:r>
           </w:p>
         </w:tc>
@@ -3339,15 +3209,12 @@
           </w:tcPr>
           <w:p>
             <w:r>
-              <w:t>Data sources are clearly identified, relevant and appropriate for the proposed project, with access/use permissions addressed. Ethical, legal, privacy, security and data-protection considerations are thoroughly identified and appropriately addressed.</w:t>
+              <w:t xml:space="preserve">Data sources are clearly identified, relevant and appropriate for the proposed project, with access/use permissions addressed. Ethical, legal, privacy, security and data-protection considerations are thoroughly identified and appropriately addressed.</w:t>
             </w:r>
           </w:p>
         </w:tc>
       </w:tr>
       <w:tr>
-        <w:trPr>
-          <w:tblCellSpacing w:w="15" w:type="dxa"/>
-        </w:trPr>
         <w:tc>
           <w:tcPr>
             <w:tcW w:w="0" w:type="auto"/>
@@ -3359,7 +3226,7 @@
               <w:rPr>
                 <w:rStyle w:val="Strong"/>
               </w:rPr>
-              <w:t>Very Good (60–69%)</w:t>
+              <w:t xml:space="preserve">Very Good (60–69%)</w:t>
             </w:r>
           </w:p>
         </w:tc>
@@ -3371,7 +3238,7 @@
           </w:tcPr>
           <w:p>
             <w:r>
-              <w:t>Good proposal with a relevant business problem, clear aim and objectives. Problem definition and expected deliverables are well explained, with minor areas requiring further detail.</w:t>
+              <w:t xml:space="preserve">Good proposal with a relevant business problem, clear aim and objectives. Problem definition and expected deliverables are well explained, with minor areas requiring further detail.</w:t>
             </w:r>
           </w:p>
         </w:tc>
@@ -3383,7 +3250,7 @@
           </w:tcPr>
           <w:p>
             <w:r>
-              <w:t>Scope and methodology are well defined. Appropriate analytical and predictive modelling approaches are proposed with reasonable justification. Architecture and timeline diagrams are clear but may lack some detail.</w:t>
+              <w:t xml:space="preserve">Scope and methodology are well defined. Appropriate analytical and predictive modelling approaches are proposed with reasonable justification. Architecture and timeline diagrams are clear but may lack some detail.</w:t>
             </w:r>
           </w:p>
         </w:tc>
@@ -3395,15 +3262,12 @@
           </w:tcPr>
           <w:p>
             <w:r>
-              <w:t>Appropriate data sources are identified and explained. Data permissions and relevant ethical, legal and privacy considerations are adequately addressed.</w:t>
+              <w:t xml:space="preserve">Appropriate data sources are identified and explained. Data permissions and relevant ethical, legal and privacy considerations are adequately addressed.</w:t>
             </w:r>
           </w:p>
         </w:tc>
       </w:tr>
       <w:tr>
-        <w:trPr>
-          <w:tblCellSpacing w:w="15" w:type="dxa"/>
-        </w:trPr>
         <w:tc>
           <w:tcPr>
             <w:tcW w:w="0" w:type="auto"/>
@@ -3415,7 +3279,7 @@
               <w:rPr>
                 <w:rStyle w:val="Strong"/>
               </w:rPr>
-              <w:t>Good (50–59%)</w:t>
+              <w:t xml:space="preserve">Good (50–59%)</w:t>
             </w:r>
           </w:p>
         </w:tc>
@@ -3427,7 +3291,7 @@
           </w:tcPr>
           <w:p>
             <w:r>
-              <w:t>Suitable business problem is identified, with an adequate aim and objectives. The problem definition and expected deliverables are generally clear but lack depth or detail.</w:t>
+              <w:t xml:space="preserve">Suitable business problem is identified, with an adequate aim and objectives. The problem definition and expected deliverables are generally clear but lack depth or detail.</w:t>
             </w:r>
           </w:p>
         </w:tc>
@@ -3439,7 +3303,7 @@
           </w:tcPr>
           <w:p>
             <w:r>
-              <w:t>Scope and methodology are adequately described but lack sufficient justification or detail. Proposed analytical/predictive methods are generally suitable. Architecture and timeline diagrams are included but require further development.</w:t>
+              <w:t xml:space="preserve">Scope and methodology are adequately described but lack sufficient justification or detail. Proposed analytical/predictive methods are generally suitable. Architecture and timeline diagrams are included but require further development.</w:t>
             </w:r>
           </w:p>
         </w:tc>
@@ -3451,15 +3315,12 @@
           </w:tcPr>
           <w:p>
             <w:r>
-              <w:t>Data sources are identified with basic justification. Data permissions and ethical/legal considerations are mentioned but require further explanation.</w:t>
+              <w:t xml:space="preserve">Data sources are identified with basic justification. Data permissions and ethical/legal considerations are mentioned but require further explanation.</w:t>
             </w:r>
           </w:p>
         </w:tc>
       </w:tr>
       <w:tr>
-        <w:trPr>
-          <w:tblCellSpacing w:w="15" w:type="dxa"/>
-        </w:trPr>
         <w:tc>
           <w:tcPr>
             <w:tcW w:w="0" w:type="auto"/>
@@ -3471,8 +3332,7 @@
               <w:rPr>
                 <w:rStyle w:val="Strong"/>
               </w:rPr>
-              <w:lastRenderedPageBreak/>
-              <w:t>Acceptable (40–49%)</w:t>
+              <w:t xml:space="preserve">Acceptable (40–49%)</w:t>
             </w:r>
           </w:p>
         </w:tc>
@@ -3484,7 +3344,7 @@
           </w:tcPr>
           <w:p>
             <w:r>
-              <w:t>A business problem, aim and objectives are presented but are unclear, underdeveloped or weakly aligned with data analytics and predictive modelling. Expected outcomes are only partially described.</w:t>
+              <w:t xml:space="preserve">A business problem, aim and objectives are presented but are unclear, underdeveloped or weakly aligned with data analytics and predictive modelling. Expected outcomes are only partially described.</w:t>
             </w:r>
           </w:p>
         </w:tc>
@@ -3496,7 +3356,7 @@
           </w:tcPr>
           <w:p>
             <w:r>
-              <w:t>Scope and methodology are minimally described. Limited justification is provided for the proposed methods or technologies. Architecture and/or timeline diagrams are incomplete, unclear or lack important details.</w:t>
+              <w:t xml:space="preserve">Scope and methodology are minimally described. Limited justification is provided for the proposed methods or technologies. Architecture and/or timeline diagrams are incomplete, unclear or lack important details.</w:t>
             </w:r>
           </w:p>
         </w:tc>
@@ -3508,15 +3368,12 @@
           </w:tcPr>
           <w:p>
             <w:r>
-              <w:t>Data sources are vaguely described or their suitability is unclear. Limited consideration is given to data permissions, ethics, privacy, security or legal requirements.</w:t>
+              <w:t xml:space="preserve">Data sources are vaguely described or their suitability is unclear. Limited consideration is given to data permissions, ethics, privacy, security or legal requirements.</w:t>
             </w:r>
           </w:p>
         </w:tc>
       </w:tr>
       <w:tr>
-        <w:trPr>
-          <w:tblCellSpacing w:w="15" w:type="dxa"/>
-        </w:trPr>
         <w:tc>
           <w:tcPr>
             <w:tcW w:w="0" w:type="auto"/>
@@ -3528,7 +3385,7 @@
               <w:rPr>
                 <w:rStyle w:val="Strong"/>
               </w:rPr>
-              <w:t>Fail (&lt;40%)</w:t>
+              <w:t xml:space="preserve">Fail (&lt;40%)</w:t>
             </w:r>
           </w:p>
         </w:tc>
@@ -3540,7 +3397,7 @@
           </w:tcPr>
           <w:p>
             <w:r>
-              <w:t>The proposed business problem is unclear or unsuitable. Aim, objectives, problem definition and expected deliverables are missing, significantly incomplete or not aligned with the project requirements.</w:t>
+              <w:t xml:space="preserve">The proposed business problem is unclear or unsuitable. Aim, objectives, problem definition and expected deliverables are missing, significantly incomplete or not aligned with the project requirements.</w:t>
             </w:r>
           </w:p>
         </w:tc>
@@ -3552,7 +3409,7 @@
           </w:tcPr>
           <w:p>
             <w:r>
-              <w:t>Scope and methodology are unclear, inappropriate or missing. Data analytics/predictive modelling approaches are not adequately proposed. Architecture and/or timeline diagrams are missing or inadequate.</w:t>
+              <w:t xml:space="preserve">Scope and methodology are unclear, inappropriate or missing. Data analytics/predictive modelling approaches are not adequately proposed. Architecture and/or timeline diagrams are missing or inadequate.</w:t>
             </w:r>
           </w:p>
         </w:tc>
@@ -3564,7 +3421,7 @@
           </w:tcPr>
           <w:p>
             <w:r>
-              <w:t>Appropriate data sources are not identified or their use is not justified. Data permissions and relevant ethical, legal, privacy and security considerations are missing or inadequately addressed.</w:t>
+              <w:t xml:space="preserve">Appropriate data sources are not identified or their use is not justified. Data permissions and relevant ethical, legal, privacy and security considerations are missing or inadequately addressed.</w:t>
             </w:r>
           </w:p>
         </w:tc>
@@ -3576,12 +3433,13 @@
           <w:b/>
         </w:rPr>
         <w:sectPr>
-          <w:headerReference w:type="default" r:id="rId15"/>
-          <w:footerReference w:type="default" r:id="rId16"/>
+          <w:headerReference w:type="default" r:id="rId5"/>
+          <w:footerReference w:type="default" r:id="rId6"/>
+          <w:type w:val="nextPage"/>
           <w:pgSz w:w="16838" w:h="11906" w:orient="landscape"/>
           <w:pgMar w:top="1134" w:right="1134" w:bottom="1134" w:left="1134" w:header="709" w:footer="709" w:gutter="0"/>
-          <w:pgNumType w:start="1"/>
-          <w:cols w:space="720"/>
+          <w:pgNumType w:fmt="decimal" w:start="1"/>
+          <w:cols w:space="720" w:num="1"/>
         </w:sectPr>
       </w:pPr>
     </w:p>
@@ -3604,7 +3462,7 @@
         <w:rPr>
           <w:b/>
         </w:rPr>
-        <w:t>The Irish Grading System</w:t>
+        <w:t xml:space="preserve">The Irish Grading System</w:t>
       </w:r>
     </w:p>
     <w:p>
@@ -3624,11 +3482,11 @@
     <w:p>
       <w:pPr>
         <w:pBdr>
-          <w:top w:val="nil"/>
-          <w:left w:val="nil"/>
-          <w:bottom w:val="nil"/>
-          <w:right w:val="nil"/>
-          <w:between w:val="nil"/>
+          <w:top w:val="nil" w:sz="4" w:space="0" w:color="auto"/>
+          <w:left w:val="nil" w:sz="4" w:space="0" w:color="auto"/>
+          <w:bottom w:val="nil" w:sz="4" w:space="0" w:color="auto"/>
+          <w:right w:val="nil" w:sz="4" w:space="0" w:color="auto"/>
+          <w:between w:val="nil" w:sz="4" w:space="0" w:color="auto"/>
         </w:pBdr>
         <w:spacing w:after="0"/>
         <w:ind w:left="720"/>
@@ -3667,7 +3525,7 @@
         <w:rPr>
           <w:b/>
         </w:rPr>
-        <w:t>Additional Information</w:t>
+        <w:t xml:space="preserve">Additional Information</w:t>
       </w:r>
     </w:p>
     <w:p>
@@ -3677,11 +3535,11 @@
           <w:numId w:val="12"/>
         </w:numPr>
         <w:pBdr>
-          <w:top w:val="nil"/>
-          <w:left w:val="nil"/>
-          <w:bottom w:val="nil"/>
-          <w:right w:val="nil"/>
-          <w:between w:val="nil"/>
+          <w:top w:val="nil" w:sz="4" w:space="0" w:color="auto"/>
+          <w:left w:val="nil" w:sz="4" w:space="0" w:color="auto"/>
+          <w:bottom w:val="nil" w:sz="4" w:space="0" w:color="auto"/>
+          <w:right w:val="nil" w:sz="4" w:space="0" w:color="auto"/>
+          <w:between w:val="nil" w:sz="4" w:space="0" w:color="auto"/>
         </w:pBdr>
         <w:spacing w:after="0"/>
         <w:rPr>
@@ -3703,11 +3561,11 @@
           <w:numId w:val="12"/>
         </w:numPr>
         <w:pBdr>
-          <w:top w:val="nil"/>
-          <w:left w:val="nil"/>
-          <w:bottom w:val="nil"/>
-          <w:right w:val="nil"/>
-          <w:between w:val="nil"/>
+          <w:top w:val="nil" w:sz="4" w:space="0" w:color="auto"/>
+          <w:left w:val="nil" w:sz="4" w:space="0" w:color="auto"/>
+          <w:bottom w:val="nil" w:sz="4" w:space="0" w:color="auto"/>
+          <w:right w:val="nil" w:sz="4" w:space="0" w:color="auto"/>
+          <w:between w:val="nil" w:sz="4" w:space="0" w:color="auto"/>
         </w:pBdr>
         <w:spacing w:after="0"/>
       </w:pPr>
@@ -3725,11 +3583,11 @@
           <w:numId w:val="12"/>
         </w:numPr>
         <w:pBdr>
-          <w:top w:val="nil"/>
-          <w:left w:val="nil"/>
-          <w:bottom w:val="nil"/>
-          <w:right w:val="nil"/>
-          <w:between w:val="nil"/>
+          <w:top w:val="nil" w:sz="4" w:space="0" w:color="auto"/>
+          <w:left w:val="nil" w:sz="4" w:space="0" w:color="auto"/>
+          <w:bottom w:val="nil" w:sz="4" w:space="0" w:color="auto"/>
+          <w:right w:val="nil" w:sz="4" w:space="0" w:color="auto"/>
+          <w:between w:val="nil" w:sz="4" w:space="0" w:color="auto"/>
         </w:pBdr>
         <w:spacing w:after="0"/>
       </w:pPr>
@@ -3747,11 +3605,11 @@
           <w:numId w:val="12"/>
         </w:numPr>
         <w:pBdr>
-          <w:top w:val="nil"/>
-          <w:left w:val="nil"/>
-          <w:bottom w:val="nil"/>
-          <w:right w:val="nil"/>
-          <w:between w:val="nil"/>
+          <w:top w:val="nil" w:sz="4" w:space="0" w:color="auto"/>
+          <w:left w:val="nil" w:sz="4" w:space="0" w:color="auto"/>
+          <w:bottom w:val="nil" w:sz="4" w:space="0" w:color="auto"/>
+          <w:right w:val="nil" w:sz="4" w:space="0" w:color="auto"/>
+          <w:between w:val="nil" w:sz="4" w:space="0" w:color="auto"/>
         </w:pBdr>
         <w:spacing w:after="0"/>
       </w:pPr>
@@ -3769,11 +3627,11 @@
           <w:numId w:val="12"/>
         </w:numPr>
         <w:pBdr>
-          <w:top w:val="nil"/>
-          <w:left w:val="nil"/>
-          <w:bottom w:val="nil"/>
-          <w:right w:val="nil"/>
-          <w:between w:val="nil"/>
+          <w:top w:val="nil" w:sz="4" w:space="0" w:color="auto"/>
+          <w:left w:val="nil" w:sz="4" w:space="0" w:color="auto"/>
+          <w:bottom w:val="nil" w:sz="4" w:space="0" w:color="auto"/>
+          <w:right w:val="nil" w:sz="4" w:space="0" w:color="auto"/>
+          <w:between w:val="nil" w:sz="4" w:space="0" w:color="auto"/>
         </w:pBdr>
         <w:spacing w:after="0"/>
       </w:pPr>
@@ -3791,11 +3649,11 @@
           <w:numId w:val="12"/>
         </w:numPr>
         <w:pBdr>
-          <w:top w:val="nil"/>
-          <w:left w:val="nil"/>
-          <w:bottom w:val="nil"/>
-          <w:right w:val="nil"/>
-          <w:between w:val="nil"/>
+          <w:top w:val="nil" w:sz="4" w:space="0" w:color="auto"/>
+          <w:left w:val="nil" w:sz="4" w:space="0" w:color="auto"/>
+          <w:bottom w:val="nil" w:sz="4" w:space="0" w:color="auto"/>
+          <w:right w:val="nil" w:sz="4" w:space="0" w:color="auto"/>
+          <w:between w:val="nil" w:sz="4" w:space="0" w:color="auto"/>
         </w:pBdr>
         <w:spacing w:after="0"/>
       </w:pPr>
@@ -3803,7 +3661,7 @@
         <w:rPr>
           <w:color w:val="000000"/>
         </w:rPr>
-        <w:t>Students are advised that disagreement with an academic judgement is not grounds for review.</w:t>
+        <w:t xml:space="preserve">Students are advised that disagreement with an academic judgement is not grounds for review.</w:t>
       </w:r>
     </w:p>
     <w:p>
@@ -3813,11 +3671,11 @@
           <w:numId w:val="12"/>
         </w:numPr>
         <w:pBdr>
-          <w:top w:val="nil"/>
-          <w:left w:val="nil"/>
-          <w:bottom w:val="nil"/>
-          <w:right w:val="nil"/>
-          <w:between w:val="nil"/>
+          <w:top w:val="nil" w:sz="4" w:space="0" w:color="auto"/>
+          <w:left w:val="nil" w:sz="4" w:space="0" w:color="auto"/>
+          <w:bottom w:val="nil" w:sz="4" w:space="0" w:color="auto"/>
+          <w:right w:val="nil" w:sz="4" w:space="0" w:color="auto"/>
+          <w:between w:val="nil" w:sz="4" w:space="0" w:color="auto"/>
         </w:pBdr>
         <w:spacing w:after="0"/>
       </w:pPr>
@@ -3825,7 +3683,7 @@
         <w:rPr>
           <w:color w:val="000000"/>
         </w:rPr>
-        <w:t>For additional support with academic writing and referencing students are advised to contact the CCT Library Service.</w:t>
+        <w:t xml:space="preserve">For additional support with academic writing and referencing students are advised to contact the CCT Library Service.</w:t>
       </w:r>
     </w:p>
     <w:p>
@@ -3835,11 +3693,11 @@
           <w:numId w:val="12"/>
         </w:numPr>
         <w:pBdr>
-          <w:top w:val="nil"/>
-          <w:left w:val="nil"/>
-          <w:bottom w:val="nil"/>
-          <w:right w:val="nil"/>
-          <w:between w:val="nil"/>
+          <w:top w:val="nil" w:sz="4" w:space="0" w:color="auto"/>
+          <w:left w:val="nil" w:sz="4" w:space="0" w:color="auto"/>
+          <w:bottom w:val="nil" w:sz="4" w:space="0" w:color="auto"/>
+          <w:right w:val="nil" w:sz="4" w:space="0" w:color="auto"/>
+          <w:between w:val="nil" w:sz="4" w:space="0" w:color="auto"/>
         </w:pBdr>
         <w:spacing w:after="0"/>
       </w:pPr>
@@ -3849,13 +3707,13 @@
         </w:rPr>
         <w:t xml:space="preserve">For additional support with subject matter content students are advised to contact the </w:t>
       </w:r>
-      <w:hyperlink r:id="rId17">
+      <w:hyperlink r:id="rId7" w:history="1">
         <w:r>
           <w:rPr>
             <w:color w:val="1155CC"/>
             <w:u w:val="single"/>
           </w:rPr>
-          <w:t>CCT Student Mentoring Academy</w:t>
+          <w:t xml:space="preserve">CCT Student Mentoring Academy</w:t>
         </w:r>
       </w:hyperlink>
     </w:p>
@@ -3872,20 +3730,20 @@
         </w:rPr>
         <w:t xml:space="preserve">For additional support with IT subject content, students are advised to access the </w:t>
       </w:r>
-      <w:hyperlink r:id="rId18">
+      <w:hyperlink r:id="rId8" w:history="1">
         <w:r>
           <w:rPr>
             <w:color w:val="0563C1"/>
             <w:u w:val="single"/>
           </w:rPr>
-          <w:t>CCT Support Hub</w:t>
+          <w:t xml:space="preserve">CCT Support Hub</w:t>
         </w:r>
       </w:hyperlink>
       <w:r>
         <w:rPr>
           <w:color w:val="000000"/>
         </w:rPr>
-        <w:t>.</w:t>
+        <w:t xml:space="preserve">.</w:t>
       </w:r>
     </w:p>
     <w:p>
@@ -3894,19 +3752,20 @@
       </w:pPr>
     </w:p>
     <w:sectPr>
-      <w:headerReference w:type="default" r:id="rId19"/>
-      <w:footerReference w:type="default" r:id="rId20"/>
+      <w:headerReference w:type="default" r:id="rId9"/>
+      <w:footerReference w:type="default" r:id="rId10"/>
+      <w:type w:val="nextPage"/>
       <w:pgSz w:w="11906" w:h="16838"/>
       <w:pgMar w:top="1134" w:right="1134" w:bottom="1134" w:left="1134" w:header="709" w:footer="709" w:gutter="0"/>
-      <w:pgNumType w:start="1"/>
-      <w:cols w:space="720"/>
+      <w:pgNumType w:fmt="decimal" w:start="1"/>
+      <w:cols w:space="720" w:num="1"/>
     </w:sectPr>
   </w:body>
 </w:document>
 </file>
 
 <file path=word/endnotes.xml><?xml version="1.0" encoding="utf-8"?>
-<w:endnotes xmlns:wpc="http://schemas.microsoft.com/office/word/2010/wordprocessingCanvas" xmlns:cx="http://schemas.microsoft.com/office/drawing/2014/chartex" xmlns:cx1="http://schemas.microsoft.com/office/drawing/2015/9/8/chartex" xmlns:cx2="http://schemas.microsoft.com/office/drawing/2015/10/21/chartex" xmlns:cx3="http://schemas.microsoft.com/office/drawing/2016/5/9/chartex" xmlns:cx4="http://schemas.microsoft.com/office/drawing/2016/5/10/chartex" xmlns:cx5="http://schemas.microsoft.com/office/drawing/2016/5/11/chartex" xmlns:cx6="http://schemas.microsoft.com/office/drawing/2016/5/12/chartex" xmlns:cx7="http://schemas.microsoft.com/office/drawing/2016/5/13/chartex" xmlns:cx8="http://schemas.microsoft.com/office/drawing/2016/5/14/chartex" xmlns:mc="http://schemas.openxmlformats.org/markup-compatibility/2006" xmlns:aink="http://schemas.microsoft.com/office/drawing/2016/ink" xmlns:am3d="http://schemas.microsoft.com/office/drawing/2017/model3d" xmlns:o="urn:schemas-microsoft-com:office:office" xmlns:oel="http://schemas.microsoft.com/office/2019/extlst" xmlns:r="http://schemas.openxmlformats.org/officeDocument/2006/relationships" xmlns:m="http://schemas.openxmlformats.org/officeDocument/2006/math" xmlns:v="urn:schemas-microsoft-com:vml" xmlns:wp14="http://schemas.microsoft.com/office/word/2010/wordprocessingDrawing" xmlns:wp="http://schemas.openxmlformats.org/drawingml/2006/wordprocessingDrawing" xmlns:w10="urn:schemas-microsoft-com:office:word" xmlns:w="http://schemas.openxmlformats.org/wordprocessingml/2006/main" xmlns:w14="http://schemas.microsoft.com/office/word/2010/wordml" xmlns:w15="http://schemas.microsoft.com/office/word/2012/wordml" xmlns:w16cex="http://schemas.microsoft.com/office/word/2018/wordml/cex" xmlns:w16cid="http://schemas.microsoft.com/office/word/2016/wordml/cid" xmlns:w16="http://schemas.microsoft.com/office/word/2018/wordml" xmlns:w16du="http://schemas.microsoft.com/office/word/2023/wordml/word16du" xmlns:w16sdtdh="http://schemas.microsoft.com/office/word/2020/wordml/sdtdatahash" xmlns:w16sdtfl="http://schemas.microsoft.com/office/word/2024/wordml/sdtformatlock" xmlns:w16se="http://schemas.microsoft.com/office/word/2015/wordml/symex" xmlns:wpg="http://schemas.microsoft.com/office/word/2010/wordprocessingGroup" xmlns:wpi="http://schemas.microsoft.com/office/word/2010/wordprocessingInk" xmlns:wne="http://schemas.microsoft.com/office/word/2006/wordml" xmlns:wps="http://schemas.microsoft.com/office/word/2010/wordprocessingShape" mc:Ignorable="w14 w15 w16se w16cid w16 w16cex w16sdtdh w16sdtfl w16du wp14">
+<w:endnotes xmlns:w="http://schemas.openxmlformats.org/wordprocessingml/2006/main" xmlns:r="http://schemas.openxmlformats.org/officeDocument/2006/relationships" xmlns:wp="http://schemas.openxmlformats.org/drawingml/2006/wordprocessingDrawing" xmlns:a="http://schemas.openxmlformats.org/drawingml/2006/main" xmlns:c="http://schemas.openxmlformats.org/drawingml/2006/chart" xmlns:pic="http://schemas.openxmlformats.org/drawingml/2006/picture" xmlns:mc="http://schemas.openxmlformats.org/markup-compatibility/2006" xmlns:w14="http://schemas.microsoft.com/office/word/2010/wordml" xmlns:wpi="http://schemas.microsoft.com/office/word/2010/wordprocessingInk" xmlns:w15="http://schemas.microsoft.com/office/word/2012/wordml" xmlns:wp14="http://schemas.microsoft.com/office/word/2010/wordprocessingDrawing" xmlns:wps="http://schemas.microsoft.com/office/word/2010/wordprocessingShape" xmlns:wpg="http://schemas.microsoft.com/office/word/2010/wordprocessingGroup" xmlns:wpc="http://schemas.microsoft.com/office/word/2010/wordprocessingCanvas" xmlns:dgm="http://schemas.openxmlformats.org/drawingml/2006/diagram" xmlns:dsp="http://schemas.microsoft.com/office/drawing/2008/diagram" xmlns:m="http://schemas.openxmlformats.org/officeDocument/2006/math" xmlns:v="urn:schemas-microsoft-com:vml" xmlns:o="urn:schemas-microsoft-com:office:office" xmlns:w10="urn:schemas-microsoft-com:office:word" xmlns:cx="http://schemas.microsoft.com/office/drawing/2014/chartex" xmlns:cx1="http://schemas.microsoft.com/office/drawing/2015/9/8/chartex" xmlns:cx2="http://schemas.microsoft.com/office/drawing/2015/10/21/chartex" xmlns:cx3="http://schemas.microsoft.com/office/drawing/2016/5/9/chartex" xmlns:cx4="http://schemas.microsoft.com/office/drawing/2016/5/10/chartex" xmlns:cx5="http://schemas.microsoft.com/office/drawing/2016/5/11/chartex" xmlns:cx6="http://schemas.microsoft.com/office/drawing/2016/5/12/chartex" xmlns:cx7="http://schemas.microsoft.com/office/drawing/2016/5/13/chartex" xmlns:cx8="http://schemas.microsoft.com/office/drawing/2016/5/14/chartex" mc:Ignorable="w14 w15 wp14">
   <w:endnote w:type="separator" w:id="-1">
     <w:p>
       <w:pPr>
@@ -3931,7 +3790,7 @@
 </file>
 
 <file path=word/footer1.xml><?xml version="1.0" encoding="utf-8"?>
-<w:ftr xmlns:wpc="http://schemas.microsoft.com/office/word/2010/wordprocessingCanvas" xmlns:cx="http://schemas.microsoft.com/office/drawing/2014/chartex" xmlns:cx1="http://schemas.microsoft.com/office/drawing/2015/9/8/chartex" xmlns:cx2="http://schemas.microsoft.com/office/drawing/2015/10/21/chartex" xmlns:cx3="http://schemas.microsoft.com/office/drawing/2016/5/9/chartex" xmlns:cx4="http://schemas.microsoft.com/office/drawing/2016/5/10/chartex" xmlns:cx5="http://schemas.microsoft.com/office/drawing/2016/5/11/chartex" xmlns:cx6="http://schemas.microsoft.com/office/drawing/2016/5/12/chartex" xmlns:cx7="http://schemas.microsoft.com/office/drawing/2016/5/13/chartex" xmlns:cx8="http://schemas.microsoft.com/office/drawing/2016/5/14/chartex" xmlns:mc="http://schemas.openxmlformats.org/markup-compatibility/2006" xmlns:aink="http://schemas.microsoft.com/office/drawing/2016/ink" xmlns:am3d="http://schemas.microsoft.com/office/drawing/2017/model3d" xmlns:o="urn:schemas-microsoft-com:office:office" xmlns:oel="http://schemas.microsoft.com/office/2019/extlst" xmlns:r="http://schemas.openxmlformats.org/officeDocument/2006/relationships" xmlns:m="http://schemas.openxmlformats.org/officeDocument/2006/math" xmlns:v="urn:schemas-microsoft-com:vml" xmlns:wp14="http://schemas.microsoft.com/office/word/2010/wordprocessingDrawing" xmlns:wp="http://schemas.openxmlformats.org/drawingml/2006/wordprocessingDrawing" xmlns:w10="urn:schemas-microsoft-com:office:word" xmlns:w="http://schemas.openxmlformats.org/wordprocessingml/2006/main" xmlns:w14="http://schemas.microsoft.com/office/word/2010/wordml" xmlns:w15="http://schemas.microsoft.com/office/word/2012/wordml" xmlns:w16cex="http://schemas.microsoft.com/office/word/2018/wordml/cex" xmlns:w16cid="http://schemas.microsoft.com/office/word/2016/wordml/cid" xmlns:w16="http://schemas.microsoft.com/office/word/2018/wordml" xmlns:w16du="http://schemas.microsoft.com/office/word/2023/wordml/word16du" xmlns:w16sdtdh="http://schemas.microsoft.com/office/word/2020/wordml/sdtdatahash" xmlns:w16sdtfl="http://schemas.microsoft.com/office/word/2024/wordml/sdtformatlock" xmlns:w16se="http://schemas.microsoft.com/office/word/2015/wordml/symex" xmlns:wpg="http://schemas.microsoft.com/office/word/2010/wordprocessingGroup" xmlns:wpi="http://schemas.microsoft.com/office/word/2010/wordprocessingInk" xmlns:wne="http://schemas.microsoft.com/office/word/2006/wordml" xmlns:wps="http://schemas.microsoft.com/office/word/2010/wordprocessingShape" mc:Ignorable="w14 w15 w16se w16cid w16 w16cex w16sdtdh w16sdtfl w16du wp14">
+<w:ftr xmlns:w="http://schemas.openxmlformats.org/wordprocessingml/2006/main" xmlns:r="http://schemas.openxmlformats.org/officeDocument/2006/relationships" xmlns:wp="http://schemas.openxmlformats.org/drawingml/2006/wordprocessingDrawing" xmlns:a="http://schemas.openxmlformats.org/drawingml/2006/main" xmlns:c="http://schemas.openxmlformats.org/drawingml/2006/chart" xmlns:pic="http://schemas.openxmlformats.org/drawingml/2006/picture" xmlns:mc="http://schemas.openxmlformats.org/markup-compatibility/2006" xmlns:w14="http://schemas.microsoft.com/office/word/2010/wordml" xmlns:wpi="http://schemas.microsoft.com/office/word/2010/wordprocessingInk" xmlns:w15="http://schemas.microsoft.com/office/word/2012/wordml" xmlns:wp14="http://schemas.microsoft.com/office/word/2010/wordprocessingDrawing" xmlns:wps="http://schemas.microsoft.com/office/word/2010/wordprocessingShape" xmlns:wpg="http://schemas.microsoft.com/office/word/2010/wordprocessingGroup" xmlns:wpc="http://schemas.microsoft.com/office/word/2010/wordprocessingCanvas" xmlns:dgm="http://schemas.openxmlformats.org/drawingml/2006/diagram" xmlns:dsp="http://schemas.microsoft.com/office/drawing/2008/diagram" xmlns:m="http://schemas.openxmlformats.org/officeDocument/2006/math" xmlns:v="urn:schemas-microsoft-com:vml" xmlns:o="urn:schemas-microsoft-com:office:office" xmlns:w10="urn:schemas-microsoft-com:office:word" xmlns:cx="http://schemas.microsoft.com/office/drawing/2014/chartex" xmlns:cx1="http://schemas.microsoft.com/office/drawing/2015/9/8/chartex" xmlns:cx2="http://schemas.microsoft.com/office/drawing/2015/10/21/chartex" xmlns:cx3="http://schemas.microsoft.com/office/drawing/2016/5/9/chartex" xmlns:cx4="http://schemas.microsoft.com/office/drawing/2016/5/10/chartex" xmlns:cx5="http://schemas.microsoft.com/office/drawing/2016/5/11/chartex" xmlns:cx6="http://schemas.microsoft.com/office/drawing/2016/5/12/chartex" xmlns:cx7="http://schemas.microsoft.com/office/drawing/2016/5/13/chartex" xmlns:cx8="http://schemas.microsoft.com/office/drawing/2016/5/14/chartex" mc:Ignorable="w14 w15 wp14">
   <w:sdt>
     <w:sdtPr>
       <w:tag w:val="goog_rdk_7"/>
@@ -3958,7 +3817,7 @@
               <w:rPr>
                 <w:color w:val="000000"/>
               </w:rPr>
-              <w:instrText>PAGE</w:instrText>
+              <w:instrText xml:space="preserve"> PAGE </w:instrText>
             </w:r>
             <w:r>
               <w:rPr>
@@ -3968,10 +3827,9 @@
             </w:r>
             <w:r>
               <w:rPr>
-                <w:noProof/>
                 <w:color w:val="000000"/>
               </w:rPr>
-              <w:t>1</w:t>
+              <w:t xml:space="preserve">1</w:t>
             </w:r>
             <w:r>
               <w:rPr>
@@ -3995,15 +3853,15 @@
 </file>
 
 <file path=word/footer2.xml><?xml version="1.0" encoding="utf-8"?>
-<w:ftr xmlns:wpc="http://schemas.microsoft.com/office/word/2010/wordprocessingCanvas" xmlns:cx="http://schemas.microsoft.com/office/drawing/2014/chartex" xmlns:cx1="http://schemas.microsoft.com/office/drawing/2015/9/8/chartex" xmlns:cx2="http://schemas.microsoft.com/office/drawing/2015/10/21/chartex" xmlns:cx3="http://schemas.microsoft.com/office/drawing/2016/5/9/chartex" xmlns:cx4="http://schemas.microsoft.com/office/drawing/2016/5/10/chartex" xmlns:cx5="http://schemas.microsoft.com/office/drawing/2016/5/11/chartex" xmlns:cx6="http://schemas.microsoft.com/office/drawing/2016/5/12/chartex" xmlns:cx7="http://schemas.microsoft.com/office/drawing/2016/5/13/chartex" xmlns:cx8="http://schemas.microsoft.com/office/drawing/2016/5/14/chartex" xmlns:mc="http://schemas.openxmlformats.org/markup-compatibility/2006" xmlns:aink="http://schemas.microsoft.com/office/drawing/2016/ink" xmlns:am3d="http://schemas.microsoft.com/office/drawing/2017/model3d" xmlns:o="urn:schemas-microsoft-com:office:office" xmlns:oel="http://schemas.microsoft.com/office/2019/extlst" xmlns:r="http://schemas.openxmlformats.org/officeDocument/2006/relationships" xmlns:m="http://schemas.openxmlformats.org/officeDocument/2006/math" xmlns:v="urn:schemas-microsoft-com:vml" xmlns:wp14="http://schemas.microsoft.com/office/word/2010/wordprocessingDrawing" xmlns:wp="http://schemas.openxmlformats.org/drawingml/2006/wordprocessingDrawing" xmlns:w10="urn:schemas-microsoft-com:office:word" xmlns:w="http://schemas.openxmlformats.org/wordprocessingml/2006/main" xmlns:w14="http://schemas.microsoft.com/office/word/2010/wordml" xmlns:w15="http://schemas.microsoft.com/office/word/2012/wordml" xmlns:w16cex="http://schemas.microsoft.com/office/word/2018/wordml/cex" xmlns:w16cid="http://schemas.microsoft.com/office/word/2016/wordml/cid" xmlns:w16="http://schemas.microsoft.com/office/word/2018/wordml" xmlns:w16du="http://schemas.microsoft.com/office/word/2023/wordml/word16du" xmlns:w16sdtdh="http://schemas.microsoft.com/office/word/2020/wordml/sdtdatahash" xmlns:w16sdtfl="http://schemas.microsoft.com/office/word/2024/wordml/sdtformatlock" xmlns:w16se="http://schemas.microsoft.com/office/word/2015/wordml/symex" xmlns:wpg="http://schemas.microsoft.com/office/word/2010/wordprocessingGroup" xmlns:wpi="http://schemas.microsoft.com/office/word/2010/wordprocessingInk" xmlns:wne="http://schemas.microsoft.com/office/word/2006/wordml" xmlns:wps="http://schemas.microsoft.com/office/word/2010/wordprocessingShape" mc:Ignorable="w14 w15 w16se w16cid w16 w16cex w16sdtdh w16sdtfl w16du wp14">
+<w:ftr xmlns:w="http://schemas.openxmlformats.org/wordprocessingml/2006/main" xmlns:r="http://schemas.openxmlformats.org/officeDocument/2006/relationships" xmlns:wp="http://schemas.openxmlformats.org/drawingml/2006/wordprocessingDrawing" xmlns:a="http://schemas.openxmlformats.org/drawingml/2006/main" xmlns:c="http://schemas.openxmlformats.org/drawingml/2006/chart" xmlns:pic="http://schemas.openxmlformats.org/drawingml/2006/picture" xmlns:mc="http://schemas.openxmlformats.org/markup-compatibility/2006" xmlns:w14="http://schemas.microsoft.com/office/word/2010/wordml" xmlns:wpi="http://schemas.microsoft.com/office/word/2010/wordprocessingInk" xmlns:w15="http://schemas.microsoft.com/office/word/2012/wordml" xmlns:wp14="http://schemas.microsoft.com/office/word/2010/wordprocessingDrawing" xmlns:wps="http://schemas.microsoft.com/office/word/2010/wordprocessingShape" xmlns:wpg="http://schemas.microsoft.com/office/word/2010/wordprocessingGroup" xmlns:wpc="http://schemas.microsoft.com/office/word/2010/wordprocessingCanvas" xmlns:dgm="http://schemas.openxmlformats.org/drawingml/2006/diagram" xmlns:dsp="http://schemas.microsoft.com/office/drawing/2008/diagram" xmlns:m="http://schemas.openxmlformats.org/officeDocument/2006/math" xmlns:v="urn:schemas-microsoft-com:vml" xmlns:o="urn:schemas-microsoft-com:office:office" xmlns:w10="urn:schemas-microsoft-com:office:word" xmlns:cx="http://schemas.microsoft.com/office/drawing/2014/chartex" xmlns:cx1="http://schemas.microsoft.com/office/drawing/2015/9/8/chartex" xmlns:cx2="http://schemas.microsoft.com/office/drawing/2015/10/21/chartex" xmlns:cx3="http://schemas.microsoft.com/office/drawing/2016/5/9/chartex" xmlns:cx4="http://schemas.microsoft.com/office/drawing/2016/5/10/chartex" xmlns:cx5="http://schemas.microsoft.com/office/drawing/2016/5/11/chartex" xmlns:cx6="http://schemas.microsoft.com/office/drawing/2016/5/12/chartex" xmlns:cx7="http://schemas.microsoft.com/office/drawing/2016/5/13/chartex" xmlns:cx8="http://schemas.microsoft.com/office/drawing/2016/5/14/chartex" mc:Ignorable="w14 w15 wp14">
   <w:p>
     <w:pPr>
       <w:pBdr>
-        <w:top w:val="nil"/>
-        <w:left w:val="nil"/>
-        <w:bottom w:val="nil"/>
-        <w:right w:val="nil"/>
-        <w:between w:val="nil"/>
+        <w:top w:val="nil" w:sz="4" w:space="0" w:color="auto"/>
+        <w:left w:val="nil" w:sz="4" w:space="0" w:color="auto"/>
+        <w:bottom w:val="nil" w:sz="4" w:space="0" w:color="auto"/>
+        <w:right w:val="nil" w:sz="4" w:space="0" w:color="auto"/>
+        <w:between w:val="nil" w:sz="4" w:space="0" w:color="auto"/>
       </w:pBdr>
       <w:tabs>
         <w:tab w:val="center" w:pos="4513"/>
@@ -4019,15 +3877,15 @@
 </file>
 
 <file path=word/footer3.xml><?xml version="1.0" encoding="utf-8"?>
-<w:ftr xmlns:wpc="http://schemas.microsoft.com/office/word/2010/wordprocessingCanvas" xmlns:cx="http://schemas.microsoft.com/office/drawing/2014/chartex" xmlns:cx1="http://schemas.microsoft.com/office/drawing/2015/9/8/chartex" xmlns:cx2="http://schemas.microsoft.com/office/drawing/2015/10/21/chartex" xmlns:cx3="http://schemas.microsoft.com/office/drawing/2016/5/9/chartex" xmlns:cx4="http://schemas.microsoft.com/office/drawing/2016/5/10/chartex" xmlns:cx5="http://schemas.microsoft.com/office/drawing/2016/5/11/chartex" xmlns:cx6="http://schemas.microsoft.com/office/drawing/2016/5/12/chartex" xmlns:cx7="http://schemas.microsoft.com/office/drawing/2016/5/13/chartex" xmlns:cx8="http://schemas.microsoft.com/office/drawing/2016/5/14/chartex" xmlns:mc="http://schemas.openxmlformats.org/markup-compatibility/2006" xmlns:aink="http://schemas.microsoft.com/office/drawing/2016/ink" xmlns:am3d="http://schemas.microsoft.com/office/drawing/2017/model3d" xmlns:o="urn:schemas-microsoft-com:office:office" xmlns:oel="http://schemas.microsoft.com/office/2019/extlst" xmlns:r="http://schemas.openxmlformats.org/officeDocument/2006/relationships" xmlns:m="http://schemas.openxmlformats.org/officeDocument/2006/math" xmlns:v="urn:schemas-microsoft-com:vml" xmlns:wp14="http://schemas.microsoft.com/office/word/2010/wordprocessingDrawing" xmlns:wp="http://schemas.openxmlformats.org/drawingml/2006/wordprocessingDrawing" xmlns:w10="urn:schemas-microsoft-com:office:word" xmlns:w="http://schemas.openxmlformats.org/wordprocessingml/2006/main" xmlns:w14="http://schemas.microsoft.com/office/word/2010/wordml" xmlns:w15="http://schemas.microsoft.com/office/word/2012/wordml" xmlns:w16cex="http://schemas.microsoft.com/office/word/2018/wordml/cex" xmlns:w16cid="http://schemas.microsoft.com/office/word/2016/wordml/cid" xmlns:w16="http://schemas.microsoft.com/office/word/2018/wordml" xmlns:w16du="http://schemas.microsoft.com/office/word/2023/wordml/word16du" xmlns:w16sdtdh="http://schemas.microsoft.com/office/word/2020/wordml/sdtdatahash" xmlns:w16sdtfl="http://schemas.microsoft.com/office/word/2024/wordml/sdtformatlock" xmlns:w16se="http://schemas.microsoft.com/office/word/2015/wordml/symex" xmlns:wpg="http://schemas.microsoft.com/office/word/2010/wordprocessingGroup" xmlns:wpi="http://schemas.microsoft.com/office/word/2010/wordprocessingInk" xmlns:wne="http://schemas.microsoft.com/office/word/2006/wordml" xmlns:wps="http://schemas.microsoft.com/office/word/2010/wordprocessingShape" mc:Ignorable="w14 w15 w16se w16cid w16 w16cex w16sdtdh w16sdtfl w16du wp14">
+<w:ftr xmlns:w="http://schemas.openxmlformats.org/wordprocessingml/2006/main" xmlns:r="http://schemas.openxmlformats.org/officeDocument/2006/relationships" xmlns:wp="http://schemas.openxmlformats.org/drawingml/2006/wordprocessingDrawing" xmlns:a="http://schemas.openxmlformats.org/drawingml/2006/main" xmlns:c="http://schemas.openxmlformats.org/drawingml/2006/chart" xmlns:pic="http://schemas.openxmlformats.org/drawingml/2006/picture" xmlns:mc="http://schemas.openxmlformats.org/markup-compatibility/2006" xmlns:w14="http://schemas.microsoft.com/office/word/2010/wordml" xmlns:wpi="http://schemas.microsoft.com/office/word/2010/wordprocessingInk" xmlns:w15="http://schemas.microsoft.com/office/word/2012/wordml" xmlns:wp14="http://schemas.microsoft.com/office/word/2010/wordprocessingDrawing" xmlns:wps="http://schemas.microsoft.com/office/word/2010/wordprocessingShape" xmlns:wpg="http://schemas.microsoft.com/office/word/2010/wordprocessingGroup" xmlns:wpc="http://schemas.microsoft.com/office/word/2010/wordprocessingCanvas" xmlns:dgm="http://schemas.openxmlformats.org/drawingml/2006/diagram" xmlns:dsp="http://schemas.microsoft.com/office/drawing/2008/diagram" xmlns:m="http://schemas.openxmlformats.org/officeDocument/2006/math" xmlns:v="urn:schemas-microsoft-com:vml" xmlns:o="urn:schemas-microsoft-com:office:office" xmlns:w10="urn:schemas-microsoft-com:office:word" xmlns:cx="http://schemas.microsoft.com/office/drawing/2014/chartex" xmlns:cx1="http://schemas.microsoft.com/office/drawing/2015/9/8/chartex" xmlns:cx2="http://schemas.microsoft.com/office/drawing/2015/10/21/chartex" xmlns:cx3="http://schemas.microsoft.com/office/drawing/2016/5/9/chartex" xmlns:cx4="http://schemas.microsoft.com/office/drawing/2016/5/10/chartex" xmlns:cx5="http://schemas.microsoft.com/office/drawing/2016/5/11/chartex" xmlns:cx6="http://schemas.microsoft.com/office/drawing/2016/5/12/chartex" xmlns:cx7="http://schemas.microsoft.com/office/drawing/2016/5/13/chartex" xmlns:cx8="http://schemas.microsoft.com/office/drawing/2016/5/14/chartex" mc:Ignorable="w14 w15 wp14">
   <w:p>
     <w:pPr>
       <w:pBdr>
-        <w:top w:val="nil"/>
-        <w:left w:val="nil"/>
-        <w:bottom w:val="nil"/>
-        <w:right w:val="nil"/>
-        <w:between w:val="nil"/>
+        <w:top w:val="nil" w:sz="4" w:space="0" w:color="auto"/>
+        <w:left w:val="nil" w:sz="4" w:space="0" w:color="auto"/>
+        <w:bottom w:val="nil" w:sz="4" w:space="0" w:color="auto"/>
+        <w:right w:val="nil" w:sz="4" w:space="0" w:color="auto"/>
+        <w:between w:val="nil" w:sz="4" w:space="0" w:color="auto"/>
       </w:pBdr>
       <w:tabs>
         <w:tab w:val="center" w:pos="4513"/>
@@ -4043,7 +3901,7 @@
 </file>
 
 <file path=word/footnotes.xml><?xml version="1.0" encoding="utf-8"?>
-<w:footnotes xmlns:wpc="http://schemas.microsoft.com/office/word/2010/wordprocessingCanvas" xmlns:cx="http://schemas.microsoft.com/office/drawing/2014/chartex" xmlns:cx1="http://schemas.microsoft.com/office/drawing/2015/9/8/chartex" xmlns:cx2="http://schemas.microsoft.com/office/drawing/2015/10/21/chartex" xmlns:cx3="http://schemas.microsoft.com/office/drawing/2016/5/9/chartex" xmlns:cx4="http://schemas.microsoft.com/office/drawing/2016/5/10/chartex" xmlns:cx5="http://schemas.microsoft.com/office/drawing/2016/5/11/chartex" xmlns:cx6="http://schemas.microsoft.com/office/drawing/2016/5/12/chartex" xmlns:cx7="http://schemas.microsoft.com/office/drawing/2016/5/13/chartex" xmlns:cx8="http://schemas.microsoft.com/office/drawing/2016/5/14/chartex" xmlns:mc="http://schemas.openxmlformats.org/markup-compatibility/2006" xmlns:aink="http://schemas.microsoft.com/office/drawing/2016/ink" xmlns:am3d="http://schemas.microsoft.com/office/drawing/2017/model3d" xmlns:o="urn:schemas-microsoft-com:office:office" xmlns:oel="http://schemas.microsoft.com/office/2019/extlst" xmlns:r="http://schemas.openxmlformats.org/officeDocument/2006/relationships" xmlns:m="http://schemas.openxmlformats.org/officeDocument/2006/math" xmlns:v="urn:schemas-microsoft-com:vml" xmlns:wp14="http://schemas.microsoft.com/office/word/2010/wordprocessingDrawing" xmlns:wp="http://schemas.openxmlformats.org/drawingml/2006/wordprocessingDrawing" xmlns:w10="urn:schemas-microsoft-com:office:word" xmlns:w="http://schemas.openxmlformats.org/wordprocessingml/2006/main" xmlns:w14="http://schemas.microsoft.com/office/word/2010/wordml" xmlns:w15="http://schemas.microsoft.com/office/word/2012/wordml" xmlns:w16cex="http://schemas.microsoft.com/office/word/2018/wordml/cex" xmlns:w16cid="http://schemas.microsoft.com/office/word/2016/wordml/cid" xmlns:w16="http://schemas.microsoft.com/office/word/2018/wordml" xmlns:w16du="http://schemas.microsoft.com/office/word/2023/wordml/word16du" xmlns:w16sdtdh="http://schemas.microsoft.com/office/word/2020/wordml/sdtdatahash" xmlns:w16sdtfl="http://schemas.microsoft.com/office/word/2024/wordml/sdtformatlock" xmlns:w16se="http://schemas.microsoft.com/office/word/2015/wordml/symex" xmlns:wpg="http://schemas.microsoft.com/office/word/2010/wordprocessingGroup" xmlns:wpi="http://schemas.microsoft.com/office/word/2010/wordprocessingInk" xmlns:wne="http://schemas.microsoft.com/office/word/2006/wordml" xmlns:wps="http://schemas.microsoft.com/office/word/2010/wordprocessingShape" mc:Ignorable="w14 w15 w16se w16cid w16 w16cex w16sdtdh w16sdtfl w16du wp14">
+<w:footnotes xmlns:w="http://schemas.openxmlformats.org/wordprocessingml/2006/main" xmlns:r="http://schemas.openxmlformats.org/officeDocument/2006/relationships" xmlns:wp="http://schemas.openxmlformats.org/drawingml/2006/wordprocessingDrawing" xmlns:a="http://schemas.openxmlformats.org/drawingml/2006/main" xmlns:c="http://schemas.openxmlformats.org/drawingml/2006/chart" xmlns:pic="http://schemas.openxmlformats.org/drawingml/2006/picture" xmlns:mc="http://schemas.openxmlformats.org/markup-compatibility/2006" xmlns:w14="http://schemas.microsoft.com/office/word/2010/wordml" xmlns:wpi="http://schemas.microsoft.com/office/word/2010/wordprocessingInk" xmlns:w15="http://schemas.microsoft.com/office/word/2012/wordml" xmlns:wp14="http://schemas.microsoft.com/office/word/2010/wordprocessingDrawing" xmlns:wps="http://schemas.microsoft.com/office/word/2010/wordprocessingShape" xmlns:wpg="http://schemas.microsoft.com/office/word/2010/wordprocessingGroup" xmlns:wpc="http://schemas.microsoft.com/office/word/2010/wordprocessingCanvas" xmlns:dgm="http://schemas.openxmlformats.org/drawingml/2006/diagram" xmlns:dsp="http://schemas.microsoft.com/office/drawing/2008/diagram" xmlns:m="http://schemas.openxmlformats.org/officeDocument/2006/math" xmlns:v="urn:schemas-microsoft-com:vml" xmlns:o="urn:schemas-microsoft-com:office:office" xmlns:w10="urn:schemas-microsoft-com:office:word" xmlns:cx="http://schemas.microsoft.com/office/drawing/2014/chartex" xmlns:cx1="http://schemas.microsoft.com/office/drawing/2015/9/8/chartex" xmlns:cx2="http://schemas.microsoft.com/office/drawing/2015/10/21/chartex" xmlns:cx3="http://schemas.microsoft.com/office/drawing/2016/5/9/chartex" xmlns:cx4="http://schemas.microsoft.com/office/drawing/2016/5/10/chartex" xmlns:cx5="http://schemas.microsoft.com/office/drawing/2016/5/11/chartex" xmlns:cx6="http://schemas.microsoft.com/office/drawing/2016/5/12/chartex" xmlns:cx7="http://schemas.microsoft.com/office/drawing/2016/5/13/chartex" xmlns:cx8="http://schemas.microsoft.com/office/drawing/2016/5/14/chartex" mc:Ignorable="w14 w15 wp14">
   <w:footnote w:type="separator" w:id="-1">
     <w:p>
       <w:pPr>
@@ -4068,15 +3926,15 @@
 </file>
 
 <file path=word/header1.xml><?xml version="1.0" encoding="utf-8"?>
-<w:hdr xmlns:wpc="http://schemas.microsoft.com/office/word/2010/wordprocessingCanvas" xmlns:cx="http://schemas.microsoft.com/office/drawing/2014/chartex" xmlns:cx1="http://schemas.microsoft.com/office/drawing/2015/9/8/chartex" xmlns:cx2="http://schemas.microsoft.com/office/drawing/2015/10/21/chartex" xmlns:cx3="http://schemas.microsoft.com/office/drawing/2016/5/9/chartex" xmlns:cx4="http://schemas.microsoft.com/office/drawing/2016/5/10/chartex" xmlns:cx5="http://schemas.microsoft.com/office/drawing/2016/5/11/chartex" xmlns:cx6="http://schemas.microsoft.com/office/drawing/2016/5/12/chartex" xmlns:cx7="http://schemas.microsoft.com/office/drawing/2016/5/13/chartex" xmlns:cx8="http://schemas.microsoft.com/office/drawing/2016/5/14/chartex" xmlns:mc="http://schemas.openxmlformats.org/markup-compatibility/2006" xmlns:aink="http://schemas.microsoft.com/office/drawing/2016/ink" xmlns:am3d="http://schemas.microsoft.com/office/drawing/2017/model3d" xmlns:o="urn:schemas-microsoft-com:office:office" xmlns:oel="http://schemas.microsoft.com/office/2019/extlst" xmlns:r="http://schemas.openxmlformats.org/officeDocument/2006/relationships" xmlns:m="http://schemas.openxmlformats.org/officeDocument/2006/math" xmlns:v="urn:schemas-microsoft-com:vml" xmlns:wp14="http://schemas.microsoft.com/office/word/2010/wordprocessingDrawing" xmlns:wp="http://schemas.openxmlformats.org/drawingml/2006/wordprocessingDrawing" xmlns:w10="urn:schemas-microsoft-com:office:word" xmlns:w="http://schemas.openxmlformats.org/wordprocessingml/2006/main" xmlns:w14="http://schemas.microsoft.com/office/word/2010/wordml" xmlns:w15="http://schemas.microsoft.com/office/word/2012/wordml" xmlns:w16cex="http://schemas.microsoft.com/office/word/2018/wordml/cex" xmlns:w16cid="http://schemas.microsoft.com/office/word/2016/wordml/cid" xmlns:w16="http://schemas.microsoft.com/office/word/2018/wordml" xmlns:w16du="http://schemas.microsoft.com/office/word/2023/wordml/word16du" xmlns:w16sdtdh="http://schemas.microsoft.com/office/word/2020/wordml/sdtdatahash" xmlns:w16sdtfl="http://schemas.microsoft.com/office/word/2024/wordml/sdtformatlock" xmlns:w16se="http://schemas.microsoft.com/office/word/2015/wordml/symex" xmlns:wpg="http://schemas.microsoft.com/office/word/2010/wordprocessingGroup" xmlns:wpi="http://schemas.microsoft.com/office/word/2010/wordprocessingInk" xmlns:wne="http://schemas.microsoft.com/office/word/2006/wordml" xmlns:wps="http://schemas.microsoft.com/office/word/2010/wordprocessingShape" mc:Ignorable="w14 w15 w16se w16cid w16 w16cex w16sdtdh w16sdtfl w16du wp14">
+<w:hdr xmlns:w="http://schemas.openxmlformats.org/wordprocessingml/2006/main" xmlns:r="http://schemas.openxmlformats.org/officeDocument/2006/relationships" xmlns:wp="http://schemas.openxmlformats.org/drawingml/2006/wordprocessingDrawing" xmlns:a="http://schemas.openxmlformats.org/drawingml/2006/main" xmlns:c="http://schemas.openxmlformats.org/drawingml/2006/chart" xmlns:pic="http://schemas.openxmlformats.org/drawingml/2006/picture" xmlns:mc="http://schemas.openxmlformats.org/markup-compatibility/2006" xmlns:w14="http://schemas.microsoft.com/office/word/2010/wordml" xmlns:wpi="http://schemas.microsoft.com/office/word/2010/wordprocessingInk" xmlns:w15="http://schemas.microsoft.com/office/word/2012/wordml" xmlns:wp14="http://schemas.microsoft.com/office/word/2010/wordprocessingDrawing" xmlns:wps="http://schemas.microsoft.com/office/word/2010/wordprocessingShape" xmlns:wpg="http://schemas.microsoft.com/office/word/2010/wordprocessingGroup" xmlns:wpc="http://schemas.microsoft.com/office/word/2010/wordprocessingCanvas" xmlns:dgm="http://schemas.openxmlformats.org/drawingml/2006/diagram" xmlns:dsp="http://schemas.microsoft.com/office/drawing/2008/diagram" xmlns:m="http://schemas.openxmlformats.org/officeDocument/2006/math" xmlns:v="urn:schemas-microsoft-com:vml" xmlns:o="urn:schemas-microsoft-com:office:office" xmlns:w10="urn:schemas-microsoft-com:office:word" xmlns:cx="http://schemas.microsoft.com/office/drawing/2014/chartex" xmlns:cx1="http://schemas.microsoft.com/office/drawing/2015/9/8/chartex" xmlns:cx2="http://schemas.microsoft.com/office/drawing/2015/10/21/chartex" xmlns:cx3="http://schemas.microsoft.com/office/drawing/2016/5/9/chartex" xmlns:cx4="http://schemas.microsoft.com/office/drawing/2016/5/10/chartex" xmlns:cx5="http://schemas.microsoft.com/office/drawing/2016/5/11/chartex" xmlns:cx6="http://schemas.microsoft.com/office/drawing/2016/5/12/chartex" xmlns:cx7="http://schemas.microsoft.com/office/drawing/2016/5/13/chartex" xmlns:cx8="http://schemas.microsoft.com/office/drawing/2016/5/14/chartex" mc:Ignorable="w14 w15 wp14">
   <w:p>
     <w:pPr>
       <w:pBdr>
-        <w:top w:val="nil"/>
-        <w:left w:val="nil"/>
-        <w:bottom w:val="nil"/>
-        <w:right w:val="nil"/>
-        <w:between w:val="nil"/>
+        <w:top w:val="nil" w:sz="4" w:space="0" w:color="auto"/>
+        <w:left w:val="nil" w:sz="4" w:space="0" w:color="auto"/>
+        <w:bottom w:val="nil" w:sz="4" w:space="0" w:color="auto"/>
+        <w:right w:val="nil" w:sz="4" w:space="0" w:color="auto"/>
+        <w:between w:val="nil" w:sz="4" w:space="0" w:color="auto"/>
       </w:pBdr>
       <w:tabs>
         <w:tab w:val="center" w:pos="4513"/>
@@ -4092,15 +3950,15 @@
 </file>
 
 <file path=word/header2.xml><?xml version="1.0" encoding="utf-8"?>
-<w:hdr xmlns:wpc="http://schemas.microsoft.com/office/word/2010/wordprocessingCanvas" xmlns:cx="http://schemas.microsoft.com/office/drawing/2014/chartex" xmlns:cx1="http://schemas.microsoft.com/office/drawing/2015/9/8/chartex" xmlns:cx2="http://schemas.microsoft.com/office/drawing/2015/10/21/chartex" xmlns:cx3="http://schemas.microsoft.com/office/drawing/2016/5/9/chartex" xmlns:cx4="http://schemas.microsoft.com/office/drawing/2016/5/10/chartex" xmlns:cx5="http://schemas.microsoft.com/office/drawing/2016/5/11/chartex" xmlns:cx6="http://schemas.microsoft.com/office/drawing/2016/5/12/chartex" xmlns:cx7="http://schemas.microsoft.com/office/drawing/2016/5/13/chartex" xmlns:cx8="http://schemas.microsoft.com/office/drawing/2016/5/14/chartex" xmlns:mc="http://schemas.openxmlformats.org/markup-compatibility/2006" xmlns:aink="http://schemas.microsoft.com/office/drawing/2016/ink" xmlns:am3d="http://schemas.microsoft.com/office/drawing/2017/model3d" xmlns:o="urn:schemas-microsoft-com:office:office" xmlns:oel="http://schemas.microsoft.com/office/2019/extlst" xmlns:r="http://schemas.openxmlformats.org/officeDocument/2006/relationships" xmlns:m="http://schemas.openxmlformats.org/officeDocument/2006/math" xmlns:v="urn:schemas-microsoft-com:vml" xmlns:wp14="http://schemas.microsoft.com/office/word/2010/wordprocessingDrawing" xmlns:wp="http://schemas.openxmlformats.org/drawingml/2006/wordprocessingDrawing" xmlns:w10="urn:schemas-microsoft-com:office:word" xmlns:w="http://schemas.openxmlformats.org/wordprocessingml/2006/main" xmlns:w14="http://schemas.microsoft.com/office/word/2010/wordml" xmlns:w15="http://schemas.microsoft.com/office/word/2012/wordml" xmlns:w16cex="http://schemas.microsoft.com/office/word/2018/wordml/cex" xmlns:w16cid="http://schemas.microsoft.com/office/word/2016/wordml/cid" xmlns:w16="http://schemas.microsoft.com/office/word/2018/wordml" xmlns:w16du="http://schemas.microsoft.com/office/word/2023/wordml/word16du" xmlns:w16sdtdh="http://schemas.microsoft.com/office/word/2020/wordml/sdtdatahash" xmlns:w16sdtfl="http://schemas.microsoft.com/office/word/2024/wordml/sdtformatlock" xmlns:w16se="http://schemas.microsoft.com/office/word/2015/wordml/symex" xmlns:wpg="http://schemas.microsoft.com/office/word/2010/wordprocessingGroup" xmlns:wpi="http://schemas.microsoft.com/office/word/2010/wordprocessingInk" xmlns:wne="http://schemas.microsoft.com/office/word/2006/wordml" xmlns:wps="http://schemas.microsoft.com/office/word/2010/wordprocessingShape" mc:Ignorable="w14 w15 w16se w16cid w16 w16cex w16sdtdh w16sdtfl w16du wp14">
+<w:hdr xmlns:w="http://schemas.openxmlformats.org/wordprocessingml/2006/main" xmlns:r="http://schemas.openxmlformats.org/officeDocument/2006/relationships" xmlns:wp="http://schemas.openxmlformats.org/drawingml/2006/wordprocessingDrawing" xmlns:a="http://schemas.openxmlformats.org/drawingml/2006/main" xmlns:c="http://schemas.openxmlformats.org/drawingml/2006/chart" xmlns:pic="http://schemas.openxmlformats.org/drawingml/2006/picture" xmlns:mc="http://schemas.openxmlformats.org/markup-compatibility/2006" xmlns:w14="http://schemas.microsoft.com/office/word/2010/wordml" xmlns:wpi="http://schemas.microsoft.com/office/word/2010/wordprocessingInk" xmlns:w15="http://schemas.microsoft.com/office/word/2012/wordml" xmlns:wp14="http://schemas.microsoft.com/office/word/2010/wordprocessingDrawing" xmlns:wps="http://schemas.microsoft.com/office/word/2010/wordprocessingShape" xmlns:wpg="http://schemas.microsoft.com/office/word/2010/wordprocessingGroup" xmlns:wpc="http://schemas.microsoft.com/office/word/2010/wordprocessingCanvas" xmlns:dgm="http://schemas.openxmlformats.org/drawingml/2006/diagram" xmlns:dsp="http://schemas.microsoft.com/office/drawing/2008/diagram" xmlns:m="http://schemas.openxmlformats.org/officeDocument/2006/math" xmlns:v="urn:schemas-microsoft-com:vml" xmlns:o="urn:schemas-microsoft-com:office:office" xmlns:w10="urn:schemas-microsoft-com:office:word" xmlns:cx="http://schemas.microsoft.com/office/drawing/2014/chartex" xmlns:cx1="http://schemas.microsoft.com/office/drawing/2015/9/8/chartex" xmlns:cx2="http://schemas.microsoft.com/office/drawing/2015/10/21/chartex" xmlns:cx3="http://schemas.microsoft.com/office/drawing/2016/5/9/chartex" xmlns:cx4="http://schemas.microsoft.com/office/drawing/2016/5/10/chartex" xmlns:cx5="http://schemas.microsoft.com/office/drawing/2016/5/11/chartex" xmlns:cx6="http://schemas.microsoft.com/office/drawing/2016/5/12/chartex" xmlns:cx7="http://schemas.microsoft.com/office/drawing/2016/5/13/chartex" xmlns:cx8="http://schemas.microsoft.com/office/drawing/2016/5/14/chartex" mc:Ignorable="w14 w15 wp14">
   <w:p>
     <w:pPr>
       <w:pBdr>
-        <w:top w:val="nil"/>
-        <w:left w:val="nil"/>
-        <w:bottom w:val="nil"/>
-        <w:right w:val="nil"/>
-        <w:between w:val="nil"/>
+        <w:top w:val="nil" w:sz="4" w:space="0" w:color="auto"/>
+        <w:left w:val="nil" w:sz="4" w:space="0" w:color="auto"/>
+        <w:bottom w:val="nil" w:sz="4" w:space="0" w:color="auto"/>
+        <w:right w:val="nil" w:sz="4" w:space="0" w:color="auto"/>
+        <w:between w:val="nil" w:sz="4" w:space="0" w:color="auto"/>
       </w:pBdr>
       <w:tabs>
         <w:tab w:val="center" w:pos="4513"/>
@@ -4116,8 +3974,8 @@
 </file>
 
 <file path=word/numbering.xml><?xml version="1.0" encoding="utf-8"?>
-<w:numbering xmlns:wpc="http://schemas.microsoft.com/office/word/2010/wordprocessingCanvas" xmlns:cx="http://schemas.microsoft.com/office/drawing/2014/chartex" xmlns:cx1="http://schemas.microsoft.com/office/drawing/2015/9/8/chartex" xmlns:cx2="http://schemas.microsoft.com/office/drawing/2015/10/21/chartex" xmlns:cx3="http://schemas.microsoft.com/office/drawing/2016/5/9/chartex" xmlns:cx4="http://schemas.microsoft.com/office/drawing/2016/5/10/chartex" xmlns:cx5="http://schemas.microsoft.com/office/drawing/2016/5/11/chartex" xmlns:cx6="http://schemas.microsoft.com/office/drawing/2016/5/12/chartex" xmlns:cx7="http://schemas.microsoft.com/office/drawing/2016/5/13/chartex" xmlns:cx8="http://schemas.microsoft.com/office/drawing/2016/5/14/chartex" xmlns:mc="http://schemas.openxmlformats.org/markup-compatibility/2006" xmlns:aink="http://schemas.microsoft.com/office/drawing/2016/ink" xmlns:am3d="http://schemas.microsoft.com/office/drawing/2017/model3d" xmlns:o="urn:schemas-microsoft-com:office:office" xmlns:oel="http://schemas.microsoft.com/office/2019/extlst" xmlns:r="http://schemas.openxmlformats.org/officeDocument/2006/relationships" xmlns:m="http://schemas.openxmlformats.org/officeDocument/2006/math" xmlns:v="urn:schemas-microsoft-com:vml" xmlns:wp14="http://schemas.microsoft.com/office/word/2010/wordprocessingDrawing" xmlns:wp="http://schemas.openxmlformats.org/drawingml/2006/wordprocessingDrawing" xmlns:w10="urn:schemas-microsoft-com:office:word" xmlns:w="http://schemas.openxmlformats.org/wordprocessingml/2006/main" xmlns:w14="http://schemas.microsoft.com/office/word/2010/wordml" xmlns:w15="http://schemas.microsoft.com/office/word/2012/wordml" xmlns:w16cex="http://schemas.microsoft.com/office/word/2018/wordml/cex" xmlns:w16cid="http://schemas.microsoft.com/office/word/2016/wordml/cid" xmlns:w16="http://schemas.microsoft.com/office/word/2018/wordml" xmlns:w16du="http://schemas.microsoft.com/office/word/2023/wordml/word16du" xmlns:w16sdtdh="http://schemas.microsoft.com/office/word/2020/wordml/sdtdatahash" xmlns:w16sdtfl="http://schemas.microsoft.com/office/word/2024/wordml/sdtformatlock" xmlns:w16se="http://schemas.microsoft.com/office/word/2015/wordml/symex" xmlns:wpg="http://schemas.microsoft.com/office/word/2010/wordprocessingGroup" xmlns:wpi="http://schemas.microsoft.com/office/word/2010/wordprocessingInk" xmlns:wne="http://schemas.microsoft.com/office/word/2006/wordml" xmlns:wps="http://schemas.microsoft.com/office/word/2010/wordprocessingShape" mc:Ignorable="w14 w15 w16se w16cid w16 w16cex w16sdtdh w16sdtfl w16du wp14">
-  <w:abstractNum w:abstractNumId="0" w15:restartNumberingAfterBreak="0">
+<w:numbering xmlns:w="http://schemas.openxmlformats.org/wordprocessingml/2006/main" xmlns:r="http://schemas.openxmlformats.org/officeDocument/2006/relationships" xmlns:wp="http://schemas.openxmlformats.org/drawingml/2006/wordprocessingDrawing" xmlns:a="http://schemas.openxmlformats.org/drawingml/2006/main" xmlns:c="http://schemas.openxmlformats.org/drawingml/2006/chart" xmlns:pic="http://schemas.openxmlformats.org/drawingml/2006/picture" xmlns:mc="http://schemas.openxmlformats.org/markup-compatibility/2006" xmlns:w14="http://schemas.microsoft.com/office/word/2010/wordml" xmlns:wpi="http://schemas.microsoft.com/office/word/2010/wordprocessingInk" xmlns:w15="http://schemas.microsoft.com/office/word/2012/wordml" xmlns:wp14="http://schemas.microsoft.com/office/word/2010/wordprocessingDrawing" xmlns:wps="http://schemas.microsoft.com/office/word/2010/wordprocessingShape" xmlns:wpg="http://schemas.microsoft.com/office/word/2010/wordprocessingGroup" xmlns:wpc="http://schemas.microsoft.com/office/word/2010/wordprocessingCanvas" xmlns:dgm="http://schemas.openxmlformats.org/drawingml/2006/diagram" xmlns:dsp="http://schemas.microsoft.com/office/drawing/2008/diagram" xmlns:m="http://schemas.openxmlformats.org/officeDocument/2006/math" xmlns:v="urn:schemas-microsoft-com:vml" xmlns:o="urn:schemas-microsoft-com:office:office" xmlns:w10="urn:schemas-microsoft-com:office:word" xmlns:cx="http://schemas.microsoft.com/office/drawing/2014/chartex" xmlns:cx1="http://schemas.microsoft.com/office/drawing/2015/9/8/chartex" xmlns:cx2="http://schemas.microsoft.com/office/drawing/2015/10/21/chartex" xmlns:cx3="http://schemas.microsoft.com/office/drawing/2016/5/9/chartex" xmlns:cx4="http://schemas.microsoft.com/office/drawing/2016/5/10/chartex" xmlns:cx5="http://schemas.microsoft.com/office/drawing/2016/5/11/chartex" xmlns:cx6="http://schemas.microsoft.com/office/drawing/2016/5/12/chartex" xmlns:cx7="http://schemas.microsoft.com/office/drawing/2016/5/13/chartex" xmlns:cx8="http://schemas.microsoft.com/office/drawing/2016/5/14/chartex" mc:Ignorable="w14 w15 wp14">
+  <w:abstractNum w:abstractNumId="0">
     <w:nsid w:val="041248A1"/>
     <w:multiLevelType w:val="multilevel"/>
     <w:tmpl w:val="FE548F62"/>
@@ -4130,7 +3988,7 @@
         <w:ind w:left="720" w:hanging="360"/>
       </w:pPr>
       <w:rPr>
-        <w:rFonts w:ascii="Noto Sans Symbols" w:eastAsia="Noto Sans Symbols" w:hAnsi="Noto Sans Symbols" w:cs="Noto Sans Symbols"/>
+        <w:rFonts w:ascii="Noto Sans Symbols" w:hAnsi="Noto Sans Symbols" w:eastAsia="Noto Sans Symbols" w:cs="Noto Sans Symbols"/>
       </w:rPr>
     </w:lvl>
     <w:lvl w:ilvl="1">
@@ -4142,7 +4000,7 @@
         <w:ind w:left="1440" w:hanging="360"/>
       </w:pPr>
       <w:rPr>
-        <w:rFonts w:ascii="Courier New" w:eastAsia="Courier New" w:hAnsi="Courier New" w:cs="Courier New"/>
+        <w:rFonts w:ascii="Courier New" w:hAnsi="Courier New" w:eastAsia="Courier New" w:cs="Courier New"/>
       </w:rPr>
     </w:lvl>
     <w:lvl w:ilvl="2">
@@ -4154,7 +4012,7 @@
         <w:ind w:left="2160" w:hanging="360"/>
       </w:pPr>
       <w:rPr>
-        <w:rFonts w:ascii="Noto Sans Symbols" w:eastAsia="Noto Sans Symbols" w:hAnsi="Noto Sans Symbols" w:cs="Noto Sans Symbols"/>
+        <w:rFonts w:ascii="Noto Sans Symbols" w:hAnsi="Noto Sans Symbols" w:eastAsia="Noto Sans Symbols" w:cs="Noto Sans Symbols"/>
       </w:rPr>
     </w:lvl>
     <w:lvl w:ilvl="3">
@@ -4166,7 +4024,7 @@
         <w:ind w:left="2880" w:hanging="360"/>
       </w:pPr>
       <w:rPr>
-        <w:rFonts w:ascii="Noto Sans Symbols" w:eastAsia="Noto Sans Symbols" w:hAnsi="Noto Sans Symbols" w:cs="Noto Sans Symbols"/>
+        <w:rFonts w:ascii="Noto Sans Symbols" w:hAnsi="Noto Sans Symbols" w:eastAsia="Noto Sans Symbols" w:cs="Noto Sans Symbols"/>
       </w:rPr>
     </w:lvl>
     <w:lvl w:ilvl="4">
@@ -4178,7 +4036,7 @@
         <w:ind w:left="3600" w:hanging="360"/>
       </w:pPr>
       <w:rPr>
-        <w:rFonts w:ascii="Courier New" w:eastAsia="Courier New" w:hAnsi="Courier New" w:cs="Courier New"/>
+        <w:rFonts w:ascii="Courier New" w:hAnsi="Courier New" w:eastAsia="Courier New" w:cs="Courier New"/>
       </w:rPr>
     </w:lvl>
     <w:lvl w:ilvl="5">
@@ -4190,7 +4048,7 @@
         <w:ind w:left="4320" w:hanging="360"/>
       </w:pPr>
       <w:rPr>
-        <w:rFonts w:ascii="Noto Sans Symbols" w:eastAsia="Noto Sans Symbols" w:hAnsi="Noto Sans Symbols" w:cs="Noto Sans Symbols"/>
+        <w:rFonts w:ascii="Noto Sans Symbols" w:hAnsi="Noto Sans Symbols" w:eastAsia="Noto Sans Symbols" w:cs="Noto Sans Symbols"/>
       </w:rPr>
     </w:lvl>
     <w:lvl w:ilvl="6">
@@ -4202,7 +4060,7 @@
         <w:ind w:left="5040" w:hanging="360"/>
       </w:pPr>
       <w:rPr>
-        <w:rFonts w:ascii="Noto Sans Symbols" w:eastAsia="Noto Sans Symbols" w:hAnsi="Noto Sans Symbols" w:cs="Noto Sans Symbols"/>
+        <w:rFonts w:ascii="Noto Sans Symbols" w:hAnsi="Noto Sans Symbols" w:eastAsia="Noto Sans Symbols" w:cs="Noto Sans Symbols"/>
       </w:rPr>
     </w:lvl>
     <w:lvl w:ilvl="7">
@@ -4214,7 +4072,7 @@
         <w:ind w:left="5760" w:hanging="360"/>
       </w:pPr>
       <w:rPr>
-        <w:rFonts w:ascii="Courier New" w:eastAsia="Courier New" w:hAnsi="Courier New" w:cs="Courier New"/>
+        <w:rFonts w:ascii="Courier New" w:hAnsi="Courier New" w:eastAsia="Courier New" w:cs="Courier New"/>
       </w:rPr>
     </w:lvl>
     <w:lvl w:ilvl="8">
@@ -4226,11 +4084,11 @@
         <w:ind w:left="6480" w:hanging="360"/>
       </w:pPr>
       <w:rPr>
-        <w:rFonts w:ascii="Noto Sans Symbols" w:eastAsia="Noto Sans Symbols" w:hAnsi="Noto Sans Symbols" w:cs="Noto Sans Symbols"/>
+        <w:rFonts w:ascii="Noto Sans Symbols" w:hAnsi="Noto Sans Symbols" w:eastAsia="Noto Sans Symbols" w:cs="Noto Sans Symbols"/>
       </w:rPr>
     </w:lvl>
   </w:abstractNum>
-  <w:abstractNum w:abstractNumId="1" w15:restartNumberingAfterBreak="0">
+  <w:abstractNum w:abstractNumId="1">
     <w:nsid w:val="162C4BB0"/>
     <w:multiLevelType w:val="multilevel"/>
     <w:tmpl w:val="B3CE527A"/>
@@ -4243,7 +4101,7 @@
         <w:ind w:left="720" w:hanging="360"/>
       </w:pPr>
       <w:rPr>
-        <w:rFonts w:ascii="Noto Sans Symbols" w:eastAsia="Noto Sans Symbols" w:hAnsi="Noto Sans Symbols" w:cs="Noto Sans Symbols"/>
+        <w:rFonts w:ascii="Noto Sans Symbols" w:hAnsi="Noto Sans Symbols" w:eastAsia="Noto Sans Symbols" w:cs="Noto Sans Symbols"/>
       </w:rPr>
     </w:lvl>
     <w:lvl w:ilvl="1">
@@ -4255,7 +4113,7 @@
         <w:ind w:left="1440" w:hanging="360"/>
       </w:pPr>
       <w:rPr>
-        <w:rFonts w:ascii="Courier New" w:eastAsia="Courier New" w:hAnsi="Courier New" w:cs="Courier New"/>
+        <w:rFonts w:ascii="Courier New" w:hAnsi="Courier New" w:eastAsia="Courier New" w:cs="Courier New"/>
       </w:rPr>
     </w:lvl>
     <w:lvl w:ilvl="2">
@@ -4267,7 +4125,7 @@
         <w:ind w:left="2160" w:hanging="360"/>
       </w:pPr>
       <w:rPr>
-        <w:rFonts w:ascii="Noto Sans Symbols" w:eastAsia="Noto Sans Symbols" w:hAnsi="Noto Sans Symbols" w:cs="Noto Sans Symbols"/>
+        <w:rFonts w:ascii="Noto Sans Symbols" w:hAnsi="Noto Sans Symbols" w:eastAsia="Noto Sans Symbols" w:cs="Noto Sans Symbols"/>
       </w:rPr>
     </w:lvl>
     <w:lvl w:ilvl="3">
@@ -4279,7 +4137,7 @@
         <w:ind w:left="2880" w:hanging="360"/>
       </w:pPr>
       <w:rPr>
-        <w:rFonts w:ascii="Noto Sans Symbols" w:eastAsia="Noto Sans Symbols" w:hAnsi="Noto Sans Symbols" w:cs="Noto Sans Symbols"/>
+        <w:rFonts w:ascii="Noto Sans Symbols" w:hAnsi="Noto Sans Symbols" w:eastAsia="Noto Sans Symbols" w:cs="Noto Sans Symbols"/>
       </w:rPr>
     </w:lvl>
     <w:lvl w:ilvl="4">
@@ -4291,7 +4149,7 @@
         <w:ind w:left="3600" w:hanging="360"/>
       </w:pPr>
       <w:rPr>
-        <w:rFonts w:ascii="Courier New" w:eastAsia="Courier New" w:hAnsi="Courier New" w:cs="Courier New"/>
+        <w:rFonts w:ascii="Courier New" w:hAnsi="Courier New" w:eastAsia="Courier New" w:cs="Courier New"/>
       </w:rPr>
     </w:lvl>
     <w:lvl w:ilvl="5">
@@ -4303,7 +4161,7 @@
         <w:ind w:left="4320" w:hanging="360"/>
       </w:pPr>
       <w:rPr>
-        <w:rFonts w:ascii="Noto Sans Symbols" w:eastAsia="Noto Sans Symbols" w:hAnsi="Noto Sans Symbols" w:cs="Noto Sans Symbols"/>
+        <w:rFonts w:ascii="Noto Sans Symbols" w:hAnsi="Noto Sans Symbols" w:eastAsia="Noto Sans Symbols" w:cs="Noto Sans Symbols"/>
       </w:rPr>
     </w:lvl>
     <w:lvl w:ilvl="6">
@@ -4315,7 +4173,7 @@
         <w:ind w:left="5040" w:hanging="360"/>
       </w:pPr>
       <w:rPr>
-        <w:rFonts w:ascii="Noto Sans Symbols" w:eastAsia="Noto Sans Symbols" w:hAnsi="Noto Sans Symbols" w:cs="Noto Sans Symbols"/>
+        <w:rFonts w:ascii="Noto Sans Symbols" w:hAnsi="Noto Sans Symbols" w:eastAsia="Noto Sans Symbols" w:cs="Noto Sans Symbols"/>
       </w:rPr>
     </w:lvl>
     <w:lvl w:ilvl="7">
@@ -4327,7 +4185,7 @@
         <w:ind w:left="5760" w:hanging="360"/>
       </w:pPr>
       <w:rPr>
-        <w:rFonts w:ascii="Courier New" w:eastAsia="Courier New" w:hAnsi="Courier New" w:cs="Courier New"/>
+        <w:rFonts w:ascii="Courier New" w:hAnsi="Courier New" w:eastAsia="Courier New" w:cs="Courier New"/>
       </w:rPr>
     </w:lvl>
     <w:lvl w:ilvl="8">
@@ -4339,15 +4197,15 @@
         <w:ind w:left="6480" w:hanging="360"/>
       </w:pPr>
       <w:rPr>
-        <w:rFonts w:ascii="Noto Sans Symbols" w:eastAsia="Noto Sans Symbols" w:hAnsi="Noto Sans Symbols" w:cs="Noto Sans Symbols"/>
+        <w:rFonts w:ascii="Noto Sans Symbols" w:hAnsi="Noto Sans Symbols" w:eastAsia="Noto Sans Symbols" w:cs="Noto Sans Symbols"/>
       </w:rPr>
     </w:lvl>
   </w:abstractNum>
-  <w:abstractNum w:abstractNumId="2" w15:restartNumberingAfterBreak="0">
+  <w:abstractNum w:abstractNumId="2">
     <w:nsid w:val="1F9A20AA"/>
     <w:multiLevelType w:val="hybridMultilevel"/>
     <w:tmpl w:val="FF52A92E"/>
-    <w:lvl w:ilvl="0" w:tplc="FD1263CC">
+    <w:lvl w:ilvl="0">
       <w:start w:val="1"/>
       <w:numFmt w:val="lowerLetter"/>
       <w:lvlText w:val="%1)"/>
@@ -4355,11 +4213,8 @@
       <w:pPr>
         <w:ind w:left="1069" w:hanging="360"/>
       </w:pPr>
-      <w:rPr>
-        <w:rFonts w:hint="default"/>
-      </w:rPr>
-    </w:lvl>
-    <w:lvl w:ilvl="1" w:tplc="18090019" w:tentative="1">
+    </w:lvl>
+    <w:lvl w:ilvl="1">
       <w:start w:val="1"/>
       <w:numFmt w:val="lowerLetter"/>
       <w:lvlText w:val="%2."/>
@@ -4368,7 +4223,7 @@
         <w:ind w:left="1789" w:hanging="360"/>
       </w:pPr>
     </w:lvl>
-    <w:lvl w:ilvl="2" w:tplc="1809001B" w:tentative="1">
+    <w:lvl w:ilvl="2">
       <w:start w:val="1"/>
       <w:numFmt w:val="lowerRoman"/>
       <w:lvlText w:val="%3."/>
@@ -4377,7 +4232,7 @@
         <w:ind w:left="2509" w:hanging="180"/>
       </w:pPr>
     </w:lvl>
-    <w:lvl w:ilvl="3" w:tplc="1809000F" w:tentative="1">
+    <w:lvl w:ilvl="3">
       <w:start w:val="1"/>
       <w:numFmt w:val="decimal"/>
       <w:lvlText w:val="%4."/>
@@ -4386,7 +4241,7 @@
         <w:ind w:left="3229" w:hanging="360"/>
       </w:pPr>
     </w:lvl>
-    <w:lvl w:ilvl="4" w:tplc="18090019" w:tentative="1">
+    <w:lvl w:ilvl="4">
       <w:start w:val="1"/>
       <w:numFmt w:val="lowerLetter"/>
       <w:lvlText w:val="%5."/>
@@ -4395,7 +4250,7 @@
         <w:ind w:left="3949" w:hanging="360"/>
       </w:pPr>
     </w:lvl>
-    <w:lvl w:ilvl="5" w:tplc="1809001B" w:tentative="1">
+    <w:lvl w:ilvl="5">
       <w:start w:val="1"/>
       <w:numFmt w:val="lowerRoman"/>
       <w:lvlText w:val="%6."/>
@@ -4404,7 +4259,7 @@
         <w:ind w:left="4669" w:hanging="180"/>
       </w:pPr>
     </w:lvl>
-    <w:lvl w:ilvl="6" w:tplc="1809000F" w:tentative="1">
+    <w:lvl w:ilvl="6">
       <w:start w:val="1"/>
       <w:numFmt w:val="decimal"/>
       <w:lvlText w:val="%7."/>
@@ -4413,7 +4268,7 @@
         <w:ind w:left="5389" w:hanging="360"/>
       </w:pPr>
     </w:lvl>
-    <w:lvl w:ilvl="7" w:tplc="18090019" w:tentative="1">
+    <w:lvl w:ilvl="7">
       <w:start w:val="1"/>
       <w:numFmt w:val="lowerLetter"/>
       <w:lvlText w:val="%8."/>
@@ -4422,7 +4277,7 @@
         <w:ind w:left="6109" w:hanging="360"/>
       </w:pPr>
     </w:lvl>
-    <w:lvl w:ilvl="8" w:tplc="1809001B" w:tentative="1">
+    <w:lvl w:ilvl="8">
       <w:start w:val="1"/>
       <w:numFmt w:val="lowerRoman"/>
       <w:lvlText w:val="%9."/>
@@ -4432,7 +4287,7 @@
       </w:pPr>
     </w:lvl>
   </w:abstractNum>
-  <w:abstractNum w:abstractNumId="3" w15:restartNumberingAfterBreak="0">
+  <w:abstractNum w:abstractNumId="3">
     <w:nsid w:val="207A2573"/>
     <w:multiLevelType w:val="multilevel"/>
     <w:tmpl w:val="BD760A94"/>
@@ -4445,7 +4300,7 @@
         <w:ind w:left="1800" w:hanging="360"/>
       </w:pPr>
       <w:rPr>
-        <w:rFonts w:ascii="Calibri" w:eastAsia="Calibri" w:hAnsi="Calibri" w:cs="Calibri"/>
+        <w:rFonts w:ascii="Calibri" w:hAnsi="Calibri" w:eastAsia="Calibri" w:cs="Calibri"/>
       </w:rPr>
     </w:lvl>
     <w:lvl w:ilvl="1">
@@ -4457,7 +4312,7 @@
         <w:ind w:left="2160" w:hanging="360"/>
       </w:pPr>
       <w:rPr>
-        <w:rFonts w:ascii="Courier New" w:eastAsia="Courier New" w:hAnsi="Courier New" w:cs="Courier New"/>
+        <w:rFonts w:ascii="Courier New" w:hAnsi="Courier New" w:eastAsia="Courier New" w:cs="Courier New"/>
       </w:rPr>
     </w:lvl>
     <w:lvl w:ilvl="2">
@@ -4469,7 +4324,7 @@
         <w:ind w:left="2880" w:hanging="360"/>
       </w:pPr>
       <w:rPr>
-        <w:rFonts w:ascii="Noto Sans Symbols" w:eastAsia="Noto Sans Symbols" w:hAnsi="Noto Sans Symbols" w:cs="Noto Sans Symbols"/>
+        <w:rFonts w:ascii="Noto Sans Symbols" w:hAnsi="Noto Sans Symbols" w:eastAsia="Noto Sans Symbols" w:cs="Noto Sans Symbols"/>
       </w:rPr>
     </w:lvl>
     <w:lvl w:ilvl="3">
@@ -4481,7 +4336,7 @@
         <w:ind w:left="3600" w:hanging="360"/>
       </w:pPr>
       <w:rPr>
-        <w:rFonts w:ascii="Noto Sans Symbols" w:eastAsia="Noto Sans Symbols" w:hAnsi="Noto Sans Symbols" w:cs="Noto Sans Symbols"/>
+        <w:rFonts w:ascii="Noto Sans Symbols" w:hAnsi="Noto Sans Symbols" w:eastAsia="Noto Sans Symbols" w:cs="Noto Sans Symbols"/>
       </w:rPr>
     </w:lvl>
     <w:lvl w:ilvl="4">
@@ -4493,7 +4348,7 @@
         <w:ind w:left="4320" w:hanging="360"/>
       </w:pPr>
       <w:rPr>
-        <w:rFonts w:ascii="Courier New" w:eastAsia="Courier New" w:hAnsi="Courier New" w:cs="Courier New"/>
+        <w:rFonts w:ascii="Courier New" w:hAnsi="Courier New" w:eastAsia="Courier New" w:cs="Courier New"/>
       </w:rPr>
     </w:lvl>
     <w:lvl w:ilvl="5">
@@ -4505,7 +4360,7 @@
         <w:ind w:left="5040" w:hanging="360"/>
       </w:pPr>
       <w:rPr>
-        <w:rFonts w:ascii="Noto Sans Symbols" w:eastAsia="Noto Sans Symbols" w:hAnsi="Noto Sans Symbols" w:cs="Noto Sans Symbols"/>
+        <w:rFonts w:ascii="Noto Sans Symbols" w:hAnsi="Noto Sans Symbols" w:eastAsia="Noto Sans Symbols" w:cs="Noto Sans Symbols"/>
       </w:rPr>
     </w:lvl>
     <w:lvl w:ilvl="6">
@@ -4517,7 +4372,7 @@
         <w:ind w:left="5760" w:hanging="360"/>
       </w:pPr>
       <w:rPr>
-        <w:rFonts w:ascii="Noto Sans Symbols" w:eastAsia="Noto Sans Symbols" w:hAnsi="Noto Sans Symbols" w:cs="Noto Sans Symbols"/>
+        <w:rFonts w:ascii="Noto Sans Symbols" w:hAnsi="Noto Sans Symbols" w:eastAsia="Noto Sans Symbols" w:cs="Noto Sans Symbols"/>
       </w:rPr>
     </w:lvl>
     <w:lvl w:ilvl="7">
@@ -4529,7 +4384,7 @@
         <w:ind w:left="6480" w:hanging="360"/>
       </w:pPr>
       <w:rPr>
-        <w:rFonts w:ascii="Courier New" w:eastAsia="Courier New" w:hAnsi="Courier New" w:cs="Courier New"/>
+        <w:rFonts w:ascii="Courier New" w:hAnsi="Courier New" w:eastAsia="Courier New" w:cs="Courier New"/>
       </w:rPr>
     </w:lvl>
     <w:lvl w:ilvl="8">
@@ -4541,15 +4396,15 @@
         <w:ind w:left="7200" w:hanging="360"/>
       </w:pPr>
       <w:rPr>
-        <w:rFonts w:ascii="Noto Sans Symbols" w:eastAsia="Noto Sans Symbols" w:hAnsi="Noto Sans Symbols" w:cs="Noto Sans Symbols"/>
+        <w:rFonts w:ascii="Noto Sans Symbols" w:hAnsi="Noto Sans Symbols" w:eastAsia="Noto Sans Symbols" w:cs="Noto Sans Symbols"/>
       </w:rPr>
     </w:lvl>
   </w:abstractNum>
-  <w:abstractNum w:abstractNumId="4" w15:restartNumberingAfterBreak="0">
+  <w:abstractNum w:abstractNumId="4">
     <w:nsid w:val="27ED7B75"/>
     <w:multiLevelType w:val="hybridMultilevel"/>
     <w:tmpl w:val="EE920156"/>
-    <w:lvl w:ilvl="0" w:tplc="18090001">
+    <w:lvl w:ilvl="0">
       <w:start w:val="1"/>
       <w:numFmt w:val="bullet"/>
       <w:lvlText w:val=""/>
@@ -4558,10 +4413,10 @@
         <w:ind w:left="720" w:hanging="360"/>
       </w:pPr>
       <w:rPr>
-        <w:rFonts w:ascii="Symbol" w:hAnsi="Symbol" w:hint="default"/>
-      </w:rPr>
-    </w:lvl>
-    <w:lvl w:ilvl="1" w:tplc="18090003">
+        <w:rFonts w:ascii="Symbol" w:hAnsi="Symbol"/>
+      </w:rPr>
+    </w:lvl>
+    <w:lvl w:ilvl="1">
       <w:start w:val="1"/>
       <w:numFmt w:val="bullet"/>
       <w:lvlText w:val="o"/>
@@ -4570,10 +4425,10 @@
         <w:ind w:left="1440" w:hanging="360"/>
       </w:pPr>
       <w:rPr>
-        <w:rFonts w:ascii="Courier New" w:hAnsi="Courier New" w:cs="Courier New" w:hint="default"/>
-      </w:rPr>
-    </w:lvl>
-    <w:lvl w:ilvl="2" w:tplc="18090005" w:tentative="1">
+        <w:rFonts w:ascii="Courier New" w:hAnsi="Courier New" w:cs="Courier New"/>
+      </w:rPr>
+    </w:lvl>
+    <w:lvl w:ilvl="2">
       <w:start w:val="1"/>
       <w:numFmt w:val="bullet"/>
       <w:lvlText w:val=""/>
@@ -4582,10 +4437,10 @@
         <w:ind w:left="2160" w:hanging="360"/>
       </w:pPr>
       <w:rPr>
-        <w:rFonts w:ascii="Wingdings" w:hAnsi="Wingdings" w:hint="default"/>
-      </w:rPr>
-    </w:lvl>
-    <w:lvl w:ilvl="3" w:tplc="18090001" w:tentative="1">
+        <w:rFonts w:ascii="Wingdings" w:hAnsi="Wingdings"/>
+      </w:rPr>
+    </w:lvl>
+    <w:lvl w:ilvl="3">
       <w:start w:val="1"/>
       <w:numFmt w:val="bullet"/>
       <w:lvlText w:val=""/>
@@ -4594,10 +4449,10 @@
         <w:ind w:left="2880" w:hanging="360"/>
       </w:pPr>
       <w:rPr>
-        <w:rFonts w:ascii="Symbol" w:hAnsi="Symbol" w:hint="default"/>
-      </w:rPr>
-    </w:lvl>
-    <w:lvl w:ilvl="4" w:tplc="18090003" w:tentative="1">
+        <w:rFonts w:ascii="Symbol" w:hAnsi="Symbol"/>
+      </w:rPr>
+    </w:lvl>
+    <w:lvl w:ilvl="4">
       <w:start w:val="1"/>
       <w:numFmt w:val="bullet"/>
       <w:lvlText w:val="o"/>
@@ -4606,10 +4461,10 @@
         <w:ind w:left="3600" w:hanging="360"/>
       </w:pPr>
       <w:rPr>
-        <w:rFonts w:ascii="Courier New" w:hAnsi="Courier New" w:cs="Courier New" w:hint="default"/>
-      </w:rPr>
-    </w:lvl>
-    <w:lvl w:ilvl="5" w:tplc="18090005" w:tentative="1">
+        <w:rFonts w:ascii="Courier New" w:hAnsi="Courier New" w:cs="Courier New"/>
+      </w:rPr>
+    </w:lvl>
+    <w:lvl w:ilvl="5">
       <w:start w:val="1"/>
       <w:numFmt w:val="bullet"/>
       <w:lvlText w:val=""/>
@@ -4618,10 +4473,10 @@
         <w:ind w:left="4320" w:hanging="360"/>
       </w:pPr>
       <w:rPr>
-        <w:rFonts w:ascii="Wingdings" w:hAnsi="Wingdings" w:hint="default"/>
-      </w:rPr>
-    </w:lvl>
-    <w:lvl w:ilvl="6" w:tplc="18090001" w:tentative="1">
+        <w:rFonts w:ascii="Wingdings" w:hAnsi="Wingdings"/>
+      </w:rPr>
+    </w:lvl>
+    <w:lvl w:ilvl="6">
       <w:start w:val="1"/>
       <w:numFmt w:val="bullet"/>
       <w:lvlText w:val=""/>
@@ -4630,10 +4485,10 @@
         <w:ind w:left="5040" w:hanging="360"/>
       </w:pPr>
       <w:rPr>
-        <w:rFonts w:ascii="Symbol" w:hAnsi="Symbol" w:hint="default"/>
-      </w:rPr>
-    </w:lvl>
-    <w:lvl w:ilvl="7" w:tplc="18090003" w:tentative="1">
+        <w:rFonts w:ascii="Symbol" w:hAnsi="Symbol"/>
+      </w:rPr>
+    </w:lvl>
+    <w:lvl w:ilvl="7">
       <w:start w:val="1"/>
       <w:numFmt w:val="bullet"/>
       <w:lvlText w:val="o"/>
@@ -4642,10 +4497,10 @@
         <w:ind w:left="5760" w:hanging="360"/>
       </w:pPr>
       <w:rPr>
-        <w:rFonts w:ascii="Courier New" w:hAnsi="Courier New" w:cs="Courier New" w:hint="default"/>
-      </w:rPr>
-    </w:lvl>
-    <w:lvl w:ilvl="8" w:tplc="18090005" w:tentative="1">
+        <w:rFonts w:ascii="Courier New" w:hAnsi="Courier New" w:cs="Courier New"/>
+      </w:rPr>
+    </w:lvl>
+    <w:lvl w:ilvl="8">
       <w:start w:val="1"/>
       <w:numFmt w:val="bullet"/>
       <w:lvlText w:val=""/>
@@ -4654,15 +4509,15 @@
         <w:ind w:left="6480" w:hanging="360"/>
       </w:pPr>
       <w:rPr>
-        <w:rFonts w:ascii="Wingdings" w:hAnsi="Wingdings" w:hint="default"/>
+        <w:rFonts w:ascii="Wingdings" w:hAnsi="Wingdings"/>
       </w:rPr>
     </w:lvl>
   </w:abstractNum>
-  <w:abstractNum w:abstractNumId="5" w15:restartNumberingAfterBreak="0">
+  <w:abstractNum w:abstractNumId="5">
     <w:nsid w:val="2C7C42F8"/>
     <w:multiLevelType w:val="hybridMultilevel"/>
     <w:tmpl w:val="F020AC6C"/>
-    <w:lvl w:ilvl="0" w:tplc="18090001">
+    <w:lvl w:ilvl="0">
       <w:start w:val="1"/>
       <w:numFmt w:val="bullet"/>
       <w:lvlText w:val=""/>
@@ -4671,10 +4526,10 @@
         <w:ind w:left="720" w:hanging="360"/>
       </w:pPr>
       <w:rPr>
-        <w:rFonts w:ascii="Symbol" w:hAnsi="Symbol" w:hint="default"/>
-      </w:rPr>
-    </w:lvl>
-    <w:lvl w:ilvl="1" w:tplc="18090003">
+        <w:rFonts w:ascii="Symbol" w:hAnsi="Symbol"/>
+      </w:rPr>
+    </w:lvl>
+    <w:lvl w:ilvl="1">
       <w:start w:val="1"/>
       <w:numFmt w:val="bullet"/>
       <w:lvlText w:val="o"/>
@@ -4683,10 +4538,10 @@
         <w:ind w:left="1440" w:hanging="360"/>
       </w:pPr>
       <w:rPr>
-        <w:rFonts w:ascii="Courier New" w:hAnsi="Courier New" w:cs="Courier New" w:hint="default"/>
-      </w:rPr>
-    </w:lvl>
-    <w:lvl w:ilvl="2" w:tplc="18090005" w:tentative="1">
+        <w:rFonts w:ascii="Courier New" w:hAnsi="Courier New" w:cs="Courier New"/>
+      </w:rPr>
+    </w:lvl>
+    <w:lvl w:ilvl="2">
       <w:start w:val="1"/>
       <w:numFmt w:val="bullet"/>
       <w:lvlText w:val=""/>
@@ -4695,10 +4550,10 @@
         <w:ind w:left="2160" w:hanging="360"/>
       </w:pPr>
       <w:rPr>
-        <w:rFonts w:ascii="Wingdings" w:hAnsi="Wingdings" w:hint="default"/>
-      </w:rPr>
-    </w:lvl>
-    <w:lvl w:ilvl="3" w:tplc="18090001" w:tentative="1">
+        <w:rFonts w:ascii="Wingdings" w:hAnsi="Wingdings"/>
+      </w:rPr>
+    </w:lvl>
+    <w:lvl w:ilvl="3">
       <w:start w:val="1"/>
       <w:numFmt w:val="bullet"/>
       <w:lvlText w:val=""/>
@@ -4707,10 +4562,10 @@
         <w:ind w:left="2880" w:hanging="360"/>
       </w:pPr>
       <w:rPr>
-        <w:rFonts w:ascii="Symbol" w:hAnsi="Symbol" w:hint="default"/>
-      </w:rPr>
-    </w:lvl>
-    <w:lvl w:ilvl="4" w:tplc="18090003" w:tentative="1">
+        <w:rFonts w:ascii="Symbol" w:hAnsi="Symbol"/>
+      </w:rPr>
+    </w:lvl>
+    <w:lvl w:ilvl="4">
       <w:start w:val="1"/>
       <w:numFmt w:val="bullet"/>
       <w:lvlText w:val="o"/>
@@ -4719,10 +4574,10 @@
         <w:ind w:left="3600" w:hanging="360"/>
       </w:pPr>
       <w:rPr>
-        <w:rFonts w:ascii="Courier New" w:hAnsi="Courier New" w:cs="Courier New" w:hint="default"/>
-      </w:rPr>
-    </w:lvl>
-    <w:lvl w:ilvl="5" w:tplc="18090005" w:tentative="1">
+        <w:rFonts w:ascii="Courier New" w:hAnsi="Courier New" w:cs="Courier New"/>
+      </w:rPr>
+    </w:lvl>
+    <w:lvl w:ilvl="5">
       <w:start w:val="1"/>
       <w:numFmt w:val="bullet"/>
       <w:lvlText w:val=""/>
@@ -4731,10 +4586,10 @@
         <w:ind w:left="4320" w:hanging="360"/>
       </w:pPr>
       <w:rPr>
-        <w:rFonts w:ascii="Wingdings" w:hAnsi="Wingdings" w:hint="default"/>
-      </w:rPr>
-    </w:lvl>
-    <w:lvl w:ilvl="6" w:tplc="18090001" w:tentative="1">
+        <w:rFonts w:ascii="Wingdings" w:hAnsi="Wingdings"/>
+      </w:rPr>
+    </w:lvl>
+    <w:lvl w:ilvl="6">
       <w:start w:val="1"/>
       <w:numFmt w:val="bullet"/>
       <w:lvlText w:val=""/>
@@ -4743,10 +4598,10 @@
         <w:ind w:left="5040" w:hanging="360"/>
       </w:pPr>
       <w:rPr>
-        <w:rFonts w:ascii="Symbol" w:hAnsi="Symbol" w:hint="default"/>
-      </w:rPr>
-    </w:lvl>
-    <w:lvl w:ilvl="7" w:tplc="18090003" w:tentative="1">
+        <w:rFonts w:ascii="Symbol" w:hAnsi="Symbol"/>
+      </w:rPr>
+    </w:lvl>
+    <w:lvl w:ilvl="7">
       <w:start w:val="1"/>
       <w:numFmt w:val="bullet"/>
       <w:lvlText w:val="o"/>
@@ -4755,10 +4610,10 @@
         <w:ind w:left="5760" w:hanging="360"/>
       </w:pPr>
       <w:rPr>
-        <w:rFonts w:ascii="Courier New" w:hAnsi="Courier New" w:cs="Courier New" w:hint="default"/>
-      </w:rPr>
-    </w:lvl>
-    <w:lvl w:ilvl="8" w:tplc="18090005" w:tentative="1">
+        <w:rFonts w:ascii="Courier New" w:hAnsi="Courier New" w:cs="Courier New"/>
+      </w:rPr>
+    </w:lvl>
+    <w:lvl w:ilvl="8">
       <w:start w:val="1"/>
       <w:numFmt w:val="bullet"/>
       <w:lvlText w:val=""/>
@@ -4767,11 +4622,11 @@
         <w:ind w:left="6480" w:hanging="360"/>
       </w:pPr>
       <w:rPr>
-        <w:rFonts w:ascii="Wingdings" w:hAnsi="Wingdings" w:hint="default"/>
+        <w:rFonts w:ascii="Wingdings" w:hAnsi="Wingdings"/>
       </w:rPr>
     </w:lvl>
   </w:abstractNum>
-  <w:abstractNum w:abstractNumId="6" w15:restartNumberingAfterBreak="0">
+  <w:abstractNum w:abstractNumId="6">
     <w:nsid w:val="3D9A7CDA"/>
     <w:multiLevelType w:val="multilevel"/>
     <w:tmpl w:val="1508189E"/>
@@ -4784,7 +4639,7 @@
         <w:ind w:left="1080" w:hanging="360"/>
       </w:pPr>
       <w:rPr>
-        <w:rFonts w:ascii="Noto Sans Symbols" w:eastAsia="Noto Sans Symbols" w:hAnsi="Noto Sans Symbols" w:cs="Noto Sans Symbols"/>
+        <w:rFonts w:ascii="Noto Sans Symbols" w:hAnsi="Noto Sans Symbols" w:eastAsia="Noto Sans Symbols" w:cs="Noto Sans Symbols"/>
       </w:rPr>
     </w:lvl>
     <w:lvl w:ilvl="1">
@@ -4796,7 +4651,7 @@
         <w:ind w:left="1800" w:hanging="360"/>
       </w:pPr>
       <w:rPr>
-        <w:rFonts w:ascii="Courier New" w:eastAsia="Courier New" w:hAnsi="Courier New" w:cs="Courier New"/>
+        <w:rFonts w:ascii="Courier New" w:hAnsi="Courier New" w:eastAsia="Courier New" w:cs="Courier New"/>
       </w:rPr>
     </w:lvl>
     <w:lvl w:ilvl="2">
@@ -4808,7 +4663,7 @@
         <w:ind w:left="2520" w:hanging="360"/>
       </w:pPr>
       <w:rPr>
-        <w:rFonts w:ascii="Noto Sans Symbols" w:eastAsia="Noto Sans Symbols" w:hAnsi="Noto Sans Symbols" w:cs="Noto Sans Symbols"/>
+        <w:rFonts w:ascii="Noto Sans Symbols" w:hAnsi="Noto Sans Symbols" w:eastAsia="Noto Sans Symbols" w:cs="Noto Sans Symbols"/>
       </w:rPr>
     </w:lvl>
     <w:lvl w:ilvl="3">
@@ -4820,7 +4675,7 @@
         <w:ind w:left="3240" w:hanging="360"/>
       </w:pPr>
       <w:rPr>
-        <w:rFonts w:ascii="Noto Sans Symbols" w:eastAsia="Noto Sans Symbols" w:hAnsi="Noto Sans Symbols" w:cs="Noto Sans Symbols"/>
+        <w:rFonts w:ascii="Noto Sans Symbols" w:hAnsi="Noto Sans Symbols" w:eastAsia="Noto Sans Symbols" w:cs="Noto Sans Symbols"/>
       </w:rPr>
     </w:lvl>
     <w:lvl w:ilvl="4">
@@ -4832,7 +4687,7 @@
         <w:ind w:left="3960" w:hanging="360"/>
       </w:pPr>
       <w:rPr>
-        <w:rFonts w:ascii="Courier New" w:eastAsia="Courier New" w:hAnsi="Courier New" w:cs="Courier New"/>
+        <w:rFonts w:ascii="Courier New" w:hAnsi="Courier New" w:eastAsia="Courier New" w:cs="Courier New"/>
       </w:rPr>
     </w:lvl>
     <w:lvl w:ilvl="5">
@@ -4844,7 +4699,7 @@
         <w:ind w:left="4680" w:hanging="360"/>
       </w:pPr>
       <w:rPr>
-        <w:rFonts w:ascii="Noto Sans Symbols" w:eastAsia="Noto Sans Symbols" w:hAnsi="Noto Sans Symbols" w:cs="Noto Sans Symbols"/>
+        <w:rFonts w:ascii="Noto Sans Symbols" w:hAnsi="Noto Sans Symbols" w:eastAsia="Noto Sans Symbols" w:cs="Noto Sans Symbols"/>
       </w:rPr>
     </w:lvl>
     <w:lvl w:ilvl="6">
@@ -4856,7 +4711,7 @@
         <w:ind w:left="5400" w:hanging="360"/>
       </w:pPr>
       <w:rPr>
-        <w:rFonts w:ascii="Noto Sans Symbols" w:eastAsia="Noto Sans Symbols" w:hAnsi="Noto Sans Symbols" w:cs="Noto Sans Symbols"/>
+        <w:rFonts w:ascii="Noto Sans Symbols" w:hAnsi="Noto Sans Symbols" w:eastAsia="Noto Sans Symbols" w:cs="Noto Sans Symbols"/>
       </w:rPr>
     </w:lvl>
     <w:lvl w:ilvl="7">
@@ -4868,7 +4723,7 @@
         <w:ind w:left="6120" w:hanging="360"/>
       </w:pPr>
       <w:rPr>
-        <w:rFonts w:ascii="Courier New" w:eastAsia="Courier New" w:hAnsi="Courier New" w:cs="Courier New"/>
+        <w:rFonts w:ascii="Courier New" w:hAnsi="Courier New" w:eastAsia="Courier New" w:cs="Courier New"/>
       </w:rPr>
     </w:lvl>
     <w:lvl w:ilvl="8">
@@ -4880,11 +4735,11 @@
         <w:ind w:left="6840" w:hanging="360"/>
       </w:pPr>
       <w:rPr>
-        <w:rFonts w:ascii="Noto Sans Symbols" w:eastAsia="Noto Sans Symbols" w:hAnsi="Noto Sans Symbols" w:cs="Noto Sans Symbols"/>
+        <w:rFonts w:ascii="Noto Sans Symbols" w:hAnsi="Noto Sans Symbols" w:eastAsia="Noto Sans Symbols" w:cs="Noto Sans Symbols"/>
       </w:rPr>
     </w:lvl>
   </w:abstractNum>
-  <w:abstractNum w:abstractNumId="7" w15:restartNumberingAfterBreak="0">
+  <w:abstractNum w:abstractNumId="7">
     <w:nsid w:val="43427AF3"/>
     <w:multiLevelType w:val="multilevel"/>
     <w:tmpl w:val="0BE6CBEA"/>
@@ -4897,7 +4752,7 @@
         <w:ind w:left="720" w:hanging="360"/>
       </w:pPr>
       <w:rPr>
-        <w:rFonts w:ascii="Noto Sans Symbols" w:eastAsia="Noto Sans Symbols" w:hAnsi="Noto Sans Symbols" w:cs="Noto Sans Symbols"/>
+        <w:rFonts w:ascii="Noto Sans Symbols" w:hAnsi="Noto Sans Symbols" w:eastAsia="Noto Sans Symbols" w:cs="Noto Sans Symbols"/>
       </w:rPr>
     </w:lvl>
     <w:lvl w:ilvl="1">
@@ -4909,7 +4764,7 @@
         <w:ind w:left="1440" w:hanging="360"/>
       </w:pPr>
       <w:rPr>
-        <w:rFonts w:ascii="Courier New" w:eastAsia="Courier New" w:hAnsi="Courier New" w:cs="Courier New"/>
+        <w:rFonts w:ascii="Courier New" w:hAnsi="Courier New" w:eastAsia="Courier New" w:cs="Courier New"/>
       </w:rPr>
     </w:lvl>
     <w:lvl w:ilvl="2">
@@ -4921,7 +4776,7 @@
         <w:ind w:left="2160" w:hanging="360"/>
       </w:pPr>
       <w:rPr>
-        <w:rFonts w:ascii="Noto Sans Symbols" w:eastAsia="Noto Sans Symbols" w:hAnsi="Noto Sans Symbols" w:cs="Noto Sans Symbols"/>
+        <w:rFonts w:ascii="Noto Sans Symbols" w:hAnsi="Noto Sans Symbols" w:eastAsia="Noto Sans Symbols" w:cs="Noto Sans Symbols"/>
       </w:rPr>
     </w:lvl>
     <w:lvl w:ilvl="3">
@@ -4933,7 +4788,7 @@
         <w:ind w:left="2880" w:hanging="360"/>
       </w:pPr>
       <w:rPr>
-        <w:rFonts w:ascii="Noto Sans Symbols" w:eastAsia="Noto Sans Symbols" w:hAnsi="Noto Sans Symbols" w:cs="Noto Sans Symbols"/>
+        <w:rFonts w:ascii="Noto Sans Symbols" w:hAnsi="Noto Sans Symbols" w:eastAsia="Noto Sans Symbols" w:cs="Noto Sans Symbols"/>
       </w:rPr>
     </w:lvl>
     <w:lvl w:ilvl="4">
@@ -4945,7 +4800,7 @@
         <w:ind w:left="3600" w:hanging="360"/>
       </w:pPr>
       <w:rPr>
-        <w:rFonts w:ascii="Courier New" w:eastAsia="Courier New" w:hAnsi="Courier New" w:cs="Courier New"/>
+        <w:rFonts w:ascii="Courier New" w:hAnsi="Courier New" w:eastAsia="Courier New" w:cs="Courier New"/>
       </w:rPr>
     </w:lvl>
     <w:lvl w:ilvl="5">
@@ -4957,7 +4812,7 @@
         <w:ind w:left="4320" w:hanging="360"/>
       </w:pPr>
       <w:rPr>
-        <w:rFonts w:ascii="Noto Sans Symbols" w:eastAsia="Noto Sans Symbols" w:hAnsi="Noto Sans Symbols" w:cs="Noto Sans Symbols"/>
+        <w:rFonts w:ascii="Noto Sans Symbols" w:hAnsi="Noto Sans Symbols" w:eastAsia="Noto Sans Symbols" w:cs="Noto Sans Symbols"/>
       </w:rPr>
     </w:lvl>
     <w:lvl w:ilvl="6">
@@ -4969,7 +4824,7 @@
         <w:ind w:left="5040" w:hanging="360"/>
       </w:pPr>
       <w:rPr>
-        <w:rFonts w:ascii="Noto Sans Symbols" w:eastAsia="Noto Sans Symbols" w:hAnsi="Noto Sans Symbols" w:cs="Noto Sans Symbols"/>
+        <w:rFonts w:ascii="Noto Sans Symbols" w:hAnsi="Noto Sans Symbols" w:eastAsia="Noto Sans Symbols" w:cs="Noto Sans Symbols"/>
       </w:rPr>
     </w:lvl>
     <w:lvl w:ilvl="7">
@@ -4981,7 +4836,7 @@
         <w:ind w:left="5760" w:hanging="360"/>
       </w:pPr>
       <w:rPr>
-        <w:rFonts w:ascii="Courier New" w:eastAsia="Courier New" w:hAnsi="Courier New" w:cs="Courier New"/>
+        <w:rFonts w:ascii="Courier New" w:hAnsi="Courier New" w:eastAsia="Courier New" w:cs="Courier New"/>
       </w:rPr>
     </w:lvl>
     <w:lvl w:ilvl="8">
@@ -4993,11 +4848,11 @@
         <w:ind w:left="6480" w:hanging="360"/>
       </w:pPr>
       <w:rPr>
-        <w:rFonts w:ascii="Noto Sans Symbols" w:eastAsia="Noto Sans Symbols" w:hAnsi="Noto Sans Symbols" w:cs="Noto Sans Symbols"/>
+        <w:rFonts w:ascii="Noto Sans Symbols" w:hAnsi="Noto Sans Symbols" w:eastAsia="Noto Sans Symbols" w:cs="Noto Sans Symbols"/>
       </w:rPr>
     </w:lvl>
   </w:abstractNum>
-  <w:abstractNum w:abstractNumId="8" w15:restartNumberingAfterBreak="0">
+  <w:abstractNum w:abstractNumId="8">
     <w:nsid w:val="461256DE"/>
     <w:multiLevelType w:val="multilevel"/>
     <w:tmpl w:val="70389AF0"/>
@@ -5010,7 +4865,7 @@
         <w:ind w:left="720" w:hanging="360"/>
       </w:pPr>
       <w:rPr>
-        <w:rFonts w:ascii="Noto Sans Symbols" w:eastAsia="Noto Sans Symbols" w:hAnsi="Noto Sans Symbols" w:cs="Noto Sans Symbols"/>
+        <w:rFonts w:ascii="Noto Sans Symbols" w:hAnsi="Noto Sans Symbols" w:eastAsia="Noto Sans Symbols" w:cs="Noto Sans Symbols"/>
       </w:rPr>
     </w:lvl>
     <w:lvl w:ilvl="1">
@@ -5022,7 +4877,7 @@
         <w:ind w:left="1440" w:hanging="360"/>
       </w:pPr>
       <w:rPr>
-        <w:rFonts w:ascii="Courier New" w:eastAsia="Courier New" w:hAnsi="Courier New" w:cs="Courier New"/>
+        <w:rFonts w:ascii="Courier New" w:hAnsi="Courier New" w:eastAsia="Courier New" w:cs="Courier New"/>
       </w:rPr>
     </w:lvl>
     <w:lvl w:ilvl="2">
@@ -5034,7 +4889,7 @@
         <w:ind w:left="2160" w:hanging="360"/>
       </w:pPr>
       <w:rPr>
-        <w:rFonts w:ascii="Noto Sans Symbols" w:eastAsia="Noto Sans Symbols" w:hAnsi="Noto Sans Symbols" w:cs="Noto Sans Symbols"/>
+        <w:rFonts w:ascii="Noto Sans Symbols" w:hAnsi="Noto Sans Symbols" w:eastAsia="Noto Sans Symbols" w:cs="Noto Sans Symbols"/>
       </w:rPr>
     </w:lvl>
     <w:lvl w:ilvl="3">
@@ -5046,7 +4901,7 @@
         <w:ind w:left="2880" w:hanging="360"/>
       </w:pPr>
       <w:rPr>
-        <w:rFonts w:ascii="Noto Sans Symbols" w:eastAsia="Noto Sans Symbols" w:hAnsi="Noto Sans Symbols" w:cs="Noto Sans Symbols"/>
+        <w:rFonts w:ascii="Noto Sans Symbols" w:hAnsi="Noto Sans Symbols" w:eastAsia="Noto Sans Symbols" w:cs="Noto Sans Symbols"/>
       </w:rPr>
     </w:lvl>
     <w:lvl w:ilvl="4">
@@ -5058,7 +4913,7 @@
         <w:ind w:left="3600" w:hanging="360"/>
       </w:pPr>
       <w:rPr>
-        <w:rFonts w:ascii="Courier New" w:eastAsia="Courier New" w:hAnsi="Courier New" w:cs="Courier New"/>
+        <w:rFonts w:ascii="Courier New" w:hAnsi="Courier New" w:eastAsia="Courier New" w:cs="Courier New"/>
       </w:rPr>
     </w:lvl>
     <w:lvl w:ilvl="5">
@@ -5070,7 +4925,7 @@
         <w:ind w:left="4320" w:hanging="360"/>
       </w:pPr>
       <w:rPr>
-        <w:rFonts w:ascii="Noto Sans Symbols" w:eastAsia="Noto Sans Symbols" w:hAnsi="Noto Sans Symbols" w:cs="Noto Sans Symbols"/>
+        <w:rFonts w:ascii="Noto Sans Symbols" w:hAnsi="Noto Sans Symbols" w:eastAsia="Noto Sans Symbols" w:cs="Noto Sans Symbols"/>
       </w:rPr>
     </w:lvl>
     <w:lvl w:ilvl="6">
@@ -5082,7 +4937,7 @@
         <w:ind w:left="5040" w:hanging="360"/>
       </w:pPr>
       <w:rPr>
-        <w:rFonts w:ascii="Noto Sans Symbols" w:eastAsia="Noto Sans Symbols" w:hAnsi="Noto Sans Symbols" w:cs="Noto Sans Symbols"/>
+        <w:rFonts w:ascii="Noto Sans Symbols" w:hAnsi="Noto Sans Symbols" w:eastAsia="Noto Sans Symbols" w:cs="Noto Sans Symbols"/>
       </w:rPr>
     </w:lvl>
     <w:lvl w:ilvl="7">
@@ -5094,7 +4949,7 @@
         <w:ind w:left="5760" w:hanging="360"/>
       </w:pPr>
       <w:rPr>
-        <w:rFonts w:ascii="Courier New" w:eastAsia="Courier New" w:hAnsi="Courier New" w:cs="Courier New"/>
+        <w:rFonts w:ascii="Courier New" w:hAnsi="Courier New" w:eastAsia="Courier New" w:cs="Courier New"/>
       </w:rPr>
     </w:lvl>
     <w:lvl w:ilvl="8">
@@ -5106,11 +4961,11 @@
         <w:ind w:left="6480" w:hanging="360"/>
       </w:pPr>
       <w:rPr>
-        <w:rFonts w:ascii="Noto Sans Symbols" w:eastAsia="Noto Sans Symbols" w:hAnsi="Noto Sans Symbols" w:cs="Noto Sans Symbols"/>
+        <w:rFonts w:ascii="Noto Sans Symbols" w:hAnsi="Noto Sans Symbols" w:eastAsia="Noto Sans Symbols" w:cs="Noto Sans Symbols"/>
       </w:rPr>
     </w:lvl>
   </w:abstractNum>
-  <w:abstractNum w:abstractNumId="9" w15:restartNumberingAfterBreak="0">
+  <w:abstractNum w:abstractNumId="9">
     <w:nsid w:val="4C6344DA"/>
     <w:multiLevelType w:val="multilevel"/>
     <w:tmpl w:val="494A1B1C"/>
@@ -5123,7 +4978,7 @@
         <w:ind w:left="720" w:hanging="360"/>
       </w:pPr>
       <w:rPr>
-        <w:rFonts w:ascii="Noto Sans Symbols" w:eastAsia="Noto Sans Symbols" w:hAnsi="Noto Sans Symbols" w:cs="Noto Sans Symbols"/>
+        <w:rFonts w:ascii="Noto Sans Symbols" w:hAnsi="Noto Sans Symbols" w:eastAsia="Noto Sans Symbols" w:cs="Noto Sans Symbols"/>
         <w:sz w:val="20"/>
         <w:szCs w:val="20"/>
       </w:rPr>
@@ -5137,7 +4992,7 @@
         <w:ind w:left="1440" w:hanging="360"/>
       </w:pPr>
       <w:rPr>
-        <w:rFonts w:ascii="Courier New" w:eastAsia="Courier New" w:hAnsi="Courier New" w:cs="Courier New"/>
+        <w:rFonts w:ascii="Courier New" w:hAnsi="Courier New" w:eastAsia="Courier New" w:cs="Courier New"/>
         <w:sz w:val="20"/>
         <w:szCs w:val="20"/>
       </w:rPr>
@@ -5151,7 +5006,7 @@
         <w:ind w:left="2160" w:hanging="360"/>
       </w:pPr>
       <w:rPr>
-        <w:rFonts w:ascii="Noto Sans Symbols" w:eastAsia="Noto Sans Symbols" w:hAnsi="Noto Sans Symbols" w:cs="Noto Sans Symbols"/>
+        <w:rFonts w:ascii="Noto Sans Symbols" w:hAnsi="Noto Sans Symbols" w:eastAsia="Noto Sans Symbols" w:cs="Noto Sans Symbols"/>
         <w:sz w:val="20"/>
         <w:szCs w:val="20"/>
       </w:rPr>
@@ -5165,7 +5020,7 @@
         <w:ind w:left="2880" w:hanging="360"/>
       </w:pPr>
       <w:rPr>
-        <w:rFonts w:ascii="Noto Sans Symbols" w:eastAsia="Noto Sans Symbols" w:hAnsi="Noto Sans Symbols" w:cs="Noto Sans Symbols"/>
+        <w:rFonts w:ascii="Noto Sans Symbols" w:hAnsi="Noto Sans Symbols" w:eastAsia="Noto Sans Symbols" w:cs="Noto Sans Symbols"/>
         <w:sz w:val="20"/>
         <w:szCs w:val="20"/>
       </w:rPr>
@@ -5179,7 +5034,7 @@
         <w:ind w:left="3600" w:hanging="360"/>
       </w:pPr>
       <w:rPr>
-        <w:rFonts w:ascii="Noto Sans Symbols" w:eastAsia="Noto Sans Symbols" w:hAnsi="Noto Sans Symbols" w:cs="Noto Sans Symbols"/>
+        <w:rFonts w:ascii="Noto Sans Symbols" w:hAnsi="Noto Sans Symbols" w:eastAsia="Noto Sans Symbols" w:cs="Noto Sans Symbols"/>
         <w:sz w:val="20"/>
         <w:szCs w:val="20"/>
       </w:rPr>
@@ -5193,7 +5048,7 @@
         <w:ind w:left="4320" w:hanging="360"/>
       </w:pPr>
       <w:rPr>
-        <w:rFonts w:ascii="Noto Sans Symbols" w:eastAsia="Noto Sans Symbols" w:hAnsi="Noto Sans Symbols" w:cs="Noto Sans Symbols"/>
+        <w:rFonts w:ascii="Noto Sans Symbols" w:hAnsi="Noto Sans Symbols" w:eastAsia="Noto Sans Symbols" w:cs="Noto Sans Symbols"/>
         <w:sz w:val="20"/>
         <w:szCs w:val="20"/>
       </w:rPr>
@@ -5207,7 +5062,7 @@
         <w:ind w:left="5040" w:hanging="360"/>
       </w:pPr>
       <w:rPr>
-        <w:rFonts w:ascii="Noto Sans Symbols" w:eastAsia="Noto Sans Symbols" w:hAnsi="Noto Sans Symbols" w:cs="Noto Sans Symbols"/>
+        <w:rFonts w:ascii="Noto Sans Symbols" w:hAnsi="Noto Sans Symbols" w:eastAsia="Noto Sans Symbols" w:cs="Noto Sans Symbols"/>
         <w:sz w:val="20"/>
         <w:szCs w:val="20"/>
       </w:rPr>
@@ -5221,7 +5076,7 @@
         <w:ind w:left="5760" w:hanging="360"/>
       </w:pPr>
       <w:rPr>
-        <w:rFonts w:ascii="Noto Sans Symbols" w:eastAsia="Noto Sans Symbols" w:hAnsi="Noto Sans Symbols" w:cs="Noto Sans Symbols"/>
+        <w:rFonts w:ascii="Noto Sans Symbols" w:hAnsi="Noto Sans Symbols" w:eastAsia="Noto Sans Symbols" w:cs="Noto Sans Symbols"/>
         <w:sz w:val="20"/>
         <w:szCs w:val="20"/>
       </w:rPr>
@@ -5235,17 +5090,18 @@
         <w:ind w:left="6480" w:hanging="360"/>
       </w:pPr>
       <w:rPr>
-        <w:rFonts w:ascii="Noto Sans Symbols" w:eastAsia="Noto Sans Symbols" w:hAnsi="Noto Sans Symbols" w:cs="Noto Sans Symbols"/>
+        <w:rFonts w:ascii="Noto Sans Symbols" w:hAnsi="Noto Sans Symbols" w:eastAsia="Noto Sans Symbols" w:cs="Noto Sans Symbols"/>
         <w:sz w:val="20"/>
         <w:szCs w:val="20"/>
       </w:rPr>
     </w:lvl>
   </w:abstractNum>
-  <w:abstractNum w:abstractNumId="10" w15:restartNumberingAfterBreak="0">
+  <w:abstractNum w:abstractNumId="10">
     <w:nsid w:val="6BC47BB4"/>
     <w:multiLevelType w:val="hybridMultilevel"/>
     <w:tmpl w:val="ED988962"/>
-    <w:lvl w:ilvl="0" w:tplc="AED486BC">
+    <w:lvl w:ilvl="0">
+      <w:start w:val="1"/>
       <w:numFmt w:val="bullet"/>
       <w:lvlText w:val="o"/>
       <w:lvlJc w:val="left"/>
@@ -5253,7 +5109,7 @@
         <w:ind w:left="726" w:hanging="360"/>
       </w:pPr>
       <w:rPr>
-        <w:rFonts w:ascii="Courier New" w:eastAsia="Courier New" w:hAnsi="Courier New" w:cs="Courier New" w:hint="default"/>
+        <w:rFonts w:ascii="Courier New" w:hAnsi="Courier New" w:eastAsia="Courier New" w:cs="Courier New"/>
         <w:b w:val="0"/>
         <w:bCs w:val="0"/>
         <w:i w:val="0"/>
@@ -5262,10 +5118,10 @@
         <w:w w:val="99"/>
         <w:sz w:val="20"/>
         <w:szCs w:val="20"/>
-        <w:lang w:val="en-US" w:eastAsia="en-US" w:bidi="ar-SA"/>
-      </w:rPr>
-    </w:lvl>
-    <w:lvl w:ilvl="1" w:tplc="08090003" w:tentative="1">
+        <w:lang w:val="en-US" w:bidi="ar-SA"/>
+      </w:rPr>
+    </w:lvl>
+    <w:lvl w:ilvl="1">
       <w:start w:val="1"/>
       <w:numFmt w:val="bullet"/>
       <w:lvlText w:val="o"/>
@@ -5274,10 +5130,10 @@
         <w:ind w:left="1446" w:hanging="360"/>
       </w:pPr>
       <w:rPr>
-        <w:rFonts w:ascii="Courier New" w:hAnsi="Courier New" w:hint="default"/>
-      </w:rPr>
-    </w:lvl>
-    <w:lvl w:ilvl="2" w:tplc="08090005" w:tentative="1">
+        <w:rFonts w:ascii="Courier New" w:hAnsi="Courier New"/>
+      </w:rPr>
+    </w:lvl>
+    <w:lvl w:ilvl="2">
       <w:start w:val="1"/>
       <w:numFmt w:val="bullet"/>
       <w:lvlText w:val=""/>
@@ -5286,10 +5142,10 @@
         <w:ind w:left="2166" w:hanging="360"/>
       </w:pPr>
       <w:rPr>
-        <w:rFonts w:ascii="Wingdings" w:hAnsi="Wingdings" w:hint="default"/>
-      </w:rPr>
-    </w:lvl>
-    <w:lvl w:ilvl="3" w:tplc="08090001" w:tentative="1">
+        <w:rFonts w:ascii="Wingdings" w:hAnsi="Wingdings"/>
+      </w:rPr>
+    </w:lvl>
+    <w:lvl w:ilvl="3">
       <w:start w:val="1"/>
       <w:numFmt w:val="bullet"/>
       <w:lvlText w:val=""/>
@@ -5298,10 +5154,10 @@
         <w:ind w:left="2886" w:hanging="360"/>
       </w:pPr>
       <w:rPr>
-        <w:rFonts w:ascii="Symbol" w:hAnsi="Symbol" w:hint="default"/>
-      </w:rPr>
-    </w:lvl>
-    <w:lvl w:ilvl="4" w:tplc="08090003" w:tentative="1">
+        <w:rFonts w:ascii="Symbol" w:hAnsi="Symbol"/>
+      </w:rPr>
+    </w:lvl>
+    <w:lvl w:ilvl="4">
       <w:start w:val="1"/>
       <w:numFmt w:val="bullet"/>
       <w:lvlText w:val="o"/>
@@ -5310,10 +5166,10 @@
         <w:ind w:left="3606" w:hanging="360"/>
       </w:pPr>
       <w:rPr>
-        <w:rFonts w:ascii="Courier New" w:hAnsi="Courier New" w:hint="default"/>
-      </w:rPr>
-    </w:lvl>
-    <w:lvl w:ilvl="5" w:tplc="08090005" w:tentative="1">
+        <w:rFonts w:ascii="Courier New" w:hAnsi="Courier New"/>
+      </w:rPr>
+    </w:lvl>
+    <w:lvl w:ilvl="5">
       <w:start w:val="1"/>
       <w:numFmt w:val="bullet"/>
       <w:lvlText w:val=""/>
@@ -5322,10 +5178,10 @@
         <w:ind w:left="4326" w:hanging="360"/>
       </w:pPr>
       <w:rPr>
-        <w:rFonts w:ascii="Wingdings" w:hAnsi="Wingdings" w:hint="default"/>
-      </w:rPr>
-    </w:lvl>
-    <w:lvl w:ilvl="6" w:tplc="08090001" w:tentative="1">
+        <w:rFonts w:ascii="Wingdings" w:hAnsi="Wingdings"/>
+      </w:rPr>
+    </w:lvl>
+    <w:lvl w:ilvl="6">
       <w:start w:val="1"/>
       <w:numFmt w:val="bullet"/>
       <w:lvlText w:val=""/>
@@ -5334,10 +5190,10 @@
         <w:ind w:left="5046" w:hanging="360"/>
       </w:pPr>
       <w:rPr>
-        <w:rFonts w:ascii="Symbol" w:hAnsi="Symbol" w:hint="default"/>
-      </w:rPr>
-    </w:lvl>
-    <w:lvl w:ilvl="7" w:tplc="08090003" w:tentative="1">
+        <w:rFonts w:ascii="Symbol" w:hAnsi="Symbol"/>
+      </w:rPr>
+    </w:lvl>
+    <w:lvl w:ilvl="7">
       <w:start w:val="1"/>
       <w:numFmt w:val="bullet"/>
       <w:lvlText w:val="o"/>
@@ -5346,10 +5202,10 @@
         <w:ind w:left="5766" w:hanging="360"/>
       </w:pPr>
       <w:rPr>
-        <w:rFonts w:ascii="Courier New" w:hAnsi="Courier New" w:hint="default"/>
-      </w:rPr>
-    </w:lvl>
-    <w:lvl w:ilvl="8" w:tplc="08090005" w:tentative="1">
+        <w:rFonts w:ascii="Courier New" w:hAnsi="Courier New"/>
+      </w:rPr>
+    </w:lvl>
+    <w:lvl w:ilvl="8">
       <w:start w:val="1"/>
       <w:numFmt w:val="bullet"/>
       <w:lvlText w:val=""/>
@@ -5358,11 +5214,11 @@
         <w:ind w:left="6486" w:hanging="360"/>
       </w:pPr>
       <w:rPr>
-        <w:rFonts w:ascii="Wingdings" w:hAnsi="Wingdings" w:hint="default"/>
+        <w:rFonts w:ascii="Wingdings" w:hAnsi="Wingdings"/>
       </w:rPr>
     </w:lvl>
   </w:abstractNum>
-  <w:abstractNum w:abstractNumId="11" w15:restartNumberingAfterBreak="0">
+  <w:abstractNum w:abstractNumId="11">
     <w:nsid w:val="751455EC"/>
     <w:multiLevelType w:val="multilevel"/>
     <w:tmpl w:val="FDEE2FCC"/>
@@ -5375,7 +5231,7 @@
         <w:ind w:left="720" w:hanging="360"/>
       </w:pPr>
       <w:rPr>
-        <w:rFonts w:ascii="Noto Sans Symbols" w:eastAsia="Noto Sans Symbols" w:hAnsi="Noto Sans Symbols" w:cs="Noto Sans Symbols"/>
+        <w:rFonts w:ascii="Noto Sans Symbols" w:hAnsi="Noto Sans Symbols" w:eastAsia="Noto Sans Symbols" w:cs="Noto Sans Symbols"/>
       </w:rPr>
     </w:lvl>
     <w:lvl w:ilvl="1">
@@ -5387,7 +5243,7 @@
         <w:ind w:left="1440" w:hanging="360"/>
       </w:pPr>
       <w:rPr>
-        <w:rFonts w:ascii="Courier New" w:eastAsia="Courier New" w:hAnsi="Courier New" w:cs="Courier New"/>
+        <w:rFonts w:ascii="Courier New" w:hAnsi="Courier New" w:eastAsia="Courier New" w:cs="Courier New"/>
       </w:rPr>
     </w:lvl>
     <w:lvl w:ilvl="2">
@@ -5399,7 +5255,7 @@
         <w:ind w:left="2160" w:hanging="360"/>
       </w:pPr>
       <w:rPr>
-        <w:rFonts w:ascii="Noto Sans Symbols" w:eastAsia="Noto Sans Symbols" w:hAnsi="Noto Sans Symbols" w:cs="Noto Sans Symbols"/>
+        <w:rFonts w:ascii="Noto Sans Symbols" w:hAnsi="Noto Sans Symbols" w:eastAsia="Noto Sans Symbols" w:cs="Noto Sans Symbols"/>
       </w:rPr>
     </w:lvl>
     <w:lvl w:ilvl="3">
@@ -5411,7 +5267,7 @@
         <w:ind w:left="2880" w:hanging="360"/>
       </w:pPr>
       <w:rPr>
-        <w:rFonts w:ascii="Noto Sans Symbols" w:eastAsia="Noto Sans Symbols" w:hAnsi="Noto Sans Symbols" w:cs="Noto Sans Symbols"/>
+        <w:rFonts w:ascii="Noto Sans Symbols" w:hAnsi="Noto Sans Symbols" w:eastAsia="Noto Sans Symbols" w:cs="Noto Sans Symbols"/>
       </w:rPr>
     </w:lvl>
     <w:lvl w:ilvl="4">
@@ -5423,7 +5279,7 @@
         <w:ind w:left="3600" w:hanging="360"/>
       </w:pPr>
       <w:rPr>
-        <w:rFonts w:ascii="Courier New" w:eastAsia="Courier New" w:hAnsi="Courier New" w:cs="Courier New"/>
+        <w:rFonts w:ascii="Courier New" w:hAnsi="Courier New" w:eastAsia="Courier New" w:cs="Courier New"/>
       </w:rPr>
     </w:lvl>
     <w:lvl w:ilvl="5">
@@ -5435,7 +5291,7 @@
         <w:ind w:left="4320" w:hanging="360"/>
       </w:pPr>
       <w:rPr>
-        <w:rFonts w:ascii="Noto Sans Symbols" w:eastAsia="Noto Sans Symbols" w:hAnsi="Noto Sans Symbols" w:cs="Noto Sans Symbols"/>
+        <w:rFonts w:ascii="Noto Sans Symbols" w:hAnsi="Noto Sans Symbols" w:eastAsia="Noto Sans Symbols" w:cs="Noto Sans Symbols"/>
       </w:rPr>
     </w:lvl>
     <w:lvl w:ilvl="6">
@@ -5447,7 +5303,7 @@
         <w:ind w:left="5040" w:hanging="360"/>
       </w:pPr>
       <w:rPr>
-        <w:rFonts w:ascii="Noto Sans Symbols" w:eastAsia="Noto Sans Symbols" w:hAnsi="Noto Sans Symbols" w:cs="Noto Sans Symbols"/>
+        <w:rFonts w:ascii="Noto Sans Symbols" w:hAnsi="Noto Sans Symbols" w:eastAsia="Noto Sans Symbols" w:cs="Noto Sans Symbols"/>
       </w:rPr>
     </w:lvl>
     <w:lvl w:ilvl="7">
@@ -5459,7 +5315,7 @@
         <w:ind w:left="5760" w:hanging="360"/>
       </w:pPr>
       <w:rPr>
-        <w:rFonts w:ascii="Courier New" w:eastAsia="Courier New" w:hAnsi="Courier New" w:cs="Courier New"/>
+        <w:rFonts w:ascii="Courier New" w:hAnsi="Courier New" w:eastAsia="Courier New" w:cs="Courier New"/>
       </w:rPr>
     </w:lvl>
     <w:lvl w:ilvl="8">
@@ -5471,58 +5327,58 @@
         <w:ind w:left="6480" w:hanging="360"/>
       </w:pPr>
       <w:rPr>
-        <w:rFonts w:ascii="Noto Sans Symbols" w:eastAsia="Noto Sans Symbols" w:hAnsi="Noto Sans Symbols" w:cs="Noto Sans Symbols"/>
+        <w:rFonts w:ascii="Noto Sans Symbols" w:hAnsi="Noto Sans Symbols" w:eastAsia="Noto Sans Symbols" w:cs="Noto Sans Symbols"/>
       </w:rPr>
     </w:lvl>
   </w:abstractNum>
-  <w:num w:numId="1" w16cid:durableId="2097433972">
+  <w:num w:numId="1">
     <w:abstractNumId w:val="8"/>
   </w:num>
-  <w:num w:numId="2" w16cid:durableId="459155700">
+  <w:num w:numId="2">
     <w:abstractNumId w:val="11"/>
   </w:num>
-  <w:num w:numId="3" w16cid:durableId="363482153">
+  <w:num w:numId="3">
     <w:abstractNumId w:val="9"/>
   </w:num>
-  <w:num w:numId="4" w16cid:durableId="1221945267">
+  <w:num w:numId="4">
     <w:abstractNumId w:val="6"/>
   </w:num>
-  <w:num w:numId="5" w16cid:durableId="1972664429">
+  <w:num w:numId="5">
     <w:abstractNumId w:val="7"/>
   </w:num>
-  <w:num w:numId="6" w16cid:durableId="189535272">
+  <w:num w:numId="6">
     <w:abstractNumId w:val="1"/>
   </w:num>
-  <w:num w:numId="7" w16cid:durableId="1324775113">
+  <w:num w:numId="7">
     <w:abstractNumId w:val="5"/>
   </w:num>
-  <w:num w:numId="8" w16cid:durableId="755328197">
+  <w:num w:numId="8">
     <w:abstractNumId w:val="2"/>
   </w:num>
-  <w:num w:numId="9" w16cid:durableId="278716">
+  <w:num w:numId="9">
     <w:abstractNumId w:val="4"/>
   </w:num>
-  <w:num w:numId="10" w16cid:durableId="1738627043">
+  <w:num w:numId="10">
     <w:abstractNumId w:val="10"/>
   </w:num>
-  <w:num w:numId="11" w16cid:durableId="660163193">
+  <w:num w:numId="11">
     <w:abstractNumId w:val="3"/>
   </w:num>
-  <w:num w:numId="12" w16cid:durableId="57868689">
+  <w:num w:numId="12">
     <w:abstractNumId w:val="0"/>
   </w:num>
 </w:numbering>
 </file>
 
 <file path=word/styles.xml><?xml version="1.0" encoding="utf-8"?>
-<w:styles xmlns:mc="http://schemas.openxmlformats.org/markup-compatibility/2006" xmlns:r="http://schemas.openxmlformats.org/officeDocument/2006/relationships" xmlns:w="http://schemas.openxmlformats.org/wordprocessingml/2006/main" xmlns:w14="http://schemas.microsoft.com/office/word/2010/wordml" xmlns:w15="http://schemas.microsoft.com/office/word/2012/wordml" xmlns:w16cex="http://schemas.microsoft.com/office/word/2018/wordml/cex" xmlns:w16cid="http://schemas.microsoft.com/office/word/2016/wordml/cid" xmlns:w16="http://schemas.microsoft.com/office/word/2018/wordml" xmlns:w16du="http://schemas.microsoft.com/office/word/2023/wordml/word16du" xmlns:w16sdtdh="http://schemas.microsoft.com/office/word/2020/wordml/sdtdatahash" xmlns:w16sdtfl="http://schemas.microsoft.com/office/word/2024/wordml/sdtformatlock" xmlns:w16se="http://schemas.microsoft.com/office/word/2015/wordml/symex" mc:Ignorable="w14 w15 w16se w16cid w16 w16cex w16sdtdh w16sdtfl w16du">
+<w:styles xmlns:w="http://schemas.openxmlformats.org/wordprocessingml/2006/main" xmlns:r="http://schemas.openxmlformats.org/officeDocument/2006/relationships" xmlns:wp="http://schemas.openxmlformats.org/drawingml/2006/wordprocessingDrawing" xmlns:a="http://schemas.openxmlformats.org/drawingml/2006/main" xmlns:c="http://schemas.openxmlformats.org/drawingml/2006/chart" xmlns:pic="http://schemas.openxmlformats.org/drawingml/2006/picture" xmlns:mc="http://schemas.openxmlformats.org/markup-compatibility/2006" xmlns:w14="http://schemas.microsoft.com/office/word/2010/wordml" xmlns:wpi="http://schemas.microsoft.com/office/word/2010/wordprocessingInk" xmlns:w15="http://schemas.microsoft.com/office/word/2012/wordml" xmlns:wp14="http://schemas.microsoft.com/office/word/2010/wordprocessingDrawing" xmlns:wps="http://schemas.microsoft.com/office/word/2010/wordprocessingShape" xmlns:wpg="http://schemas.microsoft.com/office/word/2010/wordprocessingGroup" xmlns:wpc="http://schemas.microsoft.com/office/word/2010/wordprocessingCanvas" xmlns:dgm="http://schemas.openxmlformats.org/drawingml/2006/diagram" xmlns:dsp="http://schemas.microsoft.com/office/drawing/2008/diagram" xmlns:m="http://schemas.openxmlformats.org/officeDocument/2006/math" xmlns:v="urn:schemas-microsoft-com:vml" xmlns:o="urn:schemas-microsoft-com:office:office" xmlns:w10="urn:schemas-microsoft-com:office:word" xmlns:cx="http://schemas.microsoft.com/office/drawing/2014/chartex" xmlns:cx1="http://schemas.microsoft.com/office/drawing/2015/9/8/chartex" xmlns:cx2="http://schemas.microsoft.com/office/drawing/2015/10/21/chartex" xmlns:cx3="http://schemas.microsoft.com/office/drawing/2016/5/9/chartex" xmlns:cx4="http://schemas.microsoft.com/office/drawing/2016/5/10/chartex" xmlns:cx5="http://schemas.microsoft.com/office/drawing/2016/5/11/chartex" xmlns:cx6="http://schemas.microsoft.com/office/drawing/2016/5/12/chartex" xmlns:cx7="http://schemas.microsoft.com/office/drawing/2016/5/13/chartex" xmlns:cx8="http://schemas.microsoft.com/office/drawing/2016/5/14/chartex" mc:Ignorable="w14 w15 wp14">
   <w:docDefaults>
     <w:rPrDefault>
       <w:rPr>
-        <w:rFonts w:ascii="Calibri" w:eastAsia="Calibri" w:hAnsi="Calibri" w:cs="Calibri"/>
+        <w:rFonts w:ascii="Calibri" w:hAnsi="Calibri" w:eastAsia="Calibri" w:cs="Calibri"/>
         <w:sz w:val="22"/>
         <w:szCs w:val="22"/>
-        <w:lang w:val="en-IE" w:eastAsia="en-IE" w:bidi="ar-SA"/>
+        <w:lang w:val="en-IE" w:bidi="ar-SA"/>
       </w:rPr>
     </w:rPrDefault>
     <w:pPrDefault>
@@ -5909,10 +5765,9 @@
     <w:lsdException w:name="Unresolved Mention" w:semiHidden="1" w:unhideWhenUsed="1"/>
     <w:lsdException w:name="Smart Link" w:semiHidden="1" w:unhideWhenUsed="1"/>
   </w:latentStyles>
-  <w:style w:type="paragraph" w:default="1" w:styleId="Normal">
+  <w:style w:type="paragraph" w:styleId="Normal" w:default="1">
     <w:name w:val="Normal"/>
     <w:qFormat/>
-    <w:rsid w:val="00997F5F"/>
   </w:style>
   <w:style w:type="paragraph" w:styleId="Heading1">
     <w:name w:val="heading 1"/>
@@ -5937,7 +5792,6 @@
     <w:basedOn w:val="Normal"/>
     <w:next w:val="Normal"/>
     <w:uiPriority w:val="9"/>
-    <w:unhideWhenUsed/>
     <w:qFormat/>
     <w:pPr>
       <w:keepNext/>
@@ -6029,19 +5883,18 @@
       <w:szCs w:val="20"/>
     </w:rPr>
   </w:style>
-  <w:style w:type="character" w:default="1" w:styleId="DefaultParagraphFont">
+  <w:style w:type="character" w:styleId="DefaultParagraphFont" w:default="1">
     <w:name w:val="Default Paragraph Font"/>
     <w:uiPriority w:val="1"/>
     <w:semiHidden/>
     <w:unhideWhenUsed/>
   </w:style>
-  <w:style w:type="table" w:default="1" w:styleId="TableNormal">
+  <w:style w:type="table" w:styleId="TableNormal" w:default="1">
     <w:name w:val="Normal Table"/>
     <w:uiPriority w:val="99"/>
     <w:semiHidden/>
     <w:unhideWhenUsed/>
     <w:tblPr>
-      <w:tblInd w:w="0" w:type="dxa"/>
       <w:tblCellMar>
         <w:top w:w="0" w:type="dxa"/>
         <w:left w:w="108" w:type="dxa"/>
@@ -6050,7 +5903,7 @@
       </w:tblCellMar>
     </w:tblPr>
   </w:style>
-  <w:style w:type="numbering" w:default="1" w:styleId="NoList">
+  <w:style w:type="numbering" w:styleId="NoList" w:default="1">
     <w:name w:val="No List"/>
     <w:uiPriority w:val="99"/>
     <w:semiHidden/>
@@ -6077,7 +5930,6 @@
     <w:name w:val="Table Grid"/>
     <w:basedOn w:val="TableNormal"/>
     <w:uiPriority w:val="39"/>
-    <w:rsid w:val="00997F5F"/>
     <w:pPr>
       <w:spacing w:after="0" w:line="240" w:lineRule="auto"/>
     </w:pPr>
@@ -6097,7 +5949,6 @@
     <w:basedOn w:val="Normal"/>
     <w:uiPriority w:val="1"/>
     <w:qFormat/>
-    <w:rsid w:val="00E87877"/>
     <w:pPr>
       <w:ind w:left="720"/>
       <w:contextualSpacing/>
@@ -6107,10 +5958,8 @@
     <w:name w:val="Hyperlink"/>
     <w:basedOn w:val="DefaultParagraphFont"/>
     <w:uiPriority w:val="99"/>
-    <w:unhideWhenUsed/>
-    <w:rsid w:val="00880624"/>
     <w:rPr>
-      <w:color w:val="0563C1" w:themeColor="hyperlink"/>
+      <w:color w:val="0563C1"/>
       <w:u w:val="single"/>
     </w:rPr>
   </w:style>
@@ -6120,7 +5969,6 @@
     <w:uiPriority w:val="99"/>
     <w:semiHidden/>
     <w:unhideWhenUsed/>
-    <w:rsid w:val="00880624"/>
     <w:rPr>
       <w:color w:val="605E5C"/>
       <w:shd w:val="clear" w:color="auto" w:fill="E1DFDD"/>
@@ -6132,7 +5980,6 @@
     <w:uiPriority w:val="99"/>
     <w:semiHidden/>
     <w:unhideWhenUsed/>
-    <w:rsid w:val="00AC1BD1"/>
     <w:rPr>
       <w:sz w:val="16"/>
       <w:szCs w:val="16"/>
@@ -6143,8 +5990,6 @@
     <w:basedOn w:val="Normal"/>
     <w:link w:val="CommentTextChar"/>
     <w:uiPriority w:val="99"/>
-    <w:unhideWhenUsed/>
-    <w:rsid w:val="00AC1BD1"/>
     <w:pPr>
       <w:spacing w:line="240" w:lineRule="auto"/>
     </w:pPr>
@@ -6153,12 +5998,11 @@
       <w:szCs w:val="20"/>
     </w:rPr>
   </w:style>
-  <w:style w:type="character" w:customStyle="1" w:styleId="CommentTextChar">
+  <w:style w:type="character" w:styleId="CommentTextChar" w:customStyle="1">
     <w:name w:val="Comment Text Char"/>
     <w:basedOn w:val="DefaultParagraphFont"/>
     <w:link w:val="CommentText"/>
     <w:uiPriority w:val="99"/>
-    <w:rsid w:val="00AC1BD1"/>
     <w:rPr>
       <w:sz w:val="20"/>
       <w:szCs w:val="20"/>
@@ -6172,19 +6016,18 @@
     <w:uiPriority w:val="99"/>
     <w:semiHidden/>
     <w:unhideWhenUsed/>
-    <w:rsid w:val="00AC1BD1"/>
     <w:rPr>
       <w:b/>
       <w:bCs/>
     </w:rPr>
   </w:style>
-  <w:style w:type="character" w:customStyle="1" w:styleId="CommentSubjectChar">
+  <w:style w:type="character" w:styleId="CommentSubjectChar" w:customStyle="1">
     <w:name w:val="Comment Subject Char"/>
     <w:basedOn w:val="CommentTextChar"/>
     <w:link w:val="CommentSubject"/>
     <w:uiPriority w:val="99"/>
     <w:semiHidden/>
-    <w:rsid w:val="00AC1BD1"/>
+    <w:unhideWhenUsed/>
     <w:rPr>
       <w:b/>
       <w:bCs/>
@@ -6204,31 +6047,31 @@
       <w:spacing w:before="360" w:after="80"/>
     </w:pPr>
     <w:rPr>
-      <w:rFonts w:ascii="Georgia" w:eastAsia="Georgia" w:hAnsi="Georgia" w:cs="Georgia"/>
+      <w:rFonts w:ascii="Georgia" w:hAnsi="Georgia" w:eastAsia="Georgia" w:cs="Georgia"/>
       <w:i/>
       <w:color w:val="666666"/>
       <w:sz w:val="48"/>
       <w:szCs w:val="48"/>
     </w:rPr>
   </w:style>
-  <w:style w:type="table" w:customStyle="1" w:styleId="a">
+  <w:style w:type="table" w:styleId="a" w:customStyle="1">
+    <w:name w:val="a"/>
     <w:basedOn w:val="TableNormal"/>
     <w:pPr>
       <w:spacing w:after="0" w:line="240" w:lineRule="auto"/>
     </w:pPr>
     <w:tblPr>
       <w:tblStyleRowBandSize w:val="1"/>
-      <w:tblStyleColBandSize w:val="1"/>
     </w:tblPr>
   </w:style>
-  <w:style w:type="table" w:customStyle="1" w:styleId="a0">
+  <w:style w:type="table" w:styleId="a0" w:customStyle="1">
+    <w:name w:val="a0"/>
     <w:basedOn w:val="TableNormal"/>
     <w:pPr>
       <w:spacing w:after="0" w:line="240" w:lineRule="auto"/>
     </w:pPr>
     <w:tblPr>
       <w:tblStyleRowBandSize w:val="1"/>
-      <w:tblStyleColBandSize w:val="1"/>
     </w:tblPr>
   </w:style>
   <w:style w:type="paragraph" w:styleId="BodyText">
@@ -6239,7 +6082,6 @@
     <w:semiHidden/>
     <w:unhideWhenUsed/>
     <w:qFormat/>
-    <w:rsid w:val="00041D7B"/>
     <w:pPr>
       <w:widowControl w:val="0"/>
       <w:autoSpaceDE w:val="0"/>
@@ -6247,28 +6089,27 @@
       <w:spacing w:after="0" w:line="240" w:lineRule="auto"/>
     </w:pPr>
     <w:rPr>
-      <w:rFonts w:ascii="Times New Roman" w:eastAsia="Times New Roman" w:hAnsi="Times New Roman" w:cs="Times New Roman"/>
-      <w:lang w:val="en-US" w:eastAsia="en-US"/>
+      <w:rFonts w:ascii="Times New Roman" w:hAnsi="Times New Roman" w:eastAsia="Times New Roman" w:cs="Times New Roman"/>
+      <w:lang w:val="en-US"/>
     </w:rPr>
   </w:style>
-  <w:style w:type="character" w:customStyle="1" w:styleId="BodyTextChar">
+  <w:style w:type="character" w:styleId="BodyTextChar" w:customStyle="1">
     <w:name w:val="Body Text Char"/>
     <w:basedOn w:val="DefaultParagraphFont"/>
     <w:link w:val="BodyText"/>
     <w:uiPriority w:val="1"/>
     <w:semiHidden/>
-    <w:rsid w:val="00041D7B"/>
+    <w:unhideWhenUsed/>
     <w:rPr>
-      <w:rFonts w:ascii="Times New Roman" w:eastAsia="Times New Roman" w:hAnsi="Times New Roman" w:cs="Times New Roman"/>
-      <w:lang w:val="en-US" w:eastAsia="en-US"/>
+      <w:rFonts w:ascii="Times New Roman" w:hAnsi="Times New Roman" w:eastAsia="Times New Roman" w:cs="Times New Roman"/>
+      <w:lang w:val="en-US"/>
     </w:rPr>
   </w:style>
-  <w:style w:type="paragraph" w:customStyle="1" w:styleId="TableParagraph">
+  <w:style w:type="paragraph" w:styleId="TableParagraph" w:customStyle="1">
     <w:name w:val="Table Paragraph"/>
     <w:basedOn w:val="Normal"/>
     <w:uiPriority w:val="1"/>
     <w:qFormat/>
-    <w:rsid w:val="00041D7B"/>
     <w:pPr>
       <w:widowControl w:val="0"/>
       <w:autoSpaceDE w:val="0"/>
@@ -6276,8 +6117,8 @@
       <w:spacing w:after="0" w:line="240" w:lineRule="auto"/>
     </w:pPr>
     <w:rPr>
-      <w:rFonts w:ascii="Georgia" w:eastAsia="Georgia" w:hAnsi="Georgia" w:cs="Georgia"/>
-      <w:lang w:val="en-US" w:eastAsia="en-US"/>
+      <w:rFonts w:ascii="Georgia" w:hAnsi="Georgia" w:eastAsia="Georgia" w:cs="Georgia"/>
+      <w:lang w:val="en-US"/>
     </w:rPr>
   </w:style>
   <w:style w:type="character" w:styleId="PlaceholderText">
@@ -6285,7 +6126,7 @@
     <w:basedOn w:val="DefaultParagraphFont"/>
     <w:uiPriority w:val="99"/>
     <w:semiHidden/>
-    <w:rsid w:val="00520E41"/>
+    <w:unhideWhenUsed/>
     <w:rPr>
       <w:color w:val="666666"/>
     </w:rPr>
@@ -6296,9 +6137,8 @@
     <w:uiPriority w:val="99"/>
     <w:semiHidden/>
     <w:unhideWhenUsed/>
-    <w:rsid w:val="00321DE7"/>
     <w:rPr>
-      <w:color w:val="954F72" w:themeColor="followedHyperlink"/>
+      <w:color w:val="954F72"/>
       <w:u w:val="single"/>
     </w:rPr>
   </w:style>
@@ -6307,8 +6147,6 @@
     <w:basedOn w:val="Normal"/>
     <w:link w:val="HeaderChar"/>
     <w:uiPriority w:val="99"/>
-    <w:unhideWhenUsed/>
-    <w:rsid w:val="001825F3"/>
     <w:pPr>
       <w:tabs>
         <w:tab w:val="center" w:pos="4513"/>
@@ -6317,20 +6155,17 @@
       <w:spacing w:after="0" w:line="240" w:lineRule="auto"/>
     </w:pPr>
   </w:style>
-  <w:style w:type="character" w:customStyle="1" w:styleId="HeaderChar">
+  <w:style w:type="character" w:styleId="HeaderChar" w:customStyle="1">
     <w:name w:val="Header Char"/>
     <w:basedOn w:val="DefaultParagraphFont"/>
     <w:link w:val="Header"/>
     <w:uiPriority w:val="99"/>
-    <w:rsid w:val="001825F3"/>
   </w:style>
   <w:style w:type="paragraph" w:styleId="Footer">
     <w:name w:val="footer"/>
     <w:basedOn w:val="Normal"/>
     <w:link w:val="FooterChar"/>
     <w:uiPriority w:val="99"/>
-    <w:unhideWhenUsed/>
-    <w:rsid w:val="001825F3"/>
     <w:pPr>
       <w:tabs>
         <w:tab w:val="center" w:pos="4513"/>
@@ -6339,40 +6174,41 @@
       <w:spacing w:after="0" w:line="240" w:lineRule="auto"/>
     </w:pPr>
   </w:style>
-  <w:style w:type="character" w:customStyle="1" w:styleId="FooterChar">
+  <w:style w:type="character" w:styleId="FooterChar" w:customStyle="1">
     <w:name w:val="Footer Char"/>
     <w:basedOn w:val="DefaultParagraphFont"/>
     <w:link w:val="Footer"/>
     <w:uiPriority w:val="99"/>
-    <w:rsid w:val="001825F3"/>
   </w:style>
-  <w:style w:type="table" w:customStyle="1" w:styleId="a1">
+  <w:style w:type="table" w:styleId="a1" w:customStyle="1">
+    <w:name w:val="a1"/>
     <w:basedOn w:val="TableNormal"/>
     <w:pPr>
       <w:spacing w:after="0" w:line="240" w:lineRule="auto"/>
     </w:pPr>
     <w:tblPr>
       <w:tblStyleRowBandSize w:val="1"/>
-      <w:tblStyleColBandSize w:val="1"/>
     </w:tblPr>
   </w:style>
-  <w:style w:type="table" w:customStyle="1" w:styleId="a2">
+  <w:style w:type="table" w:styleId="a2" w:customStyle="1">
+    <w:name w:val="a2"/>
     <w:basedOn w:val="TableNormal"/>
     <w:pPr>
       <w:spacing w:after="0" w:line="240" w:lineRule="auto"/>
     </w:pPr>
     <w:tblPr>
       <w:tblStyleRowBandSize w:val="1"/>
-      <w:tblStyleColBandSize w:val="1"/>
     </w:tblPr>
   </w:style>
-  <w:style w:type="table" w:customStyle="1" w:styleId="a3">
+  <w:style w:type="table" w:styleId="a3" w:customStyle="1">
+    <w:name w:val="a3"/>
     <w:basedOn w:val="TableNormal"/>
     <w:tblPr>
       <w:tblStyleRowBandSize w:val="1"/>
-      <w:tblStyleColBandSize w:val="1"/>
       <w:tblCellMar>
+        <w:top w:w="0" w:type="dxa"/>
         <w:left w:w="0" w:type="dxa"/>
+        <w:bottom w:w="0" w:type="dxa"/>
         <w:right w:w="0" w:type="dxa"/>
       </w:tblCellMar>
     </w:tblPr>
@@ -6382,7 +6218,6 @@
     <w:basedOn w:val="DefaultParagraphFont"/>
     <w:uiPriority w:val="22"/>
     <w:qFormat/>
-    <w:rsid w:val="005E3B5C"/>
     <w:rPr>
       <w:b/>
       <w:bCs/>
@@ -6394,15 +6229,13 @@
     <w:uiPriority w:val="99"/>
     <w:semiHidden/>
     <w:unhideWhenUsed/>
-    <w:rsid w:val="00F22DB0"/>
     <w:pPr>
       <w:spacing w:before="100" w:beforeAutospacing="1" w:after="100" w:afterAutospacing="1" w:line="240" w:lineRule="auto"/>
     </w:pPr>
     <w:rPr>
-      <w:rFonts w:ascii="Times New Roman" w:eastAsia="Times New Roman" w:hAnsi="Times New Roman" w:cs="Times New Roman"/>
+      <w:rFonts w:ascii="Times New Roman" w:hAnsi="Times New Roman" w:eastAsia="Times New Roman" w:cs="Times New Roman"/>
       <w:sz w:val="24"/>
       <w:szCs w:val="24"/>
-      <w:lang w:eastAsia="en-GB"/>
     </w:rPr>
   </w:style>
 </w:styles>
@@ -6411,12 +6244,12 @@
 <file path=word/theme/theme1.xml><?xml version="1.0" encoding="utf-8"?>
 <a:theme xmlns:a="http://schemas.openxmlformats.org/drawingml/2006/main" name="Office Theme">
   <a:themeElements>
-    <a:clrScheme name="Office">
+    <a:clrScheme name="Office Theme">
       <a:dk1>
-        <a:sysClr val="windowText" lastClr="000000"/>
+        <a:srgbClr val="000000"/>
       </a:dk1>
       <a:lt1>
-        <a:sysClr val="window" lastClr="FFFFFF"/>
+        <a:srgbClr val="FFFFFF"/>
       </a:lt1>
       <a:dk2>
         <a:srgbClr val="44546A"/>
@@ -6449,169 +6282,29 @@
         <a:srgbClr val="954F72"/>
       </a:folHlink>
     </a:clrScheme>
-    <a:fontScheme name="Office">
+    <a:fontScheme name="Office Theme">
       <a:majorFont>
-        <a:latin typeface="Calibri Light" panose="020F0302020204030204"/>
+        <a:latin typeface="Calibri Light"/>
         <a:ea typeface=""/>
         <a:cs typeface=""/>
-        <a:font script="Jpan" typeface="游ゴシック Light"/>
-        <a:font script="Hang" typeface="맑은 고딕"/>
-        <a:font script="Hans" typeface="等线 Light"/>
-        <a:font script="Hant" typeface="新細明體"/>
-        <a:font script="Arab" typeface="Times New Roman"/>
-        <a:font script="Hebr" typeface="Times New Roman"/>
-        <a:font script="Thai" typeface="Angsana New"/>
-        <a:font script="Ethi" typeface="Nyala"/>
-        <a:font script="Beng" typeface="Vrinda"/>
-        <a:font script="Gujr" typeface="Shruti"/>
-        <a:font script="Khmr" typeface="MoolBoran"/>
-        <a:font script="Knda" typeface="Tunga"/>
-        <a:font script="Guru" typeface="Raavi"/>
-        <a:font script="Cans" typeface="Euphemia"/>
-        <a:font script="Cher" typeface="Plantagenet Cherokee"/>
-        <a:font script="Yiii" typeface="Microsoft Yi Baiti"/>
-        <a:font script="Tibt" typeface="Microsoft Himalaya"/>
-        <a:font script="Thaa" typeface="MV Boli"/>
-        <a:font script="Deva" typeface="Mangal"/>
-        <a:font script="Telu" typeface="Gautami"/>
-        <a:font script="Taml" typeface="Latha"/>
-        <a:font script="Syrc" typeface="Estrangelo Edessa"/>
-        <a:font script="Orya" typeface="Kalinga"/>
-        <a:font script="Mlym" typeface="Kartika"/>
-        <a:font script="Laoo" typeface="DokChampa"/>
-        <a:font script="Sinh" typeface="Iskoola Pota"/>
-        <a:font script="Mong" typeface="Mongolian Baiti"/>
-        <a:font script="Viet" typeface="Times New Roman"/>
-        <a:font script="Uigh" typeface="Microsoft Uighur"/>
-        <a:font script="Geor" typeface="Sylfaen"/>
-        <a:font script="Armn" typeface="Arial"/>
-        <a:font script="Bugi" typeface="Leelawadee UI"/>
-        <a:font script="Bopo" typeface="Microsoft JhengHei"/>
-        <a:font script="Java" typeface="Javanese Text"/>
-        <a:font script="Lisu" typeface="Segoe UI"/>
-        <a:font script="Mymr" typeface="Myanmar Text"/>
-        <a:font script="Nkoo" typeface="Ebrima"/>
-        <a:font script="Olck" typeface="Nirmala UI"/>
-        <a:font script="Osma" typeface="Ebrima"/>
-        <a:font script="Phag" typeface="Phagspa"/>
-        <a:font script="Syrn" typeface="Estrangelo Edessa"/>
-        <a:font script="Syrj" typeface="Estrangelo Edessa"/>
-        <a:font script="Syre" typeface="Estrangelo Edessa"/>
-        <a:font script="Sora" typeface="Nirmala UI"/>
-        <a:font script="Tale" typeface="Microsoft Tai Le"/>
-        <a:font script="Talu" typeface="Microsoft New Tai Lue"/>
-        <a:font script="Tfng" typeface="Ebrima"/>
       </a:majorFont>
       <a:minorFont>
-        <a:latin typeface="Calibri" panose="020F0502020204030204"/>
+        <a:latin typeface="Calibri"/>
         <a:ea typeface=""/>
         <a:cs typeface=""/>
-        <a:font script="Jpan" typeface="游明朝"/>
-        <a:font script="Hang" typeface="맑은 고딕"/>
-        <a:font script="Hans" typeface="等线"/>
-        <a:font script="Hant" typeface="新細明體"/>
-        <a:font script="Arab" typeface="Arial"/>
-        <a:font script="Hebr" typeface="Arial"/>
-        <a:font script="Thai" typeface="Cordia New"/>
-        <a:font script="Ethi" typeface="Nyala"/>
-        <a:font script="Beng" typeface="Vrinda"/>
-        <a:font script="Gujr" typeface="Shruti"/>
-        <a:font script="Khmr" typeface="DaunPenh"/>
-        <a:font script="Knda" typeface="Tunga"/>
-        <a:font script="Guru" typeface="Raavi"/>
-        <a:font script="Cans" typeface="Euphemia"/>
-        <a:font script="Cher" typeface="Plantagenet Cherokee"/>
-        <a:font script="Yiii" typeface="Microsoft Yi Baiti"/>
-        <a:font script="Tibt" typeface="Microsoft Himalaya"/>
-        <a:font script="Thaa" typeface="MV Boli"/>
-        <a:font script="Deva" typeface="Mangal"/>
-        <a:font script="Telu" typeface="Gautami"/>
-        <a:font script="Taml" typeface="Latha"/>
-        <a:font script="Syrc" typeface="Estrangelo Edessa"/>
-        <a:font script="Orya" typeface="Kalinga"/>
-        <a:font script="Mlym" typeface="Kartika"/>
-        <a:font script="Laoo" typeface="DokChampa"/>
-        <a:font script="Sinh" typeface="Iskoola Pota"/>
-        <a:font script="Mong" typeface="Mongolian Baiti"/>
-        <a:font script="Viet" typeface="Arial"/>
-        <a:font script="Uigh" typeface="Microsoft Uighur"/>
-        <a:font script="Geor" typeface="Sylfaen"/>
-        <a:font script="Armn" typeface="Arial"/>
-        <a:font script="Bugi" typeface="Leelawadee UI"/>
-        <a:font script="Bopo" typeface="Microsoft JhengHei"/>
-        <a:font script="Java" typeface="Javanese Text"/>
-        <a:font script="Lisu" typeface="Segoe UI"/>
-        <a:font script="Mymr" typeface="Myanmar Text"/>
-        <a:font script="Nkoo" typeface="Ebrima"/>
-        <a:font script="Olck" typeface="Nirmala UI"/>
-        <a:font script="Osma" typeface="Ebrima"/>
-        <a:font script="Phag" typeface="Phagspa"/>
-        <a:font script="Syrn" typeface="Estrangelo Edessa"/>
-        <a:font script="Syrj" typeface="Estrangelo Edessa"/>
-        <a:font script="Syre" typeface="Estrangelo Edessa"/>
-        <a:font script="Sora" typeface="Nirmala UI"/>
-        <a:font script="Tale" typeface="Microsoft Tai Le"/>
-        <a:font script="Talu" typeface="Microsoft New Tai Lue"/>
-        <a:font script="Tfng" typeface="Ebrima"/>
       </a:minorFont>
     </a:fontScheme>
-    <a:fmtScheme name="Office">
+    <a:fmtScheme name="Office Theme">
       <a:fillStyleLst>
         <a:solidFill>
           <a:schemeClr val="phClr"/>
         </a:solidFill>
-        <a:gradFill rotWithShape="1">
-          <a:gsLst>
-            <a:gs pos="0">
-              <a:schemeClr val="phClr">
-                <a:lumMod val="110000"/>
-                <a:satMod val="105000"/>
-                <a:tint val="67000"/>
-              </a:schemeClr>
-            </a:gs>
-            <a:gs pos="50000">
-              <a:schemeClr val="phClr">
-                <a:lumMod val="105000"/>
-                <a:satMod val="103000"/>
-                <a:tint val="73000"/>
-              </a:schemeClr>
-            </a:gs>
-            <a:gs pos="100000">
-              <a:schemeClr val="phClr">
-                <a:lumMod val="105000"/>
-                <a:satMod val="109000"/>
-                <a:tint val="81000"/>
-              </a:schemeClr>
-            </a:gs>
-          </a:gsLst>
-          <a:lin ang="5400000" scaled="0"/>
-        </a:gradFill>
-        <a:gradFill rotWithShape="1">
-          <a:gsLst>
-            <a:gs pos="0">
-              <a:schemeClr val="phClr">
-                <a:satMod val="103000"/>
-                <a:lumMod val="102000"/>
-                <a:tint val="94000"/>
-              </a:schemeClr>
-            </a:gs>
-            <a:gs pos="50000">
-              <a:schemeClr val="phClr">
-                <a:satMod val="110000"/>
-                <a:lumMod val="100000"/>
-                <a:shade val="100000"/>
-              </a:schemeClr>
-            </a:gs>
-            <a:gs pos="100000">
-              <a:schemeClr val="phClr">
-                <a:lumMod val="99000"/>
-                <a:satMod val="120000"/>
-                <a:shade val="78000"/>
-              </a:schemeClr>
-            </a:gs>
-          </a:gsLst>
-          <a:lin ang="5400000" scaled="0"/>
-        </a:gradFill>
+        <a:solidFill>
+          <a:schemeClr val="phClr"/>
+        </a:solidFill>
+        <a:solidFill>
+          <a:schemeClr val="phClr"/>
+        </a:solidFill>
       </a:fillStyleLst>
       <a:lnStyleLst>
         <a:ln w="6350" cap="flat" cmpd="sng" algn="ctr">
@@ -6644,13 +6337,7 @@
           <a:effectLst/>
         </a:effectStyle>
         <a:effectStyle>
-          <a:effectLst>
-            <a:outerShdw blurRad="57150" dist="19050" dir="5400000" algn="ctr" rotWithShape="0">
-              <a:srgbClr val="000000">
-                <a:alpha val="63000"/>
-              </a:srgbClr>
-            </a:outerShdw>
-          </a:effectLst>
+          <a:effectLst/>
         </a:effectStyle>
       </a:effectStyleLst>
       <a:bgFillStyleLst>
@@ -6658,48 +6345,16 @@
           <a:schemeClr val="phClr"/>
         </a:solidFill>
         <a:solidFill>
-          <a:schemeClr val="phClr">
-            <a:tint val="95000"/>
-            <a:satMod val="170000"/>
-          </a:schemeClr>
+          <a:schemeClr val="phClr"/>
         </a:solidFill>
-        <a:gradFill rotWithShape="1">
-          <a:gsLst>
-            <a:gs pos="0">
-              <a:schemeClr val="phClr">
-                <a:tint val="93000"/>
-                <a:satMod val="150000"/>
-                <a:shade val="98000"/>
-                <a:lumMod val="102000"/>
-              </a:schemeClr>
-            </a:gs>
-            <a:gs pos="50000">
-              <a:schemeClr val="phClr">
-                <a:tint val="98000"/>
-                <a:satMod val="130000"/>
-                <a:shade val="90000"/>
-                <a:lumMod val="103000"/>
-              </a:schemeClr>
-            </a:gs>
-            <a:gs pos="100000">
-              <a:schemeClr val="phClr">
-                <a:shade val="63000"/>
-                <a:satMod val="120000"/>
-              </a:schemeClr>
-            </a:gs>
-          </a:gsLst>
-          <a:lin ang="5400000" scaled="0"/>
-        </a:gradFill>
+        <a:solidFill>
+          <a:schemeClr val="phClr"/>
+        </a:solidFill>
       </a:bgFillStyleLst>
     </a:fmtScheme>
   </a:themeElements>
   <a:objectDefaults/>
   <a:extraClrSchemeLst/>
-  <a:extLst>
-    <a:ext uri="{05A4C25C-085E-4340-85A3-A5531E510DB2}">
-      <thm15:themeFamily xmlns:thm15="http://schemas.microsoft.com/office/thememl/2012/main" name="Office Theme" id="{62F939B6-93AF-4DB8-9C6B-D6C7DFDC589F}" vid="{4A3C46E8-61CC-4603-A589-7422A47A8E4A}"/>
-    </a:ext>
-  </a:extLst>
 </a:theme>
 </file>
 

</xml_diff>